<commit_message>
Portal Estoque: rodadas 8 e 9 de testes (133 e 134 casos com resultado), 20 defeitos novos, Words, busca e painéis
Co-Authored-By: Claude Sonnet 5.5 <noreply@anthropic.com>
Claude-Session: https://claude.ai/code/session_016ZyaVQ3Fat8knNf78iQG9U
</commit_message>
<xml_diff>
--- a/documentacao/arquivos/estoque/LabMedSys - Modulo Estoque - Resumo Executivo.docx
+++ b/documentacao/arquivos/estoque/LabMedSys - Modulo Estoque - Resumo Executivo.docx
@@ -4,3427 +4,36 @@
   <w:body>
     <w:p>
       <w:pPr>
-        <w:rPr>
-          <w:b/>
-          <w:sz w:val="36"/>
-          <w:szCs w:val="36"/>
-        </w:rPr>
-      </w:pPr>
-      <w:bookmarkStart w:id="0" w:name="_Hlk166535047"/>
-    </w:p>
-    <w:p>
-      <w:pPr>
-        <w:rPr>
-          <w:b/>
-          <w:sz w:val="36"/>
-          <w:szCs w:val="36"/>
-        </w:rPr>
-      </w:pPr>
-    </w:p>
-    <w:p>
-      <w:pPr>
-        <w:rPr>
-          <w:b/>
-          <w:sz w:val="36"/>
-          <w:szCs w:val="36"/>
-        </w:rPr>
-      </w:pPr>
-    </w:p>
-    <w:p>
-      <w:pPr>
-        <w:rPr>
-          <w:b/>
-          <w:sz w:val="36"/>
-          <w:szCs w:val="36"/>
-        </w:rPr>
-      </w:pPr>
-    </w:p>
-    <w:p>
-      <w:pPr>
-        <w:rPr>
-          <w:sz w:val="40"/>
-          <w:szCs w:val="40"/>
-        </w:rPr>
-      </w:pPr>
-      <w:bookmarkStart w:id="1" w:name="_heading=h.gjdgxs"/>
-      <w:bookmarkEnd w:id="1"/>
-    </w:p>
-    <w:p>
-      <w:pPr>
-        <w:jc w:val="center"/>
-        <w:rPr>
-          <w:sz w:val="56"/>
-          <w:szCs w:val="56"/>
-        </w:rPr>
-      </w:pPr>
-      <w:bookmarkStart w:id="2" w:name="_heading=h.30j0zll"/>
-      <w:bookmarkEnd w:id="2"/>
+        <w:spacing w:before="0" w:after="60"/>
+      </w:pPr>
       <w:r>
         <w:rPr>
           <w:b/>
-          <w:sz w:val="56"/>
-          <w:szCs w:val="56"/>
+          <w:bCs/>
+          <w:sz w:val="32"/>
+          <w:szCs w:val="32"/>
         </w:rPr>
-        <w:t>LabMedSys</w:t>
+        <w:t xml:space="preserve">Resumo Executivo do módulo Estoque</w:t>
       </w:r>
     </w:p>
     <w:p>
       <w:pPr>
-        <w:jc w:val="center"/>
-        <w:rPr>
-          <w:b/>
-          <w:sz w:val="40"/>
-          <w:szCs w:val="40"/>
-        </w:rPr>
-      </w:pPr>
-    </w:p>
-    <w:p>
-      <w:pPr>
-        <w:jc w:val="center"/>
-        <w:rPr>
-          <w:b/>
-          <w:sz w:val="40"/>
-          <w:szCs w:val="40"/>
-        </w:rPr>
-      </w:pPr>
-    </w:p>
-    <w:p>
-      <w:pPr>
-        <w:jc w:val="center"/>
-        <w:rPr>
-          <w:b/>
-          <w:sz w:val="40"/>
-          <w:szCs w:val="40"/>
-        </w:rPr>
-      </w:pPr>
-    </w:p>
-    <w:p>
-      <w:pPr>
-        <w:jc w:val="center"/>
-        <w:rPr>
-          <w:b/>
-          <w:sz w:val="40"/>
-          <w:szCs w:val="40"/>
-        </w:rPr>
-      </w:pPr>
-    </w:p>
-    <w:p>
-      <w:pPr>
-        <w:jc w:val="center"/>
-        <w:rPr>
-          <w:b/>
-          <w:sz w:val="40"/>
-          <w:szCs w:val="40"/>
-        </w:rPr>
-      </w:pPr>
-    </w:p>
-    <w:p>
-      <w:pPr>
-        <w:jc w:val="center"/>
-        <w:rPr>
-          <w:b/>
-          <w:sz w:val="40"/>
-          <w:szCs w:val="40"/>
-        </w:rPr>
-      </w:pPr>
-    </w:p>
-    <w:p>
-      <w:pPr>
-        <w:jc w:val="center"/>
-        <w:rPr>
-          <w:b/>
-          <w:sz w:val="40"/>
-          <w:szCs w:val="40"/>
-        </w:rPr>
-      </w:pPr>
-    </w:p>
-    <w:p>
-      <w:pPr>
-        <w:pStyle w:val="titulo"/>
-        <w:spacing w:before="0" w:after="0" w:line="360" w:lineRule="auto"/>
-      </w:pPr>
-    </w:p>
-    <w:p>
-      <w:pPr>
-        <w:spacing w:before="0" w:after="0" w:line="360" w:lineRule="auto"/>
-        <w:jc w:val="right"/>
-        <w:rPr>
-          <w:rFonts w:cs="Arial"/>
-          <w:b/>
-          <w:bCs/>
-          <w:sz w:val="36"/>
-          <w:szCs w:val="36"/>
-        </w:rPr>
-      </w:pPr>
-    </w:p>
-    <w:p>
-      <w:pPr>
-        <w:spacing w:before="0" w:after="0" w:line="360" w:lineRule="auto"/>
-        <w:jc w:val="right"/>
-      </w:pPr>
-    </w:p>
-    <w:p>
-      <w:pPr>
-        <w:spacing w:before="0" w:after="0" w:line="360" w:lineRule="auto"/>
-        <w:rPr>
-          <w:rFonts w:cs="Arial"/>
-          <w:b/>
-          <w:bCs/>
-          <w:sz w:val="36"/>
-          <w:szCs w:val="36"/>
-        </w:rPr>
-      </w:pPr>
-    </w:p>
-    <w:p>
-      <w:pPr>
-        <w:pStyle w:val="sistema"/>
-        <w:spacing w:after="0" w:line="360" w:lineRule="auto"/>
+        <w:pBdr>
+          <w:bottom w:val="single" w:sz="8" w:space="4" w:color="808080"/>
+        </w:pBdr>
+        <w:spacing w:before="0" w:after="160"/>
       </w:pPr>
       <w:r>
         <w:rPr>
-          <w:i w:val="0"/>
-          <w:szCs w:val="36"/>
+          <w:color w:val="595959"/>
+          <w:szCs w:val="20"/>
         </w:rPr>
-        <w:t>Módulo Estoque</w:t>
+        <w:t xml:space="preserve">LabMedSys · Estoque · 22/10/2026 · André Nardacci · documento versão 1.2</w:t>
       </w:r>
     </w:p>
     <w:p>
       <w:pPr>
-        <w:pStyle w:val="sistema"/>
-        <w:spacing w:after="0" w:line="360" w:lineRule="auto"/>
-      </w:pPr>
-      <w:r>
-        <w:rPr>
-          <w:i w:val="0"/>
-          <w:szCs w:val="36"/>
-        </w:rPr>
-        <w:t>Resumo executivo</w:t>
-      </w:r>
-    </w:p>
-    <w:p>
-      <w:pPr>
-        <w:pStyle w:val="versao"/>
-        <w:spacing w:line="360" w:lineRule="auto"/>
-      </w:pPr>
-      <w:r>
-        <w:rPr>
-          <w:sz w:val="36"/>
-          <w:szCs w:val="36"/>
-        </w:rPr>
-        <w:t xml:space="preserve">Versão </w:t>
-      </w:r>
-      <w:r>
-        <w:rPr>
-          <w:iCs/>
-          <w:sz w:val="36"/>
-          <w:szCs w:val="36"/>
-        </w:rPr>
-        <w:t>1.0</w:t>
-      </w:r>
-    </w:p>
-    <w:p/>
-    <w:p/>
-    <w:p/>
-    <w:p/>
-    <w:p/>
-    <w:p/>
-    <w:p/>
-    <w:p/>
-    <w:p/>
-    <w:p/>
-    <w:p>
-      <w:pPr>
-        <w:jc w:val="center"/>
-        <w:rPr>
-          <w:rFonts w:eastAsia="Arial" w:cs="Arial"/>
-          <w:b/>
-        </w:rPr>
-      </w:pPr>
-      <w:r>
-        <w:rPr>
-          <w:rFonts w:eastAsia="Arial" w:cs="Arial"/>
-          <w:b/>
-        </w:rPr>
-        <w:lastRenderedPageBreak/>
-        <w:t xml:space="preserve">Histórico de </w:t>
-      </w:r>
-      <w:r>
-        <w:rPr>
-          <w:rFonts w:eastAsia="Arial" w:cs="Arial"/>
-          <w:b/>
-        </w:rPr>
-        <w:t xml:space="preserve">Revisão e </w:t>
-      </w:r>
-      <w:r>
-        <w:rPr>
-          <w:rFonts w:eastAsia="Arial" w:cs="Arial"/>
-          <w:b/>
-        </w:rPr>
-        <w:t>E</w:t>
-      </w:r>
-      <w:r>
-        <w:rPr>
-          <w:rFonts w:eastAsia="Arial" w:cs="Arial"/>
-          <w:b/>
-        </w:rPr>
-        <w:t>nvolvidos</w:t>
-      </w:r>
-    </w:p>
-    <w:p>
-      <w:pPr>
-        <w:jc w:val="center"/>
-      </w:pPr>
-    </w:p>
-    <w:tbl>
-      <w:tblPr>
-        <w:tblW w:w="8760" w:type="dxa"/>
-        <w:tblBorders>
-          <w:top w:val="single" w:sz="4" w:space="0" w:color="000000"/>
-          <w:left w:val="single" w:sz="4" w:space="0" w:color="000000"/>
-          <w:bottom w:val="single" w:sz="4" w:space="0" w:color="000000"/>
-          <w:right w:val="single" w:sz="4" w:space="0" w:color="000000"/>
-          <w:insideH w:val="single" w:sz="4" w:space="0" w:color="000000"/>
-          <w:insideV w:val="single" w:sz="4" w:space="0" w:color="000000"/>
-        </w:tblBorders>
-        <w:tblLayout w:type="fixed"/>
-        <w:tblLook w:val="0400" w:firstRow="0" w:lastRow="0" w:firstColumn="0" w:lastColumn="0" w:noHBand="0" w:noVBand="1"/>
-      </w:tblPr>
-      <w:tblGrid>
-        <w:gridCol w:w="2638"/>
-        <w:gridCol w:w="2575"/>
-        <w:gridCol w:w="3547"/>
-      </w:tblGrid>
-      <w:tr>
-        <w:trPr>
-          <w:trHeight w:val="349"/>
-        </w:trPr>
-        <w:tc>
-          <w:tcPr>
-            <w:tcW w:w="2638" w:type="dxa"/>
-            <w:tcBorders>
-              <w:top w:val="single" w:sz="4" w:space="0" w:color="000000"/>
-              <w:left w:val="single" w:sz="4" w:space="0" w:color="000000"/>
-              <w:bottom w:val="single" w:sz="4" w:space="0" w:color="000000"/>
-              <w:right w:val="single" w:sz="4" w:space="0" w:color="000000"/>
-            </w:tcBorders>
-            <w:shd w:val="clear" w:color="auto" w:fill="BFBFBF"/>
-            <w:vAlign w:val="center"/>
-            <w:hideMark/>
-          </w:tcPr>
-          <w:p>
-            <w:pPr>
-              <w:jc w:val="center"/>
-              <w:rPr>
-                <w:b/>
-                <w:color w:val="000000"/>
-                <w:szCs w:val="20"/>
-              </w:rPr>
-            </w:pPr>
-            <w:r>
-              <w:rPr>
-                <w:b/>
-                <w:color w:val="000000"/>
-                <w:szCs w:val="20"/>
-              </w:rPr>
-              <w:t>Nome</w:t>
-            </w:r>
-          </w:p>
-        </w:tc>
-        <w:tc>
-          <w:tcPr>
-            <w:tcW w:w="2575" w:type="dxa"/>
-            <w:tcBorders>
-              <w:top w:val="single" w:sz="4" w:space="0" w:color="000000"/>
-              <w:left w:val="single" w:sz="4" w:space="0" w:color="000000"/>
-              <w:bottom w:val="single" w:sz="4" w:space="0" w:color="000000"/>
-              <w:right w:val="single" w:sz="4" w:space="0" w:color="000000"/>
-            </w:tcBorders>
-            <w:shd w:val="clear" w:color="auto" w:fill="BFBFBF"/>
-            <w:vAlign w:val="center"/>
-            <w:hideMark/>
-          </w:tcPr>
-          <w:p>
-            <w:pPr>
-              <w:jc w:val="center"/>
-              <w:rPr>
-                <w:b/>
-                <w:color w:val="000000"/>
-                <w:szCs w:val="20"/>
-              </w:rPr>
-            </w:pPr>
-            <w:r>
-              <w:rPr>
-                <w:b/>
-                <w:color w:val="000000"/>
-                <w:szCs w:val="20"/>
-              </w:rPr>
-              <w:t>Função</w:t>
-            </w:r>
-          </w:p>
-        </w:tc>
-        <w:tc>
-          <w:tcPr>
-            <w:tcW w:w="3547" w:type="dxa"/>
-            <w:tcBorders>
-              <w:top w:val="single" w:sz="4" w:space="0" w:color="000000"/>
-              <w:left w:val="single" w:sz="4" w:space="0" w:color="000000"/>
-              <w:bottom w:val="single" w:sz="4" w:space="0" w:color="000000"/>
-              <w:right w:val="single" w:sz="4" w:space="0" w:color="000000"/>
-            </w:tcBorders>
-            <w:shd w:val="clear" w:color="auto" w:fill="BFBFBF"/>
-            <w:vAlign w:val="center"/>
-            <w:hideMark/>
-          </w:tcPr>
-          <w:p>
-            <w:pPr>
-              <w:jc w:val="center"/>
-              <w:rPr>
-                <w:b/>
-                <w:color w:val="000000"/>
-                <w:szCs w:val="20"/>
-              </w:rPr>
-            </w:pPr>
-            <w:r>
-              <w:rPr>
-                <w:b/>
-                <w:color w:val="000000"/>
-                <w:szCs w:val="20"/>
-              </w:rPr>
-              <w:t>Contato</w:t>
-            </w:r>
-          </w:p>
-        </w:tc>
-      </w:tr>
-      <w:tr>
-        <w:trPr>
-          <w:trHeight w:val="421"/>
-        </w:trPr>
-        <w:tc>
-          <w:tcPr>
-            <w:tcW w:w="2638" w:type="dxa"/>
-            <w:tcBorders>
-              <w:top w:val="single" w:sz="4" w:space="0" w:color="000000"/>
-              <w:left w:val="single" w:sz="4" w:space="0" w:color="000000"/>
-              <w:bottom w:val="single" w:sz="4" w:space="0" w:color="000000"/>
-              <w:right w:val="single" w:sz="4" w:space="0" w:color="000000"/>
-            </w:tcBorders>
-            <w:vAlign w:val="center"/>
-          </w:tcPr>
-          <w:p>
-            <w:pPr>
-              <w:jc w:val="center"/>
-              <w:rPr>
-                <w:color w:val="000000" w:themeColor="text1"/>
-                <w:szCs w:val="20"/>
-              </w:rPr>
-            </w:pPr>
-            <w:r>
-              <w:rPr>
-                <w:color w:val="000000" w:themeColor="text1"/>
-                <w:szCs w:val="20"/>
-              </w:rPr>
-              <w:t xml:space="preserve">Rogério </w:t>
-            </w:r>
-          </w:p>
-        </w:tc>
-        <w:tc>
-          <w:tcPr>
-            <w:tcW w:w="2575" w:type="dxa"/>
-            <w:tcBorders>
-              <w:top w:val="single" w:sz="4" w:space="0" w:color="000000"/>
-              <w:left w:val="single" w:sz="4" w:space="0" w:color="000000"/>
-              <w:bottom w:val="single" w:sz="4" w:space="0" w:color="000000"/>
-              <w:right w:val="single" w:sz="4" w:space="0" w:color="000000"/>
-            </w:tcBorders>
-            <w:vAlign w:val="center"/>
-            <w:hideMark/>
-          </w:tcPr>
-          <w:p>
-            <w:pPr>
-              <w:jc w:val="center"/>
-              <w:rPr>
-                <w:color w:val="000000" w:themeColor="text1"/>
-                <w:szCs w:val="20"/>
-              </w:rPr>
-            </w:pPr>
-          </w:p>
-        </w:tc>
-        <w:tc>
-          <w:tcPr>
-            <w:tcW w:w="3547" w:type="dxa"/>
-            <w:tcBorders>
-              <w:top w:val="single" w:sz="4" w:space="0" w:color="000000"/>
-              <w:left w:val="single" w:sz="4" w:space="0" w:color="000000"/>
-              <w:bottom w:val="single" w:sz="4" w:space="0" w:color="000000"/>
-              <w:right w:val="single" w:sz="4" w:space="0" w:color="000000"/>
-            </w:tcBorders>
-            <w:vAlign w:val="center"/>
-            <w:hideMark/>
-          </w:tcPr>
-          <w:p>
-            <w:pPr>
-              <w:jc w:val="center"/>
-              <w:rPr>
-                <w:color w:val="000000" w:themeColor="text1"/>
-                <w:szCs w:val="20"/>
-              </w:rPr>
-            </w:pPr>
-          </w:p>
-        </w:tc>
-      </w:tr>
-      <w:tr>
-        <w:trPr>
-          <w:trHeight w:val="421"/>
-        </w:trPr>
-        <w:tc>
-          <w:tcPr>
-            <w:tcW w:w="2638" w:type="dxa"/>
-            <w:tcBorders>
-              <w:top w:val="single" w:sz="4" w:space="0" w:color="000000"/>
-              <w:left w:val="single" w:sz="4" w:space="0" w:color="000000"/>
-              <w:bottom w:val="single" w:sz="4" w:space="0" w:color="000000"/>
-              <w:right w:val="single" w:sz="4" w:space="0" w:color="000000"/>
-            </w:tcBorders>
-            <w:vAlign w:val="center"/>
-          </w:tcPr>
-          <w:p>
-            <w:pPr>
-              <w:jc w:val="center"/>
-              <w:rPr>
-                <w:color w:val="000000" w:themeColor="text1"/>
-                <w:szCs w:val="20"/>
-              </w:rPr>
-            </w:pPr>
-            <w:r>
-              <w:rPr>
-                <w:color w:val="000000" w:themeColor="text1"/>
-                <w:szCs w:val="20"/>
-              </w:rPr>
-              <w:t>Lúcia</w:t>
-            </w:r>
-          </w:p>
-        </w:tc>
-        <w:tc>
-          <w:tcPr>
-            <w:tcW w:w="2575" w:type="dxa"/>
-            <w:tcBorders>
-              <w:top w:val="single" w:sz="4" w:space="0" w:color="000000"/>
-              <w:left w:val="single" w:sz="4" w:space="0" w:color="000000"/>
-              <w:bottom w:val="single" w:sz="4" w:space="0" w:color="000000"/>
-              <w:right w:val="single" w:sz="4" w:space="0" w:color="000000"/>
-            </w:tcBorders>
-            <w:vAlign w:val="center"/>
-          </w:tcPr>
-          <w:p>
-            <w:pPr>
-              <w:jc w:val="center"/>
-              <w:rPr>
-                <w:color w:val="000000" w:themeColor="text1"/>
-                <w:szCs w:val="20"/>
-              </w:rPr>
-            </w:pPr>
-          </w:p>
-        </w:tc>
-        <w:tc>
-          <w:tcPr>
-            <w:tcW w:w="3547" w:type="dxa"/>
-            <w:tcBorders>
-              <w:top w:val="single" w:sz="4" w:space="0" w:color="000000"/>
-              <w:left w:val="single" w:sz="4" w:space="0" w:color="000000"/>
-              <w:bottom w:val="single" w:sz="4" w:space="0" w:color="000000"/>
-              <w:right w:val="single" w:sz="4" w:space="0" w:color="000000"/>
-            </w:tcBorders>
-            <w:vAlign w:val="center"/>
-          </w:tcPr>
-          <w:p>
-            <w:pPr>
-              <w:jc w:val="center"/>
-              <w:rPr>
-                <w:color w:val="000000" w:themeColor="text1"/>
-                <w:szCs w:val="20"/>
-              </w:rPr>
-            </w:pPr>
-          </w:p>
-        </w:tc>
-      </w:tr>
-      <w:tr>
-        <w:trPr>
-          <w:trHeight w:val="421"/>
-        </w:trPr>
-        <w:tc>
-          <w:tcPr>
-            <w:tcW w:w="2638" w:type="dxa"/>
-            <w:tcBorders>
-              <w:top w:val="single" w:sz="4" w:space="0" w:color="000000"/>
-              <w:left w:val="single" w:sz="4" w:space="0" w:color="000000"/>
-              <w:bottom w:val="single" w:sz="4" w:space="0" w:color="000000"/>
-              <w:right w:val="single" w:sz="4" w:space="0" w:color="000000"/>
-            </w:tcBorders>
-            <w:vAlign w:val="center"/>
-          </w:tcPr>
-          <w:p>
-            <w:pPr>
-              <w:jc w:val="center"/>
-              <w:rPr>
-                <w:color w:val="000000" w:themeColor="text1"/>
-                <w:szCs w:val="20"/>
-              </w:rPr>
-            </w:pPr>
-            <w:r>
-              <w:rPr>
-                <w:color w:val="000000" w:themeColor="text1"/>
-                <w:szCs w:val="20"/>
-              </w:rPr>
-              <w:t>Balocco</w:t>
-            </w:r>
-          </w:p>
-        </w:tc>
-        <w:tc>
-          <w:tcPr>
-            <w:tcW w:w="2575" w:type="dxa"/>
-            <w:tcBorders>
-              <w:top w:val="single" w:sz="4" w:space="0" w:color="000000"/>
-              <w:left w:val="single" w:sz="4" w:space="0" w:color="000000"/>
-              <w:bottom w:val="single" w:sz="4" w:space="0" w:color="000000"/>
-              <w:right w:val="single" w:sz="4" w:space="0" w:color="000000"/>
-            </w:tcBorders>
-            <w:vAlign w:val="center"/>
-          </w:tcPr>
-          <w:p>
-            <w:pPr>
-              <w:jc w:val="center"/>
-              <w:rPr>
-                <w:color w:val="000000" w:themeColor="text1"/>
-                <w:szCs w:val="20"/>
-              </w:rPr>
-            </w:pPr>
-          </w:p>
-        </w:tc>
-        <w:tc>
-          <w:tcPr>
-            <w:tcW w:w="3547" w:type="dxa"/>
-            <w:tcBorders>
-              <w:top w:val="single" w:sz="4" w:space="0" w:color="000000"/>
-              <w:left w:val="single" w:sz="4" w:space="0" w:color="000000"/>
-              <w:bottom w:val="single" w:sz="4" w:space="0" w:color="000000"/>
-              <w:right w:val="single" w:sz="4" w:space="0" w:color="000000"/>
-            </w:tcBorders>
-            <w:vAlign w:val="center"/>
-          </w:tcPr>
-          <w:p>
-            <w:pPr>
-              <w:jc w:val="center"/>
-              <w:rPr>
-                <w:color w:val="000000" w:themeColor="text1"/>
-                <w:szCs w:val="20"/>
-              </w:rPr>
-            </w:pPr>
-          </w:p>
-        </w:tc>
-      </w:tr>
-      <w:tr>
-        <w:trPr>
-          <w:trHeight w:val="421"/>
-        </w:trPr>
-        <w:tc>
-          <w:tcPr>
-            <w:tcW w:w="2638" w:type="dxa"/>
-            <w:tcBorders>
-              <w:top w:val="single" w:sz="4" w:space="0" w:color="000000"/>
-              <w:left w:val="single" w:sz="4" w:space="0" w:color="000000"/>
-              <w:bottom w:val="single" w:sz="4" w:space="0" w:color="000000"/>
-              <w:right w:val="single" w:sz="4" w:space="0" w:color="000000"/>
-            </w:tcBorders>
-            <w:vAlign w:val="center"/>
-          </w:tcPr>
-          <w:p>
-            <w:pPr>
-              <w:jc w:val="center"/>
-              <w:rPr>
-                <w:color w:val="000000" w:themeColor="text1"/>
-                <w:szCs w:val="20"/>
-              </w:rPr>
-            </w:pPr>
-            <w:r>
-              <w:rPr>
-                <w:color w:val="000000" w:themeColor="text1"/>
-                <w:szCs w:val="20"/>
-              </w:rPr>
-              <w:t>Cláudio</w:t>
-            </w:r>
-          </w:p>
-        </w:tc>
-        <w:tc>
-          <w:tcPr>
-            <w:tcW w:w="2575" w:type="dxa"/>
-            <w:tcBorders>
-              <w:top w:val="single" w:sz="4" w:space="0" w:color="000000"/>
-              <w:left w:val="single" w:sz="4" w:space="0" w:color="000000"/>
-              <w:bottom w:val="single" w:sz="4" w:space="0" w:color="000000"/>
-              <w:right w:val="single" w:sz="4" w:space="0" w:color="000000"/>
-            </w:tcBorders>
-            <w:vAlign w:val="center"/>
-          </w:tcPr>
-          <w:p>
-            <w:pPr>
-              <w:jc w:val="center"/>
-              <w:rPr>
-                <w:color w:val="000000" w:themeColor="text1"/>
-                <w:szCs w:val="20"/>
-              </w:rPr>
-            </w:pPr>
-          </w:p>
-        </w:tc>
-        <w:tc>
-          <w:tcPr>
-            <w:tcW w:w="3547" w:type="dxa"/>
-            <w:tcBorders>
-              <w:top w:val="single" w:sz="4" w:space="0" w:color="000000"/>
-              <w:left w:val="single" w:sz="4" w:space="0" w:color="000000"/>
-              <w:bottom w:val="single" w:sz="4" w:space="0" w:color="000000"/>
-              <w:right w:val="single" w:sz="4" w:space="0" w:color="000000"/>
-            </w:tcBorders>
-            <w:vAlign w:val="center"/>
-          </w:tcPr>
-          <w:p>
-            <w:pPr>
-              <w:jc w:val="center"/>
-              <w:rPr>
-                <w:color w:val="000000" w:themeColor="text1"/>
-                <w:szCs w:val="20"/>
-              </w:rPr>
-            </w:pPr>
-          </w:p>
-        </w:tc>
-      </w:tr>
-      <w:tr>
-        <w:trPr>
-          <w:trHeight w:val="421"/>
-        </w:trPr>
-        <w:tc>
-          <w:tcPr>
-            <w:tcW w:w="2638" w:type="dxa"/>
-            <w:tcBorders>
-              <w:top w:val="single" w:sz="4" w:space="0" w:color="000000"/>
-              <w:left w:val="single" w:sz="4" w:space="0" w:color="000000"/>
-              <w:bottom w:val="single" w:sz="4" w:space="0" w:color="000000"/>
-              <w:right w:val="single" w:sz="4" w:space="0" w:color="000000"/>
-            </w:tcBorders>
-            <w:vAlign w:val="center"/>
-          </w:tcPr>
-          <w:p>
-            <w:pPr>
-              <w:jc w:val="center"/>
-              <w:rPr>
-                <w:color w:val="000000" w:themeColor="text1"/>
-                <w:szCs w:val="20"/>
-              </w:rPr>
-            </w:pPr>
-          </w:p>
-        </w:tc>
-        <w:tc>
-          <w:tcPr>
-            <w:tcW w:w="2575" w:type="dxa"/>
-            <w:tcBorders>
-              <w:top w:val="single" w:sz="4" w:space="0" w:color="000000"/>
-              <w:left w:val="single" w:sz="4" w:space="0" w:color="000000"/>
-              <w:bottom w:val="single" w:sz="4" w:space="0" w:color="000000"/>
-              <w:right w:val="single" w:sz="4" w:space="0" w:color="000000"/>
-            </w:tcBorders>
-            <w:vAlign w:val="center"/>
-          </w:tcPr>
-          <w:p>
-            <w:pPr>
-              <w:jc w:val="center"/>
-              <w:rPr>
-                <w:color w:val="000000" w:themeColor="text1"/>
-                <w:szCs w:val="20"/>
-              </w:rPr>
-            </w:pPr>
-          </w:p>
-        </w:tc>
-        <w:tc>
-          <w:tcPr>
-            <w:tcW w:w="3547" w:type="dxa"/>
-            <w:tcBorders>
-              <w:top w:val="single" w:sz="4" w:space="0" w:color="000000"/>
-              <w:left w:val="single" w:sz="4" w:space="0" w:color="000000"/>
-              <w:bottom w:val="single" w:sz="4" w:space="0" w:color="000000"/>
-              <w:right w:val="single" w:sz="4" w:space="0" w:color="000000"/>
-            </w:tcBorders>
-            <w:vAlign w:val="center"/>
-          </w:tcPr>
-          <w:p>
-            <w:pPr>
-              <w:jc w:val="center"/>
-              <w:rPr>
-                <w:color w:val="000000" w:themeColor="text1"/>
-                <w:szCs w:val="20"/>
-              </w:rPr>
-            </w:pPr>
-          </w:p>
-        </w:tc>
-      </w:tr>
-    </w:tbl>
-    <w:p>
-      <w:pPr>
-        <w:spacing w:after="0" w:line="360" w:lineRule="auto"/>
-      </w:pPr>
-    </w:p>
-    <w:tbl>
-      <w:tblPr>
-        <w:tblW w:w="9669" w:type="dxa"/>
-        <w:tblBorders>
-          <w:top w:val="single" w:sz="6" w:space="0" w:color="000000"/>
-          <w:left w:val="single" w:sz="6" w:space="0" w:color="000000"/>
-          <w:bottom w:val="single" w:sz="6" w:space="0" w:color="000000"/>
-          <w:insideH w:val="single" w:sz="6" w:space="0" w:color="000000"/>
-        </w:tblBorders>
-        <w:tblCellMar>
-          <w:left w:w="99" w:type="dxa"/>
-        </w:tblCellMar>
-        <w:tblLook w:val="0000" w:firstRow="0" w:lastRow="0" w:firstColumn="0" w:lastColumn="0" w:noHBand="0" w:noVBand="0"/>
-      </w:tblPr>
-      <w:tblGrid>
-        <w:gridCol w:w="1417"/>
-        <w:gridCol w:w="992"/>
-        <w:gridCol w:w="3969"/>
-        <w:gridCol w:w="3291"/>
-      </w:tblGrid>
-      <w:tr>
-        <w:tc>
-          <w:tcPr>
-            <w:tcW w:w="1417" w:type="dxa"/>
-            <w:tcBorders>
-              <w:top w:val="single" w:sz="6" w:space="0" w:color="000000"/>
-              <w:left w:val="single" w:sz="6" w:space="0" w:color="000000"/>
-              <w:bottom w:val="single" w:sz="6" w:space="0" w:color="000000"/>
-            </w:tcBorders>
-            <w:shd w:val="clear" w:color="auto" w:fill="DFDFDF"/>
-          </w:tcPr>
-          <w:p>
-            <w:pPr>
-              <w:keepLines/>
-              <w:jc w:val="center"/>
-              <w:rPr>
-                <w:rFonts w:eastAsia="Arial" w:cs="Arial"/>
-                <w:b/>
-                <w:color w:val="000000"/>
-                <w:szCs w:val="20"/>
-              </w:rPr>
-            </w:pPr>
-            <w:r>
-              <w:rPr>
-                <w:rFonts w:eastAsia="Arial" w:cs="Arial"/>
-                <w:b/>
-                <w:color w:val="000000"/>
-                <w:szCs w:val="20"/>
-              </w:rPr>
-              <w:t>Data</w:t>
-            </w:r>
-          </w:p>
-        </w:tc>
-        <w:tc>
-          <w:tcPr>
-            <w:tcW w:w="992" w:type="dxa"/>
-            <w:tcBorders>
-              <w:top w:val="single" w:sz="6" w:space="0" w:color="000000"/>
-              <w:left w:val="single" w:sz="6" w:space="0" w:color="000000"/>
-              <w:bottom w:val="single" w:sz="6" w:space="0" w:color="000000"/>
-            </w:tcBorders>
-            <w:shd w:val="clear" w:color="auto" w:fill="DFDFDF"/>
-          </w:tcPr>
-          <w:p>
-            <w:pPr>
-              <w:keepLines/>
-              <w:ind w:left="34"/>
-              <w:jc w:val="center"/>
-              <w:rPr>
-                <w:rFonts w:eastAsia="Arial" w:cs="Arial"/>
-                <w:b/>
-                <w:color w:val="000000"/>
-                <w:szCs w:val="20"/>
-              </w:rPr>
-            </w:pPr>
-            <w:r>
-              <w:rPr>
-                <w:rFonts w:eastAsia="Arial" w:cs="Arial"/>
-                <w:b/>
-                <w:color w:val="000000"/>
-                <w:szCs w:val="20"/>
-              </w:rPr>
-              <w:t>Versão</w:t>
-            </w:r>
-          </w:p>
-        </w:tc>
-        <w:tc>
-          <w:tcPr>
-            <w:tcW w:w="3969" w:type="dxa"/>
-            <w:tcBorders>
-              <w:top w:val="single" w:sz="6" w:space="0" w:color="000000"/>
-              <w:left w:val="single" w:sz="6" w:space="0" w:color="000000"/>
-              <w:bottom w:val="single" w:sz="6" w:space="0" w:color="000000"/>
-            </w:tcBorders>
-            <w:shd w:val="clear" w:color="auto" w:fill="DFDFDF"/>
-          </w:tcPr>
-          <w:p>
-            <w:pPr>
-              <w:keepLines/>
-              <w:ind w:left="34"/>
-              <w:jc w:val="center"/>
-              <w:rPr>
-                <w:rFonts w:eastAsia="Arial" w:cs="Arial"/>
-                <w:b/>
-                <w:color w:val="000000"/>
-                <w:szCs w:val="20"/>
-              </w:rPr>
-            </w:pPr>
-            <w:r>
-              <w:rPr>
-                <w:rFonts w:eastAsia="Arial" w:cs="Arial"/>
-                <w:b/>
-                <w:color w:val="000000"/>
-                <w:szCs w:val="20"/>
-              </w:rPr>
-              <w:t>Descrição</w:t>
-            </w:r>
-          </w:p>
-        </w:tc>
-        <w:tc>
-          <w:tcPr>
-            <w:tcW w:w="3291" w:type="dxa"/>
-            <w:tcBorders>
-              <w:top w:val="single" w:sz="6" w:space="0" w:color="000000"/>
-              <w:left w:val="single" w:sz="6" w:space="0" w:color="000000"/>
-              <w:bottom w:val="single" w:sz="6" w:space="0" w:color="000000"/>
-              <w:right w:val="single" w:sz="6" w:space="0" w:color="000000"/>
-            </w:tcBorders>
-            <w:shd w:val="clear" w:color="auto" w:fill="DFDFDF"/>
-          </w:tcPr>
-          <w:p>
-            <w:pPr>
-              <w:keepLines/>
-              <w:ind w:left="30"/>
-              <w:jc w:val="center"/>
-              <w:rPr>
-                <w:rFonts w:eastAsia="Arial" w:cs="Arial"/>
-                <w:b/>
-                <w:color w:val="000000"/>
-                <w:szCs w:val="20"/>
-              </w:rPr>
-            </w:pPr>
-            <w:r>
-              <w:rPr>
-                <w:rFonts w:eastAsia="Arial" w:cs="Arial"/>
-                <w:b/>
-                <w:color w:val="000000"/>
-                <w:szCs w:val="20"/>
-              </w:rPr>
-              <w:t>Autor</w:t>
-            </w:r>
-          </w:p>
-        </w:tc>
-      </w:tr>
-      <w:tr>
-        <w:tc>
-          <w:tcPr>
-            <w:tcW w:w="1417" w:type="dxa"/>
-            <w:tcBorders>
-              <w:top w:val="single" w:sz="6" w:space="0" w:color="000000"/>
-              <w:left w:val="single" w:sz="6" w:space="0" w:color="000000"/>
-              <w:bottom w:val="single" w:sz="6" w:space="0" w:color="000000"/>
-            </w:tcBorders>
-          </w:tcPr>
-          <w:p>
-            <w:pPr>
-              <w:jc w:val="center"/>
-              <w:rPr>
-                <w:szCs w:val="20"/>
-              </w:rPr>
-            </w:pPr>
-            <w:r>
-              <w:rPr>
-                <w:szCs w:val="20"/>
-              </w:rPr>
-              <w:t>14/10/2026</w:t>
-            </w:r>
-          </w:p>
-        </w:tc>
-        <w:tc>
-          <w:tcPr>
-            <w:tcW w:w="992" w:type="dxa"/>
-            <w:tcBorders>
-              <w:top w:val="single" w:sz="6" w:space="0" w:color="000000"/>
-              <w:left w:val="single" w:sz="6" w:space="0" w:color="000000"/>
-              <w:bottom w:val="single" w:sz="6" w:space="0" w:color="000000"/>
-            </w:tcBorders>
-          </w:tcPr>
-          <w:p>
-            <w:pPr>
-              <w:jc w:val="center"/>
-              <w:rPr>
-                <w:rFonts w:eastAsia="Arial" w:cs="Arial"/>
-                <w:szCs w:val="20"/>
-              </w:rPr>
-            </w:pPr>
-            <w:r>
-              <w:rPr>
-                <w:rFonts w:eastAsia="Arial" w:cs="Arial"/>
-                <w:szCs w:val="20"/>
-              </w:rPr>
-              <w:t>1.0</w:t>
-            </w:r>
-          </w:p>
-        </w:tc>
-        <w:tc>
-          <w:tcPr>
-            <w:tcW w:w="3969" w:type="dxa"/>
-            <w:tcBorders>
-              <w:top w:val="single" w:sz="6" w:space="0" w:color="000000"/>
-              <w:left w:val="single" w:sz="6" w:space="0" w:color="000000"/>
-              <w:bottom w:val="single" w:sz="6" w:space="0" w:color="000000"/>
-            </w:tcBorders>
-          </w:tcPr>
-          <w:p>
-            <w:pPr>
-              <w:jc w:val="center"/>
-              <w:rPr>
-                <w:rFonts w:eastAsia="Arial" w:cs="Arial"/>
-                <w:szCs w:val="20"/>
-              </w:rPr>
-            </w:pPr>
-            <w:r>
-              <w:rPr>
-                <w:rFonts w:eastAsia="Arial" w:cs="Arial"/>
-                <w:szCs w:val="20"/>
-              </w:rPr>
-              <w:t>Versão publicada no portal, sem os achados de segurança</w:t>
-            </w:r>
-          </w:p>
-        </w:tc>
-        <w:tc>
-          <w:tcPr>
-            <w:tcW w:w="3291" w:type="dxa"/>
-            <w:tcBorders>
-              <w:top w:val="single" w:sz="6" w:space="0" w:color="000000"/>
-              <w:left w:val="single" w:sz="6" w:space="0" w:color="000000"/>
-              <w:bottom w:val="single" w:sz="6" w:space="0" w:color="000000"/>
-              <w:right w:val="single" w:sz="6" w:space="0" w:color="000000"/>
-            </w:tcBorders>
-          </w:tcPr>
-          <w:p>
-            <w:pPr>
-              <w:jc w:val="center"/>
-              <w:rPr>
-                <w:szCs w:val="20"/>
-              </w:rPr>
-            </w:pPr>
-            <w:r>
-              <w:rPr>
-                <w:szCs w:val="20"/>
-              </w:rPr>
-              <w:t>André Nardacci</w:t>
-            </w:r>
-          </w:p>
-        </w:tc>
-      </w:tr>
-      <w:tr>
-        <w:tc>
-          <w:tcPr>
-            <w:tcW w:w="1417" w:type="dxa"/>
-            <w:tcBorders>
-              <w:top w:val="single" w:sz="6" w:space="0" w:color="000000"/>
-              <w:left w:val="single" w:sz="6" w:space="0" w:color="000000"/>
-              <w:bottom w:val="single" w:sz="6" w:space="0" w:color="000000"/>
-            </w:tcBorders>
-          </w:tcPr>
-          <w:p>
-            <w:pPr>
-              <w:jc w:val="center"/>
-              <w:rPr>
-                <w:rFonts w:eastAsia="Arial" w:cs="Arial"/>
-                <w:szCs w:val="20"/>
-              </w:rPr>
-            </w:pPr>
-          </w:p>
-        </w:tc>
-        <w:tc>
-          <w:tcPr>
-            <w:tcW w:w="992" w:type="dxa"/>
-            <w:tcBorders>
-              <w:top w:val="single" w:sz="6" w:space="0" w:color="000000"/>
-              <w:left w:val="single" w:sz="6" w:space="0" w:color="000000"/>
-              <w:bottom w:val="single" w:sz="6" w:space="0" w:color="000000"/>
-            </w:tcBorders>
-          </w:tcPr>
-          <w:p>
-            <w:pPr>
-              <w:jc w:val="center"/>
-              <w:rPr>
-                <w:rFonts w:eastAsia="Arial" w:cs="Arial"/>
-                <w:szCs w:val="20"/>
-              </w:rPr>
-            </w:pPr>
-          </w:p>
-        </w:tc>
-        <w:tc>
-          <w:tcPr>
-            <w:tcW w:w="3969" w:type="dxa"/>
-            <w:tcBorders>
-              <w:top w:val="single" w:sz="6" w:space="0" w:color="000000"/>
-              <w:left w:val="single" w:sz="6" w:space="0" w:color="000000"/>
-              <w:bottom w:val="single" w:sz="6" w:space="0" w:color="000000"/>
-            </w:tcBorders>
-          </w:tcPr>
-          <w:p>
-            <w:pPr>
-              <w:jc w:val="center"/>
-              <w:rPr>
-                <w:rFonts w:eastAsia="Arial" w:cs="Arial"/>
-                <w:color w:val="000000"/>
-                <w:szCs w:val="20"/>
-              </w:rPr>
-            </w:pPr>
-          </w:p>
-        </w:tc>
-        <w:tc>
-          <w:tcPr>
-            <w:tcW w:w="3291" w:type="dxa"/>
-            <w:tcBorders>
-              <w:top w:val="single" w:sz="6" w:space="0" w:color="000000"/>
-              <w:left w:val="single" w:sz="6" w:space="0" w:color="000000"/>
-              <w:bottom w:val="single" w:sz="6" w:space="0" w:color="000000"/>
-              <w:right w:val="single" w:sz="6" w:space="0" w:color="000000"/>
-            </w:tcBorders>
-          </w:tcPr>
-          <w:p>
-            <w:pPr>
-              <w:jc w:val="center"/>
-              <w:rPr>
-                <w:rFonts w:eastAsia="Arial" w:cs="Arial"/>
-                <w:szCs w:val="20"/>
-              </w:rPr>
-            </w:pPr>
-          </w:p>
-        </w:tc>
-      </w:tr>
-      <w:tr>
-        <w:tc>
-          <w:tcPr>
-            <w:tcW w:w="1417" w:type="dxa"/>
-            <w:tcBorders>
-              <w:top w:val="single" w:sz="6" w:space="0" w:color="000000"/>
-              <w:left w:val="single" w:sz="6" w:space="0" w:color="000000"/>
-              <w:bottom w:val="single" w:sz="6" w:space="0" w:color="000000"/>
-            </w:tcBorders>
-          </w:tcPr>
-          <w:p>
-            <w:pPr>
-              <w:jc w:val="center"/>
-              <w:rPr>
-                <w:rFonts w:eastAsia="Arial" w:cs="Arial"/>
-                <w:sz w:val="22"/>
-                <w:szCs w:val="22"/>
-              </w:rPr>
-            </w:pPr>
-          </w:p>
-        </w:tc>
-        <w:tc>
-          <w:tcPr>
-            <w:tcW w:w="992" w:type="dxa"/>
-            <w:tcBorders>
-              <w:top w:val="single" w:sz="6" w:space="0" w:color="000000"/>
-              <w:left w:val="single" w:sz="6" w:space="0" w:color="000000"/>
-              <w:bottom w:val="single" w:sz="6" w:space="0" w:color="000000"/>
-            </w:tcBorders>
-          </w:tcPr>
-          <w:p>
-            <w:pPr>
-              <w:jc w:val="center"/>
-              <w:rPr>
-                <w:rFonts w:eastAsia="Arial" w:cs="Arial"/>
-                <w:sz w:val="22"/>
-                <w:szCs w:val="22"/>
-              </w:rPr>
-            </w:pPr>
-          </w:p>
-        </w:tc>
-        <w:tc>
-          <w:tcPr>
-            <w:tcW w:w="3969" w:type="dxa"/>
-            <w:tcBorders>
-              <w:top w:val="single" w:sz="6" w:space="0" w:color="000000"/>
-              <w:left w:val="single" w:sz="6" w:space="0" w:color="000000"/>
-              <w:bottom w:val="single" w:sz="6" w:space="0" w:color="000000"/>
-            </w:tcBorders>
-          </w:tcPr>
-          <w:p>
-            <w:pPr>
-              <w:jc w:val="center"/>
-              <w:rPr>
-                <w:rFonts w:eastAsia="Arial" w:cs="Arial"/>
-                <w:sz w:val="22"/>
-                <w:szCs w:val="22"/>
-              </w:rPr>
-            </w:pPr>
-          </w:p>
-        </w:tc>
-        <w:tc>
-          <w:tcPr>
-            <w:tcW w:w="3291" w:type="dxa"/>
-            <w:tcBorders>
-              <w:top w:val="single" w:sz="6" w:space="0" w:color="000000"/>
-              <w:left w:val="single" w:sz="6" w:space="0" w:color="000000"/>
-              <w:bottom w:val="single" w:sz="6" w:space="0" w:color="000000"/>
-              <w:right w:val="single" w:sz="6" w:space="0" w:color="000000"/>
-            </w:tcBorders>
-          </w:tcPr>
-          <w:p>
-            <w:pPr>
-              <w:jc w:val="center"/>
-              <w:rPr>
-                <w:rFonts w:eastAsia="Arial" w:cs="Arial"/>
-                <w:sz w:val="22"/>
-                <w:szCs w:val="22"/>
-              </w:rPr>
-            </w:pPr>
-          </w:p>
-        </w:tc>
-      </w:tr>
-      <w:tr>
-        <w:tc>
-          <w:tcPr>
-            <w:tcW w:w="1417" w:type="dxa"/>
-            <w:tcBorders>
-              <w:top w:val="single" w:sz="6" w:space="0" w:color="000000"/>
-              <w:left w:val="single" w:sz="6" w:space="0" w:color="000000"/>
-              <w:bottom w:val="single" w:sz="6" w:space="0" w:color="000000"/>
-            </w:tcBorders>
-          </w:tcPr>
-          <w:p>
-            <w:pPr>
-              <w:jc w:val="center"/>
-              <w:rPr>
-                <w:rFonts w:eastAsia="Arial" w:cs="Arial"/>
-                <w:sz w:val="22"/>
-                <w:szCs w:val="22"/>
-              </w:rPr>
-            </w:pPr>
-          </w:p>
-        </w:tc>
-        <w:tc>
-          <w:tcPr>
-            <w:tcW w:w="992" w:type="dxa"/>
-            <w:tcBorders>
-              <w:top w:val="single" w:sz="6" w:space="0" w:color="000000"/>
-              <w:left w:val="single" w:sz="6" w:space="0" w:color="000000"/>
-              <w:bottom w:val="single" w:sz="6" w:space="0" w:color="000000"/>
-            </w:tcBorders>
-          </w:tcPr>
-          <w:p>
-            <w:pPr>
-              <w:jc w:val="center"/>
-              <w:rPr>
-                <w:rFonts w:eastAsia="Arial" w:cs="Arial"/>
-                <w:sz w:val="22"/>
-                <w:szCs w:val="22"/>
-              </w:rPr>
-            </w:pPr>
-          </w:p>
-        </w:tc>
-        <w:tc>
-          <w:tcPr>
-            <w:tcW w:w="3969" w:type="dxa"/>
-            <w:tcBorders>
-              <w:top w:val="single" w:sz="6" w:space="0" w:color="000000"/>
-              <w:left w:val="single" w:sz="6" w:space="0" w:color="000000"/>
-              <w:bottom w:val="single" w:sz="6" w:space="0" w:color="000000"/>
-            </w:tcBorders>
-          </w:tcPr>
-          <w:p>
-            <w:pPr>
-              <w:jc w:val="center"/>
-              <w:rPr>
-                <w:rFonts w:eastAsia="Arial" w:cs="Arial"/>
-                <w:sz w:val="22"/>
-                <w:szCs w:val="22"/>
-              </w:rPr>
-            </w:pPr>
-          </w:p>
-        </w:tc>
-        <w:tc>
-          <w:tcPr>
-            <w:tcW w:w="3291" w:type="dxa"/>
-            <w:tcBorders>
-              <w:top w:val="single" w:sz="6" w:space="0" w:color="000000"/>
-              <w:left w:val="single" w:sz="6" w:space="0" w:color="000000"/>
-              <w:bottom w:val="single" w:sz="6" w:space="0" w:color="000000"/>
-              <w:right w:val="single" w:sz="6" w:space="0" w:color="000000"/>
-            </w:tcBorders>
-          </w:tcPr>
-          <w:p>
-            <w:pPr>
-              <w:jc w:val="center"/>
-              <w:rPr>
-                <w:rFonts w:eastAsia="Arial" w:cs="Arial"/>
-                <w:sz w:val="22"/>
-                <w:szCs w:val="22"/>
-              </w:rPr>
-            </w:pPr>
-          </w:p>
-        </w:tc>
-      </w:tr>
-      <w:tr>
-        <w:tc>
-          <w:tcPr>
-            <w:tcW w:w="1417" w:type="dxa"/>
-            <w:tcBorders>
-              <w:top w:val="single" w:sz="6" w:space="0" w:color="000000"/>
-              <w:left w:val="single" w:sz="6" w:space="0" w:color="000000"/>
-              <w:bottom w:val="single" w:sz="6" w:space="0" w:color="000000"/>
-            </w:tcBorders>
-          </w:tcPr>
-          <w:p>
-            <w:pPr>
-              <w:jc w:val="center"/>
-              <w:rPr>
-                <w:rFonts w:eastAsia="Arial" w:cs="Arial"/>
-                <w:sz w:val="22"/>
-                <w:szCs w:val="22"/>
-              </w:rPr>
-            </w:pPr>
-          </w:p>
-        </w:tc>
-        <w:tc>
-          <w:tcPr>
-            <w:tcW w:w="992" w:type="dxa"/>
-            <w:tcBorders>
-              <w:top w:val="single" w:sz="6" w:space="0" w:color="000000"/>
-              <w:left w:val="single" w:sz="6" w:space="0" w:color="000000"/>
-              <w:bottom w:val="single" w:sz="6" w:space="0" w:color="000000"/>
-            </w:tcBorders>
-          </w:tcPr>
-          <w:p>
-            <w:pPr>
-              <w:jc w:val="center"/>
-              <w:rPr>
-                <w:rFonts w:eastAsia="Arial" w:cs="Arial"/>
-                <w:sz w:val="22"/>
-                <w:szCs w:val="22"/>
-              </w:rPr>
-            </w:pPr>
-          </w:p>
-        </w:tc>
-        <w:tc>
-          <w:tcPr>
-            <w:tcW w:w="3969" w:type="dxa"/>
-            <w:tcBorders>
-              <w:top w:val="single" w:sz="6" w:space="0" w:color="000000"/>
-              <w:left w:val="single" w:sz="6" w:space="0" w:color="000000"/>
-              <w:bottom w:val="single" w:sz="6" w:space="0" w:color="000000"/>
-            </w:tcBorders>
-          </w:tcPr>
-          <w:p>
-            <w:pPr>
-              <w:jc w:val="center"/>
-              <w:rPr>
-                <w:rFonts w:eastAsia="Arial" w:cs="Arial"/>
-                <w:sz w:val="22"/>
-                <w:szCs w:val="22"/>
-              </w:rPr>
-            </w:pPr>
-          </w:p>
-        </w:tc>
-        <w:tc>
-          <w:tcPr>
-            <w:tcW w:w="3291" w:type="dxa"/>
-            <w:tcBorders>
-              <w:top w:val="single" w:sz="6" w:space="0" w:color="000000"/>
-              <w:left w:val="single" w:sz="6" w:space="0" w:color="000000"/>
-              <w:bottom w:val="single" w:sz="6" w:space="0" w:color="000000"/>
-              <w:right w:val="single" w:sz="6" w:space="0" w:color="000000"/>
-            </w:tcBorders>
-          </w:tcPr>
-          <w:p>
-            <w:pPr>
-              <w:jc w:val="center"/>
-              <w:rPr>
-                <w:rFonts w:eastAsia="Arial" w:cs="Arial"/>
-                <w:sz w:val="22"/>
-                <w:szCs w:val="22"/>
-              </w:rPr>
-            </w:pPr>
-          </w:p>
-        </w:tc>
-      </w:tr>
-    </w:tbl>
-    <w:p>
-      <w:pPr>
-        <w:sectPr>
-          <w:footerReference w:type="default" r:id="rId8"/>
-          <w:footerReference w:type="first" r:id="rId9"/>
-          <w:pgSz w:w="11906" w:h="16838"/>
-          <w:pgMar w:top="1707" w:right="851" w:bottom="1134" w:left="1418" w:header="1134" w:footer="720" w:gutter="0"/>
-          <w:pgNumType w:start="1"/>
-          <w:cols w:space="720"/>
-          <w:formProt w:val="0"/>
-          <w:titlePg/>
-          <w:docGrid w:linePitch="100"/>
-        </w:sectPr>
-      </w:pPr>
-    </w:p>
-    <w:p>
-      <w:pPr>
-        <w:widowControl/>
-        <w:overflowPunct/>
-        <w:spacing w:before="0" w:after="0"/>
-        <w:jc w:val="left"/>
-        <w:rPr>
-          <w:color w:val="000000" w:themeColor="text1"/>
-        </w:rPr>
-      </w:pPr>
-    </w:p>
-    <w:p>
-      <w:pPr>
-        <w:widowControl/>
-        <w:numPr>
-          <w:ilvl w:val="0"/>
-          <w:numId w:val="1"/>
-        </w:numPr>
-        <w:pBdr>
-          <w:top w:val="single" w:sz="4" w:space="1" w:color="000000"/>
-          <w:left w:val="single" w:sz="4" w:space="4" w:color="000000"/>
-          <w:bottom w:val="single" w:sz="4" w:space="1" w:color="000000"/>
-          <w:right w:val="single" w:sz="4" w:space="4" w:color="000000"/>
-        </w:pBdr>
-        <w:shd w:val="clear" w:color="auto" w:fill="F2F2F2"/>
-        <w:spacing w:before="0" w:after="0"/>
-        <w:ind w:left="0" w:right="170" w:firstLine="0"/>
-        <w:rPr>
-          <w:color w:val="000000" w:themeColor="text1"/>
-        </w:rPr>
-      </w:pPr>
-      <w:r>
-        <w:rPr>
-          <w:rFonts w:eastAsia="Arial" w:cs="Arial"/>
-          <w:b/>
-          <w:color w:val="000000" w:themeColor="text1"/>
-        </w:rPr>
-        <w:t>ACRÔNIMOS E ABREVIAÇÕES</w:t>
-      </w:r>
-    </w:p>
-    <w:p>
-      <w:pPr>
-        <w:spacing w:line="360" w:lineRule="auto"/>
-        <w:rPr>
-          <w:b/>
-          <w:bCs/>
-        </w:rPr>
-      </w:pPr>
-    </w:p>
-    <w:tbl>
-      <w:tblPr>
-        <w:tblStyle w:val="Tabelacomgrade"/>
-        <w:tblW w:w="0" w:type="auto"/>
-        <w:tblLook w:val="04A0" w:firstRow="1" w:lastRow="0" w:firstColumn="1" w:lastColumn="0" w:noHBand="0" w:noVBand="1"/>
-      </w:tblPr>
-      <w:tblGrid>
-        <w:gridCol w:w="1271"/>
-        <w:gridCol w:w="4502"/>
-        <w:gridCol w:w="3848"/>
-      </w:tblGrid>
-      <w:tr>
-        <w:tc>
-          <w:tcPr>
-            <w:tcW w:w="1271" w:type="dxa"/>
-            <w:shd w:val="clear" w:color="auto" w:fill="D9D9D9" w:themeFill="background1" w:themeFillShade="D9"/>
-            <w:hideMark/>
-          </w:tcPr>
-          <w:p>
-            <w:pPr>
-              <w:spacing w:line="360" w:lineRule="auto"/>
-              <w:rPr>
-                <w:b/>
-                <w:bCs/>
-              </w:rPr>
-            </w:pPr>
-            <w:r>
-              <w:rPr>
-                <w:b/>
-                <w:bCs/>
-              </w:rPr>
-              <w:t>Sigla</w:t>
-            </w:r>
-          </w:p>
-        </w:tc>
-        <w:tc>
-          <w:tcPr>
-            <w:tcW w:w="4502" w:type="dxa"/>
-            <w:shd w:val="clear" w:color="auto" w:fill="D9D9D9" w:themeFill="background1" w:themeFillShade="D9"/>
-            <w:hideMark/>
-          </w:tcPr>
-          <w:p>
-            <w:pPr>
-              <w:spacing w:line="360" w:lineRule="auto"/>
-              <w:rPr>
-                <w:b/>
-                <w:bCs/>
-              </w:rPr>
-            </w:pPr>
-            <w:r>
-              <w:rPr>
-                <w:b/>
-                <w:bCs/>
-              </w:rPr>
-              <w:t>Termo Original</w:t>
-            </w:r>
-          </w:p>
-        </w:tc>
-        <w:tc>
-          <w:tcPr>
-            <w:tcW w:w="0" w:type="auto"/>
-            <w:shd w:val="clear" w:color="auto" w:fill="D9D9D9" w:themeFill="background1" w:themeFillShade="D9"/>
-            <w:hideMark/>
-          </w:tcPr>
-          <w:p>
-            <w:pPr>
-              <w:spacing w:line="360" w:lineRule="auto"/>
-              <w:rPr>
-                <w:b/>
-                <w:bCs/>
-              </w:rPr>
-            </w:pPr>
-            <w:r>
-              <w:rPr>
-                <w:b/>
-                <w:bCs/>
-              </w:rPr>
-              <w:t>Tradução / Significado</w:t>
-            </w:r>
-          </w:p>
-        </w:tc>
-      </w:tr>
-      <w:tr>
-        <w:tc>
-          <w:tcPr>
-            <w:tcW w:w="1271" w:type="dxa"/>
-            <w:hideMark/>
-          </w:tcPr>
-          <w:p>
-            <w:pPr>
-              <w:spacing w:line="360" w:lineRule="auto"/>
-            </w:pPr>
-            <w:r>
-              <w:t>ANVISA</w:t>
-            </w:r>
-          </w:p>
-        </w:tc>
-        <w:tc>
-          <w:tcPr>
-            <w:tcW w:w="4502" w:type="dxa"/>
-            <w:hideMark/>
-          </w:tcPr>
-          <w:p>
-            <w:pPr>
-              <w:spacing w:line="360" w:lineRule="auto"/>
-            </w:pPr>
-            <w:r>
-              <w:t>Agência Nacional de Vigilância Sanitária</w:t>
-            </w:r>
-          </w:p>
-        </w:tc>
-        <w:tc>
-          <w:tcPr>
-            <w:tcW w:w="0" w:type="auto"/>
-            <w:hideMark/>
-          </w:tcPr>
-          <w:p>
-            <w:pPr>
-              <w:spacing w:line="360" w:lineRule="auto"/>
-            </w:pPr>
-            <w:r>
-              <w:t>Agência reguladora sanitária brasileira</w:t>
-            </w:r>
-          </w:p>
-        </w:tc>
-      </w:tr>
-      <w:tr>
-        <w:tc>
-          <w:tcPr>
-            <w:tcW w:w="1271" w:type="dxa"/>
-            <w:hideMark/>
-          </w:tcPr>
-          <w:p>
-            <w:pPr>
-              <w:spacing w:line="360" w:lineRule="auto"/>
-            </w:pPr>
-            <w:r>
-              <w:t>BPF</w:t>
-            </w:r>
-          </w:p>
-        </w:tc>
-        <w:tc>
-          <w:tcPr>
-            <w:tcW w:w="4502" w:type="dxa"/>
-            <w:hideMark/>
-          </w:tcPr>
-          <w:p>
-            <w:pPr>
-              <w:spacing w:line="360" w:lineRule="auto"/>
-            </w:pPr>
-            <w:r>
-              <w:t>Boas Práticas de Fabricação</w:t>
-            </w:r>
-          </w:p>
-        </w:tc>
-        <w:tc>
-          <w:tcPr>
-            <w:tcW w:w="0" w:type="auto"/>
-            <w:hideMark/>
-          </w:tcPr>
-          <w:p>
-            <w:pPr>
-              <w:spacing w:line="360" w:lineRule="auto"/>
-            </w:pPr>
-            <w:r>
-              <w:t>Conjunto de requisitos para garantir qualidade e segurança dos medicamentos</w:t>
-            </w:r>
-          </w:p>
-        </w:tc>
-      </w:tr>
-      <w:tr>
-        <w:tc>
-          <w:tcPr>
-            <w:tcW w:w="1271" w:type="dxa"/>
-            <w:hideMark/>
-          </w:tcPr>
-          <w:p>
-            <w:pPr>
-              <w:spacing w:line="360" w:lineRule="auto"/>
-            </w:pPr>
-            <w:r>
-              <w:t>GMP</w:t>
-            </w:r>
-          </w:p>
-        </w:tc>
-        <w:tc>
-          <w:tcPr>
-            <w:tcW w:w="4502" w:type="dxa"/>
-            <w:hideMark/>
-          </w:tcPr>
-          <w:p>
-            <w:pPr>
-              <w:spacing w:line="360" w:lineRule="auto"/>
-            </w:pPr>
-            <w:r>
-              <w:t>Good Manufacturing Practices</w:t>
-            </w:r>
-          </w:p>
-        </w:tc>
-        <w:tc>
-          <w:tcPr>
-            <w:tcW w:w="0" w:type="auto"/>
-            <w:hideMark/>
-          </w:tcPr>
-          <w:p>
-            <w:pPr>
-              <w:spacing w:line="360" w:lineRule="auto"/>
-            </w:pPr>
-            <w:r>
-              <w:t>Boas Práticas de Fabricação</w:t>
-            </w:r>
-          </w:p>
-        </w:tc>
-      </w:tr>
-      <w:tr>
-        <w:tc>
-          <w:tcPr>
-            <w:tcW w:w="1271" w:type="dxa"/>
-            <w:hideMark/>
-          </w:tcPr>
-          <w:p>
-            <w:pPr>
-              <w:spacing w:line="360" w:lineRule="auto"/>
-            </w:pPr>
-            <w:r>
-              <w:t>SGQ</w:t>
-            </w:r>
-          </w:p>
-        </w:tc>
-        <w:tc>
-          <w:tcPr>
-            <w:tcW w:w="4502" w:type="dxa"/>
-            <w:hideMark/>
-          </w:tcPr>
-          <w:p>
-            <w:pPr>
-              <w:spacing w:line="360" w:lineRule="auto"/>
-            </w:pPr>
-            <w:r>
-              <w:t>Sistema de Gestão da Qualidade</w:t>
-            </w:r>
-          </w:p>
-        </w:tc>
-        <w:tc>
-          <w:tcPr>
-            <w:tcW w:w="0" w:type="auto"/>
-            <w:hideMark/>
-          </w:tcPr>
-          <w:p>
-            <w:pPr>
-              <w:spacing w:line="360" w:lineRule="auto"/>
-            </w:pPr>
-            <w:r>
-              <w:t>Sistema de gestão da qualidade farmacêutica</w:t>
-            </w:r>
-          </w:p>
-        </w:tc>
-      </w:tr>
-      <w:tr>
-        <w:tc>
-          <w:tcPr>
-            <w:tcW w:w="1271" w:type="dxa"/>
-            <w:hideMark/>
-          </w:tcPr>
-          <w:p>
-            <w:pPr>
-              <w:spacing w:line="360" w:lineRule="auto"/>
-            </w:pPr>
-            <w:r>
-              <w:t>CAPA</w:t>
-            </w:r>
-          </w:p>
-        </w:tc>
-        <w:tc>
-          <w:tcPr>
-            <w:tcW w:w="4502" w:type="dxa"/>
-            <w:hideMark/>
-          </w:tcPr>
-          <w:p>
-            <w:pPr>
-              <w:spacing w:line="360" w:lineRule="auto"/>
-            </w:pPr>
-            <w:r>
-              <w:t>Corrective and Preventive Action</w:t>
-            </w:r>
-          </w:p>
-        </w:tc>
-        <w:tc>
-          <w:tcPr>
-            <w:tcW w:w="0" w:type="auto"/>
-            <w:hideMark/>
-          </w:tcPr>
-          <w:p>
-            <w:pPr>
-              <w:spacing w:line="360" w:lineRule="auto"/>
-            </w:pPr>
-            <w:r>
-              <w:t>Ação Corretiva e Preventiva</w:t>
-            </w:r>
-          </w:p>
-        </w:tc>
-      </w:tr>
-      <w:tr>
-        <w:tc>
-          <w:tcPr>
-            <w:tcW w:w="1271" w:type="dxa"/>
-            <w:hideMark/>
-          </w:tcPr>
-          <w:p>
-            <w:pPr>
-              <w:spacing w:line="360" w:lineRule="auto"/>
-            </w:pPr>
-            <w:r>
-              <w:t>RNC</w:t>
-            </w:r>
-          </w:p>
-        </w:tc>
-        <w:tc>
-          <w:tcPr>
-            <w:tcW w:w="4502" w:type="dxa"/>
-            <w:hideMark/>
-          </w:tcPr>
-          <w:p>
-            <w:pPr>
-              <w:spacing w:line="360" w:lineRule="auto"/>
-            </w:pPr>
-            <w:r>
-              <w:t>Relatório de Não Conformidade</w:t>
-            </w:r>
-          </w:p>
-        </w:tc>
-        <w:tc>
-          <w:tcPr>
-            <w:tcW w:w="0" w:type="auto"/>
-            <w:hideMark/>
-          </w:tcPr>
-          <w:p>
-            <w:pPr>
-              <w:spacing w:line="360" w:lineRule="auto"/>
-            </w:pPr>
-            <w:r>
-              <w:t>Registro formal de desvios ou não conformidades</w:t>
-            </w:r>
-          </w:p>
-        </w:tc>
-      </w:tr>
-      <w:tr>
-        <w:tc>
-          <w:tcPr>
-            <w:tcW w:w="1271" w:type="dxa"/>
-            <w:hideMark/>
-          </w:tcPr>
-          <w:p>
-            <w:pPr>
-              <w:spacing w:line="360" w:lineRule="auto"/>
-            </w:pPr>
-            <w:r>
-              <w:t>POP</w:t>
-            </w:r>
-          </w:p>
-        </w:tc>
-        <w:tc>
-          <w:tcPr>
-            <w:tcW w:w="4502" w:type="dxa"/>
-            <w:hideMark/>
-          </w:tcPr>
-          <w:p>
-            <w:pPr>
-              <w:spacing w:line="360" w:lineRule="auto"/>
-            </w:pPr>
-            <w:r>
-              <w:t>Procedimento Operacional Padrão</w:t>
-            </w:r>
-          </w:p>
-        </w:tc>
-        <w:tc>
-          <w:tcPr>
-            <w:tcW w:w="0" w:type="auto"/>
-            <w:hideMark/>
-          </w:tcPr>
-          <w:p>
-            <w:pPr>
-              <w:spacing w:line="360" w:lineRule="auto"/>
-            </w:pPr>
-            <w:r>
-              <w:t>Documento que descreve a execução padronizada de atividades</w:t>
-            </w:r>
-          </w:p>
-        </w:tc>
-      </w:tr>
-      <w:tr>
-        <w:tc>
-          <w:tcPr>
-            <w:tcW w:w="1271" w:type="dxa"/>
-            <w:hideMark/>
-          </w:tcPr>
-          <w:p>
-            <w:pPr>
-              <w:spacing w:line="360" w:lineRule="auto"/>
-            </w:pPr>
-            <w:r>
-              <w:t>RDC</w:t>
-            </w:r>
-          </w:p>
-        </w:tc>
-        <w:tc>
-          <w:tcPr>
-            <w:tcW w:w="4502" w:type="dxa"/>
-            <w:hideMark/>
-          </w:tcPr>
-          <w:p>
-            <w:pPr>
-              <w:spacing w:line="360" w:lineRule="auto"/>
-            </w:pPr>
-            <w:r>
-              <w:t>Resolução da Diretoria Colegiada</w:t>
-            </w:r>
-          </w:p>
-        </w:tc>
-        <w:tc>
-          <w:tcPr>
-            <w:tcW w:w="0" w:type="auto"/>
-            <w:hideMark/>
-          </w:tcPr>
-          <w:p>
-            <w:pPr>
-              <w:spacing w:line="360" w:lineRule="auto"/>
-            </w:pPr>
-            <w:r>
-              <w:t>Norma regulatória emitida pela ANVISA</w:t>
-            </w:r>
-          </w:p>
-        </w:tc>
-      </w:tr>
-      <w:tr>
-        <w:tc>
-          <w:tcPr>
-            <w:tcW w:w="1271" w:type="dxa"/>
-            <w:hideMark/>
-          </w:tcPr>
-          <w:p>
-            <w:pPr>
-              <w:spacing w:line="360" w:lineRule="auto"/>
-            </w:pPr>
-            <w:r>
-              <w:t>PIC/S</w:t>
-            </w:r>
-          </w:p>
-        </w:tc>
-        <w:tc>
-          <w:tcPr>
-            <w:tcW w:w="4502" w:type="dxa"/>
-            <w:hideMark/>
-          </w:tcPr>
-          <w:p>
-            <w:pPr>
-              <w:spacing w:line="360" w:lineRule="auto"/>
-              <w:rPr>
-                <w:lang w:val="en-US"/>
-              </w:rPr>
-            </w:pPr>
-            <w:r>
-              <w:rPr>
-                <w:lang w:val="en-US"/>
-              </w:rPr>
-              <w:t>Pharmaceutical Inspection Co-operation Scheme</w:t>
-            </w:r>
-          </w:p>
-        </w:tc>
-        <w:tc>
-          <w:tcPr>
-            <w:tcW w:w="0" w:type="auto"/>
-            <w:hideMark/>
-          </w:tcPr>
-          <w:p>
-            <w:pPr>
-              <w:spacing w:line="360" w:lineRule="auto"/>
-            </w:pPr>
-            <w:r>
-              <w:t>Esquema de Cooperação em Inspeção Farmacêutica</w:t>
-            </w:r>
-          </w:p>
-        </w:tc>
-      </w:tr>
-      <w:tr>
-        <w:tc>
-          <w:tcPr>
-            <w:tcW w:w="1271" w:type="dxa"/>
-            <w:hideMark/>
-          </w:tcPr>
-          <w:p>
-            <w:pPr>
-              <w:spacing w:line="360" w:lineRule="auto"/>
-            </w:pPr>
-            <w:r>
-              <w:t>CSV</w:t>
-            </w:r>
-          </w:p>
-        </w:tc>
-        <w:tc>
-          <w:tcPr>
-            <w:tcW w:w="4502" w:type="dxa"/>
-            <w:hideMark/>
-          </w:tcPr>
-          <w:p>
-            <w:pPr>
-              <w:spacing w:line="360" w:lineRule="auto"/>
-            </w:pPr>
-            <w:r>
-              <w:t>Computerized System Validation</w:t>
-            </w:r>
-          </w:p>
-        </w:tc>
-        <w:tc>
-          <w:tcPr>
-            <w:tcW w:w="0" w:type="auto"/>
-            <w:hideMark/>
-          </w:tcPr>
-          <w:p>
-            <w:pPr>
-              <w:spacing w:line="360" w:lineRule="auto"/>
-            </w:pPr>
-            <w:r>
-              <w:t>Validação de Sistemas Computadorizados</w:t>
-            </w:r>
-          </w:p>
-        </w:tc>
-      </w:tr>
-      <w:tr>
-        <w:tc>
-          <w:tcPr>
-            <w:tcW w:w="1271" w:type="dxa"/>
-            <w:hideMark/>
-          </w:tcPr>
-          <w:p>
-            <w:pPr>
-              <w:spacing w:line="360" w:lineRule="auto"/>
-            </w:pPr>
-            <w:r>
-              <w:t>URS</w:t>
-            </w:r>
-          </w:p>
-        </w:tc>
-        <w:tc>
-          <w:tcPr>
-            <w:tcW w:w="4502" w:type="dxa"/>
-            <w:hideMark/>
-          </w:tcPr>
-          <w:p>
-            <w:pPr>
-              <w:spacing w:line="360" w:lineRule="auto"/>
-            </w:pPr>
-            <w:r>
-              <w:t>User Requirements Specification</w:t>
-            </w:r>
-          </w:p>
-        </w:tc>
-        <w:tc>
-          <w:tcPr>
-            <w:tcW w:w="0" w:type="auto"/>
-            <w:hideMark/>
-          </w:tcPr>
-          <w:p>
-            <w:pPr>
-              <w:spacing w:line="360" w:lineRule="auto"/>
-            </w:pPr>
-            <w:r>
-              <w:t>Especificação de Requisitos do Usuário</w:t>
-            </w:r>
-          </w:p>
-        </w:tc>
-      </w:tr>
-      <w:tr>
-        <w:tc>
-          <w:tcPr>
-            <w:tcW w:w="1271" w:type="dxa"/>
-            <w:hideMark/>
-          </w:tcPr>
-          <w:p>
-            <w:pPr>
-              <w:spacing w:line="360" w:lineRule="auto"/>
-            </w:pPr>
-            <w:r>
-              <w:t>ERU</w:t>
-            </w:r>
-          </w:p>
-        </w:tc>
-        <w:tc>
-          <w:tcPr>
-            <w:tcW w:w="4502" w:type="dxa"/>
-            <w:hideMark/>
-          </w:tcPr>
-          <w:p>
-            <w:pPr>
-              <w:spacing w:line="360" w:lineRule="auto"/>
-            </w:pPr>
-            <w:r>
-              <w:t>Especificação de Requisitos do Usuário</w:t>
-            </w:r>
-          </w:p>
-        </w:tc>
-        <w:tc>
-          <w:tcPr>
-            <w:tcW w:w="0" w:type="auto"/>
-            <w:hideMark/>
-          </w:tcPr>
-          <w:p>
-            <w:pPr>
-              <w:spacing w:line="360" w:lineRule="auto"/>
-            </w:pPr>
-            <w:r>
-              <w:t>Documento contendo os requisitos do negócio e dos usuários</w:t>
-            </w:r>
-          </w:p>
-        </w:tc>
-      </w:tr>
-      <w:tr>
-        <w:tc>
-          <w:tcPr>
-            <w:tcW w:w="1271" w:type="dxa"/>
-            <w:hideMark/>
-          </w:tcPr>
-          <w:p>
-            <w:pPr>
-              <w:spacing w:line="360" w:lineRule="auto"/>
-            </w:pPr>
-            <w:r>
-              <w:t>FS</w:t>
-            </w:r>
-          </w:p>
-        </w:tc>
-        <w:tc>
-          <w:tcPr>
-            <w:tcW w:w="4502" w:type="dxa"/>
-            <w:hideMark/>
-          </w:tcPr>
-          <w:p>
-            <w:pPr>
-              <w:spacing w:line="360" w:lineRule="auto"/>
-            </w:pPr>
-            <w:r>
-              <w:t>Functional Specification</w:t>
-            </w:r>
-          </w:p>
-        </w:tc>
-        <w:tc>
-          <w:tcPr>
-            <w:tcW w:w="0" w:type="auto"/>
-            <w:hideMark/>
-          </w:tcPr>
-          <w:p>
-            <w:pPr>
-              <w:spacing w:line="360" w:lineRule="auto"/>
-            </w:pPr>
-            <w:r>
-              <w:t>Especificação Funcional</w:t>
-            </w:r>
-          </w:p>
-        </w:tc>
-      </w:tr>
-      <w:tr>
-        <w:tc>
-          <w:tcPr>
-            <w:tcW w:w="1271" w:type="dxa"/>
-            <w:hideMark/>
-          </w:tcPr>
-          <w:p>
-            <w:pPr>
-              <w:spacing w:line="360" w:lineRule="auto"/>
-            </w:pPr>
-            <w:r>
-              <w:t>IQ</w:t>
-            </w:r>
-          </w:p>
-        </w:tc>
-        <w:tc>
-          <w:tcPr>
-            <w:tcW w:w="4502" w:type="dxa"/>
-            <w:hideMark/>
-          </w:tcPr>
-          <w:p>
-            <w:pPr>
-              <w:spacing w:line="360" w:lineRule="auto"/>
-            </w:pPr>
-            <w:r>
-              <w:t>Installation Qualification</w:t>
-            </w:r>
-          </w:p>
-        </w:tc>
-        <w:tc>
-          <w:tcPr>
-            <w:tcW w:w="0" w:type="auto"/>
-            <w:hideMark/>
-          </w:tcPr>
-          <w:p>
-            <w:pPr>
-              <w:spacing w:line="360" w:lineRule="auto"/>
-            </w:pPr>
-            <w:r>
-              <w:t>Qualificação de Instalação</w:t>
-            </w:r>
-          </w:p>
-        </w:tc>
-      </w:tr>
-      <w:tr>
-        <w:tc>
-          <w:tcPr>
-            <w:tcW w:w="1271" w:type="dxa"/>
-            <w:hideMark/>
-          </w:tcPr>
-          <w:p>
-            <w:pPr>
-              <w:spacing w:line="360" w:lineRule="auto"/>
-            </w:pPr>
-            <w:r>
-              <w:t>OQ</w:t>
-            </w:r>
-          </w:p>
-        </w:tc>
-        <w:tc>
-          <w:tcPr>
-            <w:tcW w:w="4502" w:type="dxa"/>
-            <w:hideMark/>
-          </w:tcPr>
-          <w:p>
-            <w:pPr>
-              <w:spacing w:line="360" w:lineRule="auto"/>
-            </w:pPr>
-            <w:r>
-              <w:t>Operational Qualification</w:t>
-            </w:r>
-          </w:p>
-        </w:tc>
-        <w:tc>
-          <w:tcPr>
-            <w:tcW w:w="0" w:type="auto"/>
-            <w:hideMark/>
-          </w:tcPr>
-          <w:p>
-            <w:pPr>
-              <w:spacing w:line="360" w:lineRule="auto"/>
-            </w:pPr>
-            <w:r>
-              <w:t>Qualificação Operacional</w:t>
-            </w:r>
-          </w:p>
-        </w:tc>
-      </w:tr>
-      <w:tr>
-        <w:tc>
-          <w:tcPr>
-            <w:tcW w:w="1271" w:type="dxa"/>
-            <w:hideMark/>
-          </w:tcPr>
-          <w:p>
-            <w:pPr>
-              <w:spacing w:line="360" w:lineRule="auto"/>
-            </w:pPr>
-            <w:r>
-              <w:t>PQ</w:t>
-            </w:r>
-          </w:p>
-        </w:tc>
-        <w:tc>
-          <w:tcPr>
-            <w:tcW w:w="4502" w:type="dxa"/>
-            <w:hideMark/>
-          </w:tcPr>
-          <w:p>
-            <w:pPr>
-              <w:spacing w:line="360" w:lineRule="auto"/>
-            </w:pPr>
-            <w:r>
-              <w:t>Performance Qualification</w:t>
-            </w:r>
-          </w:p>
-        </w:tc>
-        <w:tc>
-          <w:tcPr>
-            <w:tcW w:w="0" w:type="auto"/>
-            <w:hideMark/>
-          </w:tcPr>
-          <w:p>
-            <w:pPr>
-              <w:spacing w:line="360" w:lineRule="auto"/>
-            </w:pPr>
-            <w:r>
-              <w:t>Qualificação de Desempenho</w:t>
-            </w:r>
-          </w:p>
-        </w:tc>
-      </w:tr>
-      <w:tr>
-        <w:tc>
-          <w:tcPr>
-            <w:tcW w:w="1271" w:type="dxa"/>
-            <w:hideMark/>
-          </w:tcPr>
-          <w:p>
-            <w:pPr>
-              <w:spacing w:line="360" w:lineRule="auto"/>
-            </w:pPr>
-            <w:r>
-              <w:t>QI</w:t>
-            </w:r>
-          </w:p>
-        </w:tc>
-        <w:tc>
-          <w:tcPr>
-            <w:tcW w:w="4502" w:type="dxa"/>
-            <w:hideMark/>
-          </w:tcPr>
-          <w:p>
-            <w:pPr>
-              <w:spacing w:line="360" w:lineRule="auto"/>
-            </w:pPr>
-            <w:r>
-              <w:t>Qualificação de Instalação</w:t>
-            </w:r>
-          </w:p>
-        </w:tc>
-        <w:tc>
-          <w:tcPr>
-            <w:tcW w:w="0" w:type="auto"/>
-            <w:hideMark/>
-          </w:tcPr>
-          <w:p>
-            <w:pPr>
-              <w:spacing w:line="360" w:lineRule="auto"/>
-            </w:pPr>
-            <w:r>
-              <w:t>Evidência de que a instalação foi executada conforme especificação</w:t>
-            </w:r>
-          </w:p>
-        </w:tc>
-      </w:tr>
-      <w:tr>
-        <w:tc>
-          <w:tcPr>
-            <w:tcW w:w="1271" w:type="dxa"/>
-            <w:hideMark/>
-          </w:tcPr>
-          <w:p>
-            <w:pPr>
-              <w:spacing w:line="360" w:lineRule="auto"/>
-            </w:pPr>
-            <w:r>
-              <w:t>QO</w:t>
-            </w:r>
-          </w:p>
-        </w:tc>
-        <w:tc>
-          <w:tcPr>
-            <w:tcW w:w="4502" w:type="dxa"/>
-            <w:hideMark/>
-          </w:tcPr>
-          <w:p>
-            <w:pPr>
-              <w:spacing w:line="360" w:lineRule="auto"/>
-            </w:pPr>
-            <w:r>
-              <w:t>Qualificação de Operação</w:t>
-            </w:r>
-          </w:p>
-        </w:tc>
-        <w:tc>
-          <w:tcPr>
-            <w:tcW w:w="0" w:type="auto"/>
-            <w:hideMark/>
-          </w:tcPr>
-          <w:p>
-            <w:pPr>
-              <w:spacing w:line="360" w:lineRule="auto"/>
-            </w:pPr>
-            <w:r>
-              <w:t>Evidência de que o sistema opera conforme especificado</w:t>
-            </w:r>
-          </w:p>
-        </w:tc>
-      </w:tr>
-      <w:tr>
-        <w:tc>
-          <w:tcPr>
-            <w:tcW w:w="1271" w:type="dxa"/>
-            <w:hideMark/>
-          </w:tcPr>
-          <w:p>
-            <w:pPr>
-              <w:spacing w:line="360" w:lineRule="auto"/>
-            </w:pPr>
-            <w:r>
-              <w:lastRenderedPageBreak/>
-              <w:t>QD</w:t>
-            </w:r>
-          </w:p>
-        </w:tc>
-        <w:tc>
-          <w:tcPr>
-            <w:tcW w:w="4502" w:type="dxa"/>
-            <w:hideMark/>
-          </w:tcPr>
-          <w:p>
-            <w:pPr>
-              <w:spacing w:line="360" w:lineRule="auto"/>
-            </w:pPr>
-            <w:r>
-              <w:t>Qualificação de Desempenho</w:t>
-            </w:r>
-          </w:p>
-        </w:tc>
-        <w:tc>
-          <w:tcPr>
-            <w:tcW w:w="0" w:type="auto"/>
-            <w:hideMark/>
-          </w:tcPr>
-          <w:p>
-            <w:pPr>
-              <w:spacing w:line="360" w:lineRule="auto"/>
-            </w:pPr>
-            <w:r>
-              <w:t>Evidência de que o sistema mantém desempenho consistente</w:t>
-            </w:r>
-          </w:p>
-        </w:tc>
-      </w:tr>
-      <w:tr>
-        <w:tc>
-          <w:tcPr>
-            <w:tcW w:w="1271" w:type="dxa"/>
-            <w:hideMark/>
-          </w:tcPr>
-          <w:p>
-            <w:pPr>
-              <w:spacing w:line="360" w:lineRule="auto"/>
-            </w:pPr>
-            <w:r>
-              <w:t>PMV</w:t>
-            </w:r>
-          </w:p>
-        </w:tc>
-        <w:tc>
-          <w:tcPr>
-            <w:tcW w:w="4502" w:type="dxa"/>
-            <w:hideMark/>
-          </w:tcPr>
-          <w:p>
-            <w:pPr>
-              <w:spacing w:line="360" w:lineRule="auto"/>
-            </w:pPr>
-            <w:r>
-              <w:t>Plano Mestre de Validação</w:t>
-            </w:r>
-          </w:p>
-        </w:tc>
-        <w:tc>
-          <w:tcPr>
-            <w:tcW w:w="0" w:type="auto"/>
-            <w:hideMark/>
-          </w:tcPr>
-          <w:p>
-            <w:pPr>
-              <w:spacing w:line="360" w:lineRule="auto"/>
-            </w:pPr>
-            <w:r>
-              <w:t>Documento que define a estratégia global de validação</w:t>
-            </w:r>
-          </w:p>
-        </w:tc>
-      </w:tr>
-      <w:tr>
-        <w:tc>
-          <w:tcPr>
-            <w:tcW w:w="1271" w:type="dxa"/>
-            <w:hideMark/>
-          </w:tcPr>
-          <w:p>
-            <w:pPr>
-              <w:spacing w:line="360" w:lineRule="auto"/>
-            </w:pPr>
-            <w:r>
-              <w:t>SNCM</w:t>
-            </w:r>
-          </w:p>
-        </w:tc>
-        <w:tc>
-          <w:tcPr>
-            <w:tcW w:w="4502" w:type="dxa"/>
-            <w:hideMark/>
-          </w:tcPr>
-          <w:p>
-            <w:pPr>
-              <w:spacing w:line="360" w:lineRule="auto"/>
-            </w:pPr>
-            <w:r>
-              <w:t>Sistema Nacional de Controle de Medicamentos</w:t>
-            </w:r>
-          </w:p>
-        </w:tc>
-        <w:tc>
-          <w:tcPr>
-            <w:tcW w:w="0" w:type="auto"/>
-            <w:hideMark/>
-          </w:tcPr>
-          <w:p>
-            <w:pPr>
-              <w:spacing w:line="360" w:lineRule="auto"/>
-            </w:pPr>
-            <w:r>
-              <w:t>Sistema brasileiro de rastreabilidade de medicamentos</w:t>
-            </w:r>
-          </w:p>
-        </w:tc>
-      </w:tr>
-      <w:tr>
-        <w:tc>
-          <w:tcPr>
-            <w:tcW w:w="1271" w:type="dxa"/>
-            <w:hideMark/>
-          </w:tcPr>
-          <w:p>
-            <w:pPr>
-              <w:spacing w:line="360" w:lineRule="auto"/>
-            </w:pPr>
-            <w:r>
-              <w:t>IUM</w:t>
-            </w:r>
-          </w:p>
-        </w:tc>
-        <w:tc>
-          <w:tcPr>
-            <w:tcW w:w="4502" w:type="dxa"/>
-            <w:hideMark/>
-          </w:tcPr>
-          <w:p>
-            <w:pPr>
-              <w:spacing w:line="360" w:lineRule="auto"/>
-            </w:pPr>
-            <w:r>
-              <w:t>Identificador Único de Medicamento</w:t>
-            </w:r>
-          </w:p>
-        </w:tc>
-        <w:tc>
-          <w:tcPr>
-            <w:tcW w:w="0" w:type="auto"/>
-            <w:hideMark/>
-          </w:tcPr>
-          <w:p>
-            <w:pPr>
-              <w:spacing w:line="360" w:lineRule="auto"/>
-            </w:pPr>
-            <w:r>
-              <w:t>Código único utilizado na serialização de medicamentos</w:t>
-            </w:r>
-          </w:p>
-        </w:tc>
-      </w:tr>
-      <w:tr>
-        <w:tc>
-          <w:tcPr>
-            <w:tcW w:w="1271" w:type="dxa"/>
-            <w:hideMark/>
-          </w:tcPr>
-          <w:p>
-            <w:pPr>
-              <w:spacing w:line="360" w:lineRule="auto"/>
-            </w:pPr>
-            <w:r>
-              <w:t>XML</w:t>
-            </w:r>
-          </w:p>
-        </w:tc>
-        <w:tc>
-          <w:tcPr>
-            <w:tcW w:w="4502" w:type="dxa"/>
-            <w:hideMark/>
-          </w:tcPr>
-          <w:p>
-            <w:pPr>
-              <w:spacing w:line="360" w:lineRule="auto"/>
-            </w:pPr>
-            <w:r>
-              <w:t>Extensible Markup Language</w:t>
-            </w:r>
-          </w:p>
-        </w:tc>
-        <w:tc>
-          <w:tcPr>
-            <w:tcW w:w="0" w:type="auto"/>
-            <w:hideMark/>
-          </w:tcPr>
-          <w:p>
-            <w:pPr>
-              <w:spacing w:line="360" w:lineRule="auto"/>
-            </w:pPr>
-            <w:r>
-              <w:t>Linguagem de marcação extensível para troca de dados</w:t>
-            </w:r>
-          </w:p>
-        </w:tc>
-      </w:tr>
-      <w:tr>
-        <w:tc>
-          <w:tcPr>
-            <w:tcW w:w="1271" w:type="dxa"/>
-            <w:hideMark/>
-          </w:tcPr>
-          <w:p>
-            <w:pPr>
-              <w:spacing w:line="360" w:lineRule="auto"/>
-            </w:pPr>
-            <w:r>
-              <w:t>FDA</w:t>
-            </w:r>
-          </w:p>
-        </w:tc>
-        <w:tc>
-          <w:tcPr>
-            <w:tcW w:w="4502" w:type="dxa"/>
-            <w:hideMark/>
-          </w:tcPr>
-          <w:p>
-            <w:pPr>
-              <w:spacing w:line="360" w:lineRule="auto"/>
-            </w:pPr>
-            <w:r>
-              <w:t>Food and Drug Administration</w:t>
-            </w:r>
-          </w:p>
-        </w:tc>
-        <w:tc>
-          <w:tcPr>
-            <w:tcW w:w="0" w:type="auto"/>
-            <w:hideMark/>
-          </w:tcPr>
-          <w:p>
-            <w:pPr>
-              <w:spacing w:line="360" w:lineRule="auto"/>
-            </w:pPr>
-            <w:r>
-              <w:t>Agência reguladora de alimentos e medicamentos dos Estados Unidos</w:t>
-            </w:r>
-          </w:p>
-        </w:tc>
-      </w:tr>
-      <w:tr>
-        <w:tc>
-          <w:tcPr>
-            <w:tcW w:w="1271" w:type="dxa"/>
-            <w:hideMark/>
-          </w:tcPr>
-          <w:p>
-            <w:pPr>
-              <w:spacing w:line="360" w:lineRule="auto"/>
-            </w:pPr>
-            <w:r>
-              <w:t>OMS</w:t>
-            </w:r>
-          </w:p>
-        </w:tc>
-        <w:tc>
-          <w:tcPr>
-            <w:tcW w:w="4502" w:type="dxa"/>
-            <w:hideMark/>
-          </w:tcPr>
-          <w:p>
-            <w:pPr>
-              <w:spacing w:line="360" w:lineRule="auto"/>
-            </w:pPr>
-            <w:r>
-              <w:t>Organização Mundial da Saúde</w:t>
-            </w:r>
-          </w:p>
-        </w:tc>
-        <w:tc>
-          <w:tcPr>
-            <w:tcW w:w="0" w:type="auto"/>
-            <w:hideMark/>
-          </w:tcPr>
-          <w:p>
-            <w:pPr>
-              <w:spacing w:line="360" w:lineRule="auto"/>
-            </w:pPr>
-            <w:r>
-              <w:t>Organização Mundial da Saúde</w:t>
-            </w:r>
-          </w:p>
-        </w:tc>
-      </w:tr>
-      <w:tr>
-        <w:tc>
-          <w:tcPr>
-            <w:tcW w:w="1271" w:type="dxa"/>
-            <w:hideMark/>
-          </w:tcPr>
-          <w:p>
-            <w:pPr>
-              <w:spacing w:line="360" w:lineRule="auto"/>
-            </w:pPr>
-            <w:r>
-              <w:t>WHO</w:t>
-            </w:r>
-          </w:p>
-        </w:tc>
-        <w:tc>
-          <w:tcPr>
-            <w:tcW w:w="4502" w:type="dxa"/>
-            <w:hideMark/>
-          </w:tcPr>
-          <w:p>
-            <w:pPr>
-              <w:spacing w:line="360" w:lineRule="auto"/>
-            </w:pPr>
-            <w:r>
-              <w:t>World Health Organization</w:t>
-            </w:r>
-          </w:p>
-        </w:tc>
-        <w:tc>
-          <w:tcPr>
-            <w:tcW w:w="0" w:type="auto"/>
-            <w:hideMark/>
-          </w:tcPr>
-          <w:p>
-            <w:pPr>
-              <w:spacing w:line="360" w:lineRule="auto"/>
-            </w:pPr>
-            <w:r>
-              <w:t>Organização Mundial da Saúde</w:t>
-            </w:r>
-          </w:p>
-        </w:tc>
-      </w:tr>
-      <w:tr>
-        <w:tc>
-          <w:tcPr>
-            <w:tcW w:w="1271" w:type="dxa"/>
-            <w:hideMark/>
-          </w:tcPr>
-          <w:p>
-            <w:pPr>
-              <w:spacing w:line="360" w:lineRule="auto"/>
-            </w:pPr>
-            <w:r>
-              <w:t>ALCOA+</w:t>
-            </w:r>
-          </w:p>
-        </w:tc>
-        <w:tc>
-          <w:tcPr>
-            <w:tcW w:w="4502" w:type="dxa"/>
-            <w:hideMark/>
-          </w:tcPr>
-          <w:p>
-            <w:pPr>
-              <w:spacing w:line="360" w:lineRule="auto"/>
-              <w:rPr>
-                <w:lang w:val="en-US"/>
-              </w:rPr>
-            </w:pPr>
-            <w:r>
-              <w:rPr>
-                <w:lang w:val="en-US"/>
-              </w:rPr>
-              <w:t>Attributable, Legible, Contemporaneous, Original, Accurate (+ Complete, Consistent, Enduring, Available)</w:t>
-            </w:r>
-          </w:p>
-        </w:tc>
-        <w:tc>
-          <w:tcPr>
-            <w:tcW w:w="0" w:type="auto"/>
-            <w:hideMark/>
-          </w:tcPr>
-          <w:p>
-            <w:pPr>
-              <w:spacing w:line="360" w:lineRule="auto"/>
-            </w:pPr>
-            <w:r>
-              <w:t>Princípios de Integridade de Dados</w:t>
-            </w:r>
-          </w:p>
-        </w:tc>
-      </w:tr>
-      <w:tr>
-        <w:tc>
-          <w:tcPr>
-            <w:tcW w:w="1271" w:type="dxa"/>
-            <w:hideMark/>
-          </w:tcPr>
-          <w:p>
-            <w:pPr>
-              <w:spacing w:line="360" w:lineRule="auto"/>
-            </w:pPr>
-            <w:r>
-              <w:t>GxP</w:t>
-            </w:r>
-          </w:p>
-        </w:tc>
-        <w:tc>
-          <w:tcPr>
-            <w:tcW w:w="4502" w:type="dxa"/>
-            <w:hideMark/>
-          </w:tcPr>
-          <w:p>
-            <w:pPr>
-              <w:spacing w:line="360" w:lineRule="auto"/>
-            </w:pPr>
-            <w:r>
-              <w:t>Good Practices</w:t>
-            </w:r>
-          </w:p>
-        </w:tc>
-        <w:tc>
-          <w:tcPr>
-            <w:tcW w:w="0" w:type="auto"/>
-            <w:hideMark/>
-          </w:tcPr>
-          <w:p>
-            <w:pPr>
-              <w:spacing w:line="360" w:lineRule="auto"/>
-            </w:pPr>
-            <w:r>
-              <w:t>Conjunto de Boas Práticas aplicáveis ao ambiente regulado</w:t>
-            </w:r>
-          </w:p>
-        </w:tc>
-      </w:tr>
-      <w:tr>
-        <w:tc>
-          <w:tcPr>
-            <w:tcW w:w="1271" w:type="dxa"/>
-            <w:hideMark/>
-          </w:tcPr>
-          <w:p>
-            <w:pPr>
-              <w:spacing w:line="360" w:lineRule="auto"/>
-            </w:pPr>
-            <w:r>
-              <w:t>ICH</w:t>
-            </w:r>
-          </w:p>
-        </w:tc>
-        <w:tc>
-          <w:tcPr>
-            <w:tcW w:w="4502" w:type="dxa"/>
-            <w:hideMark/>
-          </w:tcPr>
-          <w:p>
-            <w:pPr>
-              <w:spacing w:line="360" w:lineRule="auto"/>
-            </w:pPr>
-            <w:r>
-              <w:t>International Council for Harmonisation</w:t>
-            </w:r>
-          </w:p>
-        </w:tc>
-        <w:tc>
-          <w:tcPr>
-            <w:tcW w:w="0" w:type="auto"/>
-            <w:hideMark/>
-          </w:tcPr>
-          <w:p>
-            <w:pPr>
-              <w:spacing w:line="360" w:lineRule="auto"/>
-            </w:pPr>
-            <w:r>
-              <w:t>Conselho Internacional para Harmonização de Requisitos Técnicos</w:t>
-            </w:r>
-          </w:p>
-        </w:tc>
-      </w:tr>
-      <w:tr>
-        <w:tc>
-          <w:tcPr>
-            <w:tcW w:w="1271" w:type="dxa"/>
-            <w:hideMark/>
-          </w:tcPr>
-          <w:p>
-            <w:pPr>
-              <w:spacing w:line="360" w:lineRule="auto"/>
-            </w:pPr>
-            <w:r>
-              <w:t>QMS</w:t>
-            </w:r>
-          </w:p>
-        </w:tc>
-        <w:tc>
-          <w:tcPr>
-            <w:tcW w:w="4502" w:type="dxa"/>
-            <w:hideMark/>
-          </w:tcPr>
-          <w:p>
-            <w:pPr>
-              <w:spacing w:line="360" w:lineRule="auto"/>
-            </w:pPr>
-            <w:r>
-              <w:t>Quality Management System</w:t>
-            </w:r>
-          </w:p>
-        </w:tc>
-        <w:tc>
-          <w:tcPr>
-            <w:tcW w:w="0" w:type="auto"/>
-            <w:hideMark/>
-          </w:tcPr>
-          <w:p>
-            <w:pPr>
-              <w:spacing w:line="360" w:lineRule="auto"/>
-            </w:pPr>
-            <w:r>
-              <w:t>Sistema de Gestão da Qualidade</w:t>
-            </w:r>
-          </w:p>
-        </w:tc>
-      </w:tr>
-      <w:tr>
-        <w:tc>
-          <w:tcPr>
-            <w:tcW w:w="1271" w:type="dxa"/>
-            <w:hideMark/>
-          </w:tcPr>
-          <w:p>
-            <w:pPr>
-              <w:spacing w:line="360" w:lineRule="auto"/>
-            </w:pPr>
-            <w:r>
-              <w:t>QA</w:t>
-            </w:r>
-          </w:p>
-        </w:tc>
-        <w:tc>
-          <w:tcPr>
-            <w:tcW w:w="4502" w:type="dxa"/>
-            <w:hideMark/>
-          </w:tcPr>
-          <w:p>
-            <w:pPr>
-              <w:spacing w:line="360" w:lineRule="auto"/>
-            </w:pPr>
-            <w:r>
-              <w:t>Quality Assurance</w:t>
-            </w:r>
-          </w:p>
-        </w:tc>
-        <w:tc>
-          <w:tcPr>
-            <w:tcW w:w="0" w:type="auto"/>
-            <w:hideMark/>
-          </w:tcPr>
-          <w:p>
-            <w:pPr>
-              <w:spacing w:line="360" w:lineRule="auto"/>
-            </w:pPr>
-            <w:r>
-              <w:t>Garantia da Qualidade</w:t>
-            </w:r>
-          </w:p>
-        </w:tc>
-      </w:tr>
-      <w:tr>
-        <w:tc>
-          <w:tcPr>
-            <w:tcW w:w="1271" w:type="dxa"/>
-            <w:hideMark/>
-          </w:tcPr>
-          <w:p>
-            <w:pPr>
-              <w:spacing w:line="360" w:lineRule="auto"/>
-            </w:pPr>
-            <w:r>
-              <w:t>QC</w:t>
-            </w:r>
-          </w:p>
-        </w:tc>
-        <w:tc>
-          <w:tcPr>
-            <w:tcW w:w="4502" w:type="dxa"/>
-            <w:hideMark/>
-          </w:tcPr>
-          <w:p>
-            <w:pPr>
-              <w:spacing w:line="360" w:lineRule="auto"/>
-            </w:pPr>
-            <w:r>
-              <w:t>Quality Control</w:t>
-            </w:r>
-          </w:p>
-        </w:tc>
-        <w:tc>
-          <w:tcPr>
-            <w:tcW w:w="0" w:type="auto"/>
-            <w:hideMark/>
-          </w:tcPr>
-          <w:p>
-            <w:pPr>
-              <w:spacing w:line="360" w:lineRule="auto"/>
-            </w:pPr>
-            <w:r>
-              <w:t>Controle da Qualidade</w:t>
-            </w:r>
-          </w:p>
-        </w:tc>
-      </w:tr>
-      <w:tr>
-        <w:tc>
-          <w:tcPr>
-            <w:tcW w:w="1271" w:type="dxa"/>
-            <w:hideMark/>
-          </w:tcPr>
-          <w:p>
-            <w:pPr>
-              <w:spacing w:line="360" w:lineRule="auto"/>
-            </w:pPr>
-            <w:r>
-              <w:t>SLA</w:t>
-            </w:r>
-          </w:p>
-        </w:tc>
-        <w:tc>
-          <w:tcPr>
-            <w:tcW w:w="4502" w:type="dxa"/>
-            <w:hideMark/>
-          </w:tcPr>
-          <w:p>
-            <w:pPr>
-              <w:spacing w:line="360" w:lineRule="auto"/>
-            </w:pPr>
-            <w:r>
-              <w:t>Service Level Agreement</w:t>
-            </w:r>
-          </w:p>
-        </w:tc>
-        <w:tc>
-          <w:tcPr>
-            <w:tcW w:w="0" w:type="auto"/>
-            <w:hideMark/>
-          </w:tcPr>
-          <w:p>
-            <w:pPr>
-              <w:spacing w:line="360" w:lineRule="auto"/>
-            </w:pPr>
-            <w:r>
-              <w:t>Acordo de Nível de Serviço</w:t>
-            </w:r>
-          </w:p>
-        </w:tc>
-      </w:tr>
-      <w:tr>
-        <w:tc>
-          <w:tcPr>
-            <w:tcW w:w="1271" w:type="dxa"/>
-            <w:hideMark/>
-          </w:tcPr>
-          <w:p>
-            <w:pPr>
-              <w:spacing w:line="360" w:lineRule="auto"/>
-            </w:pPr>
-            <w:r>
-              <w:t>Audit Trail</w:t>
-            </w:r>
-          </w:p>
-        </w:tc>
-        <w:tc>
-          <w:tcPr>
-            <w:tcW w:w="4502" w:type="dxa"/>
-            <w:hideMark/>
-          </w:tcPr>
-          <w:p>
-            <w:pPr>
-              <w:spacing w:line="360" w:lineRule="auto"/>
-            </w:pPr>
-            <w:r>
-              <w:t>Audit Trail</w:t>
-            </w:r>
-          </w:p>
-        </w:tc>
-        <w:tc>
-          <w:tcPr>
-            <w:tcW w:w="0" w:type="auto"/>
-            <w:hideMark/>
-          </w:tcPr>
-          <w:p>
-            <w:pPr>
-              <w:spacing w:line="360" w:lineRule="auto"/>
-            </w:pPr>
-            <w:r>
-              <w:t>Trilha de Auditoria</w:t>
-            </w:r>
-          </w:p>
-        </w:tc>
-      </w:tr>
-      <w:tr>
-        <w:tc>
-          <w:tcPr>
-            <w:tcW w:w="1271" w:type="dxa"/>
-            <w:hideMark/>
-          </w:tcPr>
-          <w:p>
-            <w:pPr>
-              <w:spacing w:line="360" w:lineRule="auto"/>
-            </w:pPr>
-            <w:r>
-              <w:t>GAMP</w:t>
-            </w:r>
-          </w:p>
-        </w:tc>
-        <w:tc>
-          <w:tcPr>
-            <w:tcW w:w="4502" w:type="dxa"/>
-            <w:hideMark/>
-          </w:tcPr>
-          <w:p>
-            <w:pPr>
-              <w:spacing w:line="360" w:lineRule="auto"/>
-            </w:pPr>
-            <w:r>
-              <w:t>Good Automated Manufacturing Practice</w:t>
-            </w:r>
-          </w:p>
-        </w:tc>
-        <w:tc>
-          <w:tcPr>
-            <w:tcW w:w="0" w:type="auto"/>
-            <w:hideMark/>
-          </w:tcPr>
-          <w:p>
-            <w:pPr>
-              <w:spacing w:line="360" w:lineRule="auto"/>
-            </w:pPr>
-            <w:r>
-              <w:t>Guia internacional de validação de sistemas computadorizados (categorias de software)</w:t>
-            </w:r>
-          </w:p>
-        </w:tc>
-      </w:tr>
-      <w:tr>
-        <w:tc>
-          <w:tcPr>
-            <w:tcW w:w="1271" w:type="dxa"/>
-            <w:hideMark/>
-          </w:tcPr>
-          <w:p>
-            <w:pPr>
-              <w:spacing w:line="360" w:lineRule="auto"/>
-            </w:pPr>
-            <w:r>
-              <w:t>RN</w:t>
-            </w:r>
-          </w:p>
-        </w:tc>
-        <w:tc>
-          <w:tcPr>
-            <w:tcW w:w="4502" w:type="dxa"/>
-            <w:hideMark/>
-          </w:tcPr>
-          <w:p>
-            <w:pPr>
-              <w:spacing w:line="360" w:lineRule="auto"/>
-            </w:pPr>
-            <w:r>
-              <w:t>Regra de Negócio</w:t>
-            </w:r>
-          </w:p>
-        </w:tc>
-        <w:tc>
-          <w:tcPr>
-            <w:tcW w:w="0" w:type="auto"/>
-            <w:hideMark/>
-          </w:tcPr>
-          <w:p>
-            <w:pPr>
-              <w:spacing w:line="360" w:lineRule="auto"/>
-            </w:pPr>
-            <w:r>
-              <w:t>Regra que o sistema deve cumprir, identificada como RN-PRI-nnn</w:t>
-            </w:r>
-          </w:p>
-        </w:tc>
-      </w:tr>
-      <w:tr>
-        <w:tc>
-          <w:tcPr>
-            <w:tcW w:w="1271" w:type="dxa"/>
-            <w:hideMark/>
-          </w:tcPr>
-          <w:p>
-            <w:pPr>
-              <w:spacing w:line="360" w:lineRule="auto"/>
-            </w:pPr>
-            <w:r>
-              <w:t>RF / RNF</w:t>
-            </w:r>
-          </w:p>
-        </w:tc>
-        <w:tc>
-          <w:tcPr>
-            <w:tcW w:w="4502" w:type="dxa"/>
-            <w:hideMark/>
-          </w:tcPr>
-          <w:p>
-            <w:pPr>
-              <w:spacing w:line="360" w:lineRule="auto"/>
-            </w:pPr>
-            <w:r>
-              <w:t>Requisito Funcional / Não Funcional</w:t>
-            </w:r>
-          </w:p>
-        </w:tc>
-        <w:tc>
-          <w:tcPr>
-            <w:tcW w:w="0" w:type="auto"/>
-            <w:hideMark/>
-          </w:tcPr>
-          <w:p>
-            <w:pPr>
-              <w:spacing w:line="360" w:lineRule="auto"/>
-            </w:pPr>
-            <w:r>
-              <w:t>O que a nova versão deve fazer / como deve fazer (segurança, auditoria, desempenho)</w:t>
-            </w:r>
-          </w:p>
-        </w:tc>
-      </w:tr>
-      <w:tr>
-        <w:tc>
-          <w:tcPr>
-            <w:tcW w:w="1271" w:type="dxa"/>
-            <w:hideMark/>
-          </w:tcPr>
-          <w:p>
-            <w:pPr>
-              <w:spacing w:line="360" w:lineRule="auto"/>
-            </w:pPr>
-            <w:r>
-              <w:t>CT</w:t>
-            </w:r>
-          </w:p>
-        </w:tc>
-        <w:tc>
-          <w:tcPr>
-            <w:tcW w:w="4502" w:type="dxa"/>
-            <w:hideMark/>
-          </w:tcPr>
-          <w:p>
-            <w:pPr>
-              <w:spacing w:line="360" w:lineRule="auto"/>
-            </w:pPr>
-            <w:r>
-              <w:t>Caso de Teste</w:t>
-            </w:r>
-          </w:p>
-        </w:tc>
-        <w:tc>
-          <w:tcPr>
-            <w:tcW w:w="0" w:type="auto"/>
-            <w:hideMark/>
-          </w:tcPr>
-          <w:p>
-            <w:pPr>
-              <w:spacing w:line="360" w:lineRule="auto"/>
-            </w:pPr>
-            <w:r>
-              <w:t>Teste com passos e resultado esperado, identificado como CT-PRI-nnn</w:t>
-            </w:r>
-          </w:p>
-        </w:tc>
-      </w:tr>
-      <w:tr>
-        <w:tc>
-          <w:tcPr>
-            <w:tcW w:w="1271" w:type="dxa"/>
-            <w:hideMark/>
-          </w:tcPr>
-          <w:p>
-            <w:pPr>
-              <w:spacing w:line="360" w:lineRule="auto"/>
-            </w:pPr>
-            <w:r>
-              <w:t>DV</w:t>
-            </w:r>
-          </w:p>
-        </w:tc>
-        <w:tc>
-          <w:tcPr>
-            <w:tcW w:w="4502" w:type="dxa"/>
-            <w:hideMark/>
-          </w:tcPr>
-          <w:p>
-            <w:pPr>
-              <w:spacing w:line="360" w:lineRule="auto"/>
-            </w:pPr>
-            <w:r>
-              <w:t>Desvio</w:t>
-            </w:r>
-          </w:p>
-        </w:tc>
-        <w:tc>
-          <w:tcPr>
-            <w:tcW w:w="0" w:type="auto"/>
-            <w:hideMark/>
-          </w:tcPr>
-          <w:p>
-            <w:pPr>
-              <w:spacing w:line="360" w:lineRule="auto"/>
-            </w:pPr>
-            <w:r>
-              <w:t>Diferença entre o resultado esperado e o obtido nos testes, identificado como DV-PRI-nnn</w:t>
-            </w:r>
-          </w:p>
-        </w:tc>
-      </w:tr>
-      <w:tr>
-        <w:tc>
-          <w:tcPr>
-            <w:tcW w:w="1271" w:type="dxa"/>
-            <w:hideMark/>
-          </w:tcPr>
-          <w:p>
-            <w:pPr>
-              <w:spacing w:line="360" w:lineRule="auto"/>
-            </w:pPr>
-            <w:r>
-              <w:t>SEG</w:t>
-            </w:r>
-          </w:p>
-        </w:tc>
-        <w:tc>
-          <w:tcPr>
-            <w:tcW w:w="4502" w:type="dxa"/>
-            <w:hideMark/>
-          </w:tcPr>
-          <w:p>
-            <w:pPr>
-              <w:spacing w:line="360" w:lineRule="auto"/>
-            </w:pPr>
-            <w:r>
-              <w:t>Achado de Segurança</w:t>
-            </w:r>
-          </w:p>
-        </w:tc>
-        <w:tc>
-          <w:tcPr>
-            <w:tcW w:w="0" w:type="auto"/>
-            <w:hideMark/>
-          </w:tcPr>
-          <w:p>
-            <w:pPr>
-              <w:spacing w:line="360" w:lineRule="auto"/>
-            </w:pPr>
-            <w:r>
-              <w:t>Fragilidade de segurança encontrada no código, identificada como SEG-PRI-nn</w:t>
-            </w:r>
-          </w:p>
-        </w:tc>
-      </w:tr>
-      <w:tr>
-        <w:tc>
-          <w:tcPr>
-            <w:tcW w:w="1271" w:type="dxa"/>
-            <w:hideMark/>
-          </w:tcPr>
-          <w:p>
-            <w:pPr>
-              <w:spacing w:line="360" w:lineRule="auto"/>
-            </w:pPr>
-            <w:r>
-              <w:t>SSO</w:t>
-            </w:r>
-          </w:p>
-        </w:tc>
-        <w:tc>
-          <w:tcPr>
-            <w:tcW w:w="4502" w:type="dxa"/>
-            <w:hideMark/>
-          </w:tcPr>
-          <w:p>
-            <w:pPr>
-              <w:spacing w:line="360" w:lineRule="auto"/>
-            </w:pPr>
-            <w:r>
-              <w:t>Single Sign-On</w:t>
-            </w:r>
-          </w:p>
-        </w:tc>
-        <w:tc>
-          <w:tcPr>
-            <w:tcW w:w="0" w:type="auto"/>
-            <w:hideMark/>
-          </w:tcPr>
-          <w:p>
-            <w:pPr>
-              <w:spacing w:line="360" w:lineRule="auto"/>
-            </w:pPr>
-            <w:r>
-              <w:t>Login único: um acesso vale para todos os módulos</w:t>
-            </w:r>
-          </w:p>
-        </w:tc>
-      </w:tr>
-      <w:tr>
-        <w:tc>
-          <w:tcPr>
-            <w:tcW w:w="1271" w:type="dxa"/>
-            <w:hideMark/>
-          </w:tcPr>
-          <w:p>
-            <w:pPr>
-              <w:spacing w:line="360" w:lineRule="auto"/>
-            </w:pPr>
-            <w:r>
-              <w:t>DBA</w:t>
-            </w:r>
-          </w:p>
-        </w:tc>
-        <w:tc>
-          <w:tcPr>
-            <w:tcW w:w="4502" w:type="dxa"/>
-            <w:hideMark/>
-          </w:tcPr>
-          <w:p>
-            <w:pPr>
-              <w:spacing w:line="360" w:lineRule="auto"/>
-            </w:pPr>
-            <w:r>
-              <w:t>Database Administrator</w:t>
-            </w:r>
-          </w:p>
-        </w:tc>
-        <w:tc>
-          <w:tcPr>
-            <w:tcW w:w="0" w:type="auto"/>
-            <w:hideMark/>
-          </w:tcPr>
-          <w:p>
-            <w:pPr>
-              <w:spacing w:line="360" w:lineRule="auto"/>
-            </w:pPr>
-            <w:r>
-              <w:t>Administrador do banco de dados</w:t>
-            </w:r>
-          </w:p>
-        </w:tc>
-      </w:tr>
-      <w:tr>
-        <w:tc>
-          <w:tcPr>
-            <w:tcW w:w="1271" w:type="dxa"/>
-            <w:hideMark/>
-          </w:tcPr>
-          <w:p>
-            <w:pPr>
-              <w:spacing w:line="360" w:lineRule="auto"/>
-            </w:pPr>
-            <w:r>
-              <w:t>LGPD</w:t>
-            </w:r>
-          </w:p>
-        </w:tc>
-        <w:tc>
-          <w:tcPr>
-            <w:tcW w:w="4502" w:type="dxa"/>
-            <w:hideMark/>
-          </w:tcPr>
-          <w:p>
-            <w:pPr>
-              <w:spacing w:line="360" w:lineRule="auto"/>
-            </w:pPr>
-            <w:r>
-              <w:t>Lei Geral de Proteção de Dados</w:t>
-            </w:r>
-          </w:p>
-        </w:tc>
-        <w:tc>
-          <w:tcPr>
-            <w:tcW w:w="0" w:type="auto"/>
-            <w:hideMark/>
-          </w:tcPr>
-          <w:p>
-            <w:pPr>
-              <w:spacing w:line="360" w:lineRule="auto"/>
-            </w:pPr>
-            <w:r>
-              <w:t>Lei nº 13.709/2018, sobre dados pessoais</w:t>
-            </w:r>
-          </w:p>
-        </w:tc>
-      </w:tr>
-    </w:tbl>
-    <w:p/>
-    <w:p>
-      <w:pPr>
-        <w:widowControl/>
-        <w:overflowPunct/>
-        <w:spacing w:before="0" w:after="0"/>
-        <w:jc w:val="left"/>
-        <w:rPr>
-          <w:color w:val="000000" w:themeColor="text1"/>
-        </w:rPr>
-      </w:pPr>
-    </w:p>
-    <w:p>
-      <w:pPr>
-        <w:spacing w:after="0" w:line="360" w:lineRule="auto"/>
+        <w:spacing w:after="0" w:line="252" w:lineRule="auto"/>
         <w:rPr>
           <w:szCs w:val="20"/>
         </w:rPr>
@@ -3441,7 +50,7 @@
         <w:rPr>
           <w:szCs w:val="20"/>
         </w:rPr>
-        <w:t xml:space="preserve"> Resumo para a diretoria, fechado em 14/10/2026 com o fim dos testes por risco (sete rodadas, 07 a 13/10/2026). O detalhe está no Relatório de Testes, na Conformidade Regulatória e nos Defeitos para Correção do módulo Estoque.</w:t>
+        <w:t xml:space="preserve"> Resumo para a diretoria, atualizado em 22/10/2026 (nove rodadas de testes, 07 a 22/10). O detalhe está no Relatório de Testes, na Conformidade Regulatória e nos Defeitos para Correção.</w:t>
       </w:r>
     </w:p>
     <w:p>
@@ -3459,7 +68,7 @@
           <w:right w:val="single" w:sz="4" w:space="4" w:color="000000"/>
         </w:pBdr>
         <w:shd w:val="clear" w:color="auto" w:fill="F2F2F2"/>
-        <w:spacing w:before="0" w:after="0"/>
+        <w:spacing w:before="200" w:after="0"/>
         <w:ind w:left="0" w:right="170" w:firstLine="0"/>
         <w:outlineLvl w:val="0"/>
         <w:rPr>
@@ -3478,12 +87,12 @@
     <w:p>
       <w:pPr>
         <w:keepNext/>
-        <w:spacing w:after="0" w:line="360" w:lineRule="auto"/>
+        <w:spacing w:after="0" w:line="252" w:lineRule="auto"/>
       </w:pPr>
     </w:p>
     <w:p>
       <w:pPr>
-        <w:spacing w:after="0" w:line="360" w:lineRule="auto"/>
+        <w:spacing w:after="0" w:line="252" w:lineRule="auto"/>
         <w:rPr>
           <w:szCs w:val="20"/>
         </w:rPr>
@@ -3506,12 +115,12 @@
         <w:rPr>
           <w:szCs w:val="20"/>
         </w:rPr>
-        <w:t xml:space="preserve">. O lote passa pela quarentena e pelo laudo do Controle da Qualidade, e isso funciona. Mas o recebimento aceita fornecedor reprovado e lote vencido, a entrada de produto acabado aceita lote inventado, e a liberação do lote é feita por qualquer usuário, sem a Pessoa Delegada. Os testes acrescentaram três falhas graves que o código não previa: a remessa não pode ser finalizada, a amostra de retenção gravada não é encontrada pela consulta nem pela saída, e a Movimentação de Quarentena aceita um destino incompleto e perde o saldo do lote.</w:t>
+        <w:t xml:space="preserve">. O lote passa pela quarentena e pelo laudo do Controle da Qualidade, e isso funciona. Mas o recebimento aceita fornecedor reprovado e lote vencido, a entrada de produto acabado aceita lote inventado, e a liberação do lote é feita por qualquer usuário, sem a Pessoa Delegada. Os testes acrescentaram falhas graves que o código não previa: a remessa (também a de kit) não pode ser finalizada, a amostra de retenção não é encontrada, a Movimentação de Quarentena perde o saldo do lote, a Central de Pesagem dá erro ao abrir o volume e o atendimento não usa primeiro o lote que vence primeiro.</w:t>
       </w:r>
     </w:p>
     <w:p>
       <w:pPr>
-        <w:spacing w:after="0" w:line="360" w:lineRule="auto"/>
+        <w:spacing w:after="0" w:line="252" w:lineRule="auto"/>
         <w:rPr>
           <w:szCs w:val="20"/>
         </w:rPr>
@@ -3560,7 +169,7 @@
           <w:right w:val="single" w:sz="4" w:space="4" w:color="000000"/>
         </w:pBdr>
         <w:shd w:val="clear" w:color="auto" w:fill="F2F2F2"/>
-        <w:spacing w:before="0" w:after="0"/>
+        <w:spacing w:before="200" w:after="0"/>
         <w:ind w:left="0" w:right="170" w:firstLine="0"/>
         <w:outlineLvl w:val="0"/>
         <w:rPr>
@@ -3579,7 +188,7 @@
     <w:p>
       <w:pPr>
         <w:keepNext/>
-        <w:spacing w:after="0" w:line="360" w:lineRule="auto"/>
+        <w:spacing w:after="0" w:line="252" w:lineRule="auto"/>
       </w:pPr>
     </w:p>
     <w:tbl>
@@ -3590,8 +199,8 @@
         <w:tblLook w:val="04A0" w:firstRow="1" w:lastRow="0" w:firstColumn="1" w:lastColumn="0" w:noHBand="0" w:noVBand="1"/>
       </w:tblPr>
       <w:tblGrid>
-        <w:gridCol w:w="2224"/>
-        <w:gridCol w:w="7407"/>
+        <w:gridCol w:w="2064"/>
+        <w:gridCol w:w="7567"/>
       </w:tblGrid>
       <w:tr>
         <w:trPr>
@@ -3600,7 +209,7 @@
         </w:trPr>
         <w:tc>
           <w:tcPr>
-            <w:tcW w:w="2224" w:type="dxa"/>
+            <w:tcW w:w="2064" w:type="dxa"/>
             <w:shd w:val="clear" w:color="auto" w:fill="D9D9D9" w:themeFill="background1" w:themeFillShade="D9"/>
           </w:tcPr>
           <w:p>
@@ -3628,7 +237,7 @@
         </w:tc>
         <w:tc>
           <w:tcPr>
-            <w:tcW w:w="7407" w:type="dxa"/>
+            <w:tcW w:w="7567" w:type="dxa"/>
             <w:shd w:val="clear" w:color="auto" w:fill="D9D9D9" w:themeFill="background1" w:themeFillShade="D9"/>
           </w:tcPr>
           <w:p>
@@ -3661,7 +270,58 @@
         </w:trPr>
         <w:tc>
           <w:tcPr>
-            <w:tcW w:w="2224" w:type="dxa"/>
+            <w:tcW w:w="2064" w:type="dxa"/>
+          </w:tcPr>
+          <w:p>
+            <w:pPr>
+              <w:widowControl/>
+              <w:spacing w:after="0" w:line="276" w:lineRule="auto"/>
+              <w:jc w:val="left"/>
+              <w:rPr>
+                <w:sz w:val="18"/>
+                <w:szCs w:val="18"/>
+              </w:rPr>
+            </w:pPr>
+            <w:r>
+              <w:rPr>
+                <w:sz w:val="18"/>
+                <w:szCs w:val="20"/>
+              </w:rPr>
+              <w:t xml:space="preserve">Análise do código</w:t>
+            </w:r>
+          </w:p>
+        </w:tc>
+        <w:tc>
+          <w:tcPr>
+            <w:tcW w:w="7567" w:type="dxa"/>
+          </w:tcPr>
+          <w:p>
+            <w:pPr>
+              <w:widowControl/>
+              <w:spacing w:after="0" w:line="276" w:lineRule="auto"/>
+              <w:jc w:val="left"/>
+              <w:rPr>
+                <w:sz w:val="18"/>
+                <w:szCs w:val="18"/>
+              </w:rPr>
+            </w:pPr>
+            <w:r>
+              <w:rPr>
+                <w:sz w:val="18"/>
+                <w:szCs w:val="20"/>
+              </w:rPr>
+              <w:t xml:space="preserve">Dez fluxos, 283 regras de negócio, inventário de 98 telas, modelo de dados, 24 riscos (18 de prioridade alta), 12 achados restritos à TI (documento confidencial) e "O ideal" (o Estoque como dono da situação única do lote)</w:t>
+            </w:r>
+          </w:p>
+        </w:tc>
+      </w:tr>
+      <w:tr>
+        <w:trPr>
+          <w:cantSplit/>
+        </w:trPr>
+        <w:tc>
+          <w:tcPr>
+            <w:tcW w:w="2064" w:type="dxa"/>
           </w:tcPr>
           <w:p>
             <w:pPr>
@@ -3684,7 +344,7 @@
         </w:tc>
         <w:tc>
           <w:tcPr>
-            <w:tcW w:w="7407" w:type="dxa"/>
+            <w:tcW w:w="7567" w:type="dxa"/>
           </w:tcPr>
           <w:p>
             <w:pPr>
@@ -3710,14 +370,14 @@
                 <w:bCs/>
                 <w:szCs w:val="20"/>
               </w:rPr>
-              <w:t xml:space="preserve">78 com resultado</w:t>
+              <w:t xml:space="preserve">134 com resultado</w:t>
             </w:r>
             <w:r>
               <w:rPr>
                 <w:sz w:val="18"/>
                 <w:szCs w:val="20"/>
               </w:rPr>
-              <w:t xml:space="preserve"> em sete rodadas, cobrindo 37 dos 46 de prioridade alta. Os 9 de prioridade alta restantes estão bloqueados por causas fora do teste (DBA, Ordem de Produção, recebimentos pendentes e defeitos do próprio sistema). Os 75 de prioridade média e baixa ficam para a nova versão</w:t>
+              <w:t xml:space="preserve"> em nove rodadas, cobrindo 42 dos 46 de prioridade alta. Os 4 de prioridade alta restantes estão bloqueados por causas fora do teste (Ordem de Produção, reanálise, remessa e amostra de retenção). Os 24 de média e baixa sem resultado ficam para a nova versão</w:t>
             </w:r>
           </w:p>
         </w:tc>
@@ -3728,7 +388,7 @@
         </w:trPr>
         <w:tc>
           <w:tcPr>
-            <w:tcW w:w="2224" w:type="dxa"/>
+            <w:tcW w:w="2064" w:type="dxa"/>
           </w:tcPr>
           <w:p>
             <w:pPr>
@@ -3751,7 +411,7 @@
         </w:tc>
         <w:tc>
           <w:tcPr>
-            <w:tcW w:w="7407" w:type="dxa"/>
+            <w:tcW w:w="7567" w:type="dxa"/>
           </w:tcPr>
           <w:p>
             <w:pPr>
@@ -3770,65 +430,14 @@
                 <w:bCs/>
                 <w:szCs w:val="20"/>
               </w:rPr>
-              <w:t xml:space="preserve">47</w:t>
+              <w:t xml:space="preserve">67</w:t>
             </w:r>
             <w:r>
               <w:rPr>
                 <w:sz w:val="18"/>
                 <w:szCs w:val="20"/>
               </w:rPr>
-              <w:t xml:space="preserve">: 39 no documento de defeitos (11 de gravidade alta, 20 média, 8 baixa) e 8 de acesso, no documento confidencial</w:t>
-            </w:r>
-          </w:p>
-        </w:tc>
-      </w:tr>
-      <w:tr>
-        <w:trPr>
-          <w:cantSplit/>
-        </w:trPr>
-        <w:tc>
-          <w:tcPr>
-            <w:tcW w:w="2224" w:type="dxa"/>
-          </w:tcPr>
-          <w:p>
-            <w:pPr>
-              <w:widowControl/>
-              <w:spacing w:after="0" w:line="276" w:lineRule="auto"/>
-              <w:jc w:val="left"/>
-              <w:rPr>
-                <w:sz w:val="18"/>
-                <w:szCs w:val="18"/>
-              </w:rPr>
-            </w:pPr>
-            <w:r>
-              <w:rPr>
-                <w:sz w:val="18"/>
-                <w:szCs w:val="20"/>
-              </w:rPr>
-              <w:t xml:space="preserve">Situação das 98 telas</w:t>
-            </w:r>
-          </w:p>
-        </w:tc>
-        <w:tc>
-          <w:tcPr>
-            <w:tcW w:w="7407" w:type="dxa"/>
-          </w:tcPr>
-          <w:p>
-            <w:pPr>
-              <w:widowControl/>
-              <w:spacing w:after="0" w:line="276" w:lineRule="auto"/>
-              <w:jc w:val="left"/>
-              <w:rPr>
-                <w:sz w:val="18"/>
-                <w:szCs w:val="18"/>
-              </w:rPr>
-            </w:pPr>
-            <w:r>
-              <w:rPr>
-                <w:sz w:val="18"/>
-                <w:szCs w:val="20"/>
-              </w:rPr>
-              <w:t xml:space="preserve">10 funcionam; 17 funcionam com falhas; 9 com falha grave; 5 bloqueadas no teste; 1 protótipo; 56 não testadas</w:t>
+              <w:t xml:space="preserve">: 59 no documento de defeitos (14 de gravidade alta, 31 média, 14 baixa) e 8 de acesso, no documento confidencial</w:t>
             </w:r>
           </w:p>
         </w:tc>
@@ -3836,7 +445,7 @@
     </w:tbl>
     <w:p>
       <w:pPr>
-        <w:spacing w:after="0" w:line="360" w:lineRule="auto"/>
+        <w:spacing w:after="0" w:line="252" w:lineRule="auto"/>
       </w:pPr>
     </w:p>
     <w:p>
@@ -3854,7 +463,7 @@
           <w:right w:val="single" w:sz="4" w:space="4" w:color="000000"/>
         </w:pBdr>
         <w:shd w:val="clear" w:color="auto" w:fill="F2F2F2"/>
-        <w:spacing w:before="0" w:after="0"/>
+        <w:spacing w:before="200" w:after="0"/>
         <w:ind w:left="0" w:right="170" w:firstLine="0"/>
         <w:outlineLvl w:val="0"/>
         <w:rPr>
@@ -3873,7 +482,7 @@
     <w:p>
       <w:pPr>
         <w:keepNext/>
-        <w:spacing w:after="0" w:line="360" w:lineRule="auto"/>
+        <w:spacing w:after="0" w:line="252" w:lineRule="auto"/>
       </w:pPr>
     </w:p>
     <w:tbl>
@@ -3884,8 +493,8 @@
         <w:tblLook w:val="04A0" w:firstRow="1" w:lastRow="0" w:firstColumn="1" w:lastColumn="0" w:noHBand="0" w:noVBand="1"/>
       </w:tblPr>
       <w:tblGrid>
-        <w:gridCol w:w="5262"/>
-        <w:gridCol w:w="4369"/>
+        <w:gridCol w:w="5271"/>
+        <w:gridCol w:w="4360"/>
       </w:tblGrid>
       <w:tr>
         <w:trPr>
@@ -3894,7 +503,7 @@
         </w:trPr>
         <w:tc>
           <w:tcPr>
-            <w:tcW w:w="5262" w:type="dxa"/>
+            <w:tcW w:w="5271" w:type="dxa"/>
             <w:shd w:val="clear" w:color="auto" w:fill="D9D9D9" w:themeFill="background1" w:themeFillShade="D9"/>
           </w:tcPr>
           <w:p>
@@ -3922,7 +531,7 @@
         </w:tc>
         <w:tc>
           <w:tcPr>
-            <w:tcW w:w="4369" w:type="dxa"/>
+            <w:tcW w:w="4360" w:type="dxa"/>
             <w:shd w:val="clear" w:color="auto" w:fill="D9D9D9" w:themeFill="background1" w:themeFillShade="D9"/>
           </w:tcPr>
           <w:p>
@@ -3955,7 +564,7 @@
         </w:trPr>
         <w:tc>
           <w:tcPr>
-            <w:tcW w:w="5262" w:type="dxa"/>
+            <w:tcW w:w="5271" w:type="dxa"/>
           </w:tcPr>
           <w:p>
             <w:pPr>
@@ -3978,7 +587,7 @@
         </w:tc>
         <w:tc>
           <w:tcPr>
-            <w:tcW w:w="4369" w:type="dxa"/>
+            <w:tcW w:w="4360" w:type="dxa"/>
           </w:tcPr>
           <w:p>
             <w:pPr>
@@ -4006,7 +615,7 @@
         </w:trPr>
         <w:tc>
           <w:tcPr>
-            <w:tcW w:w="5262" w:type="dxa"/>
+            <w:tcW w:w="5271" w:type="dxa"/>
           </w:tcPr>
           <w:p>
             <w:pPr>
@@ -4029,7 +638,7 @@
         </w:tc>
         <w:tc>
           <w:tcPr>
-            <w:tcW w:w="4369" w:type="dxa"/>
+            <w:tcW w:w="4360" w:type="dxa"/>
           </w:tcPr>
           <w:p>
             <w:pPr>
@@ -4057,7 +666,7 @@
         </w:trPr>
         <w:tc>
           <w:tcPr>
-            <w:tcW w:w="5262" w:type="dxa"/>
+            <w:tcW w:w="5271" w:type="dxa"/>
           </w:tcPr>
           <w:p>
             <w:pPr>
@@ -4074,13 +683,13 @@
                 <w:sz w:val="18"/>
                 <w:szCs w:val="20"/>
               </w:rPr>
-              <w:t xml:space="preserve">Lote vencido é aceito no recebimento e na entrada de produto acabado</w:t>
+              <w:t xml:space="preserve">Lote vencido é aceito na entrada; a entrada de produto acabado aceita lote inventado, sem ordem de produção</w:t>
             </w:r>
           </w:p>
         </w:tc>
         <w:tc>
           <w:tcPr>
-            <w:tcW w:w="4369" w:type="dxa"/>
+            <w:tcW w:w="4360" w:type="dxa"/>
           </w:tcPr>
           <w:p>
             <w:pPr>
@@ -4097,7 +706,7 @@
                 <w:sz w:val="18"/>
                 <w:szCs w:val="20"/>
               </w:rPr>
-              <w:t xml:space="preserve">Material fora da validade no estoque (art. 189)</w:t>
+              <w:t xml:space="preserve">Material fora da validade e lote sem origem rastreável (arts. 124, 164 e 189)</w:t>
             </w:r>
           </w:p>
         </w:tc>
@@ -4108,58 +717,7 @@
         </w:trPr>
         <w:tc>
           <w:tcPr>
-            <w:tcW w:w="5262" w:type="dxa"/>
-          </w:tcPr>
-          <w:p>
-            <w:pPr>
-              <w:widowControl/>
-              <w:spacing w:after="0" w:line="276" w:lineRule="auto"/>
-              <w:jc w:val="left"/>
-              <w:rPr>
-                <w:sz w:val="18"/>
-                <w:szCs w:val="18"/>
-              </w:rPr>
-            </w:pPr>
-            <w:r>
-              <w:rPr>
-                <w:sz w:val="18"/>
-                <w:szCs w:val="20"/>
-              </w:rPr>
-              <w:t xml:space="preserve">A entrada de produto acabado aceita lote inventado, sem ordem de produção</w:t>
-            </w:r>
-          </w:p>
-        </w:tc>
-        <w:tc>
-          <w:tcPr>
-            <w:tcW w:w="4369" w:type="dxa"/>
-          </w:tcPr>
-          <w:p>
-            <w:pPr>
-              <w:widowControl/>
-              <w:spacing w:after="0" w:line="276" w:lineRule="auto"/>
-              <w:jc w:val="left"/>
-              <w:rPr>
-                <w:sz w:val="18"/>
-                <w:szCs w:val="18"/>
-              </w:rPr>
-            </w:pPr>
-            <w:r>
-              <w:rPr>
-                <w:sz w:val="18"/>
-                <w:szCs w:val="20"/>
-              </w:rPr>
-              <w:t xml:space="preserve">Lote sem origem rastreável (arts. 124 e 164)</w:t>
-            </w:r>
-          </w:p>
-        </w:tc>
-      </w:tr>
-      <w:tr>
-        <w:trPr>
-          <w:cantSplit/>
-        </w:trPr>
-        <w:tc>
-          <w:tcPr>
-            <w:tcW w:w="5262" w:type="dxa"/>
+            <w:tcW w:w="5271" w:type="dxa"/>
           </w:tcPr>
           <w:p>
             <w:pPr>
@@ -4182,7 +740,7 @@
         </w:tc>
         <w:tc>
           <w:tcPr>
-            <w:tcW w:w="4369" w:type="dxa"/>
+            <w:tcW w:w="4360" w:type="dxa"/>
           </w:tcPr>
           <w:p>
             <w:pPr>
@@ -4210,7 +768,7 @@
         </w:trPr>
         <w:tc>
           <w:tcPr>
-            <w:tcW w:w="5262" w:type="dxa"/>
+            <w:tcW w:w="5271" w:type="dxa"/>
           </w:tcPr>
           <w:p>
             <w:pPr>
@@ -4233,7 +791,7 @@
         </w:tc>
         <w:tc>
           <w:tcPr>
-            <w:tcW w:w="4369" w:type="dxa"/>
+            <w:tcW w:w="4360" w:type="dxa"/>
           </w:tcPr>
           <w:p>
             <w:pPr>
@@ -4261,7 +819,7 @@
         </w:trPr>
         <w:tc>
           <w:tcPr>
-            <w:tcW w:w="5262" w:type="dxa"/>
+            <w:tcW w:w="5271" w:type="dxa"/>
           </w:tcPr>
           <w:p>
             <w:pPr>
@@ -4284,7 +842,7 @@
         </w:tc>
         <w:tc>
           <w:tcPr>
-            <w:tcW w:w="4369" w:type="dxa"/>
+            <w:tcW w:w="4360" w:type="dxa"/>
           </w:tcPr>
           <w:p>
             <w:pPr>
@@ -4312,7 +870,7 @@
         </w:trPr>
         <w:tc>
           <w:tcPr>
-            <w:tcW w:w="5262" w:type="dxa"/>
+            <w:tcW w:w="5271" w:type="dxa"/>
           </w:tcPr>
           <w:p>
             <w:pPr>
@@ -4335,7 +893,7 @@
         </w:tc>
         <w:tc>
           <w:tcPr>
-            <w:tcW w:w="4369" w:type="dxa"/>
+            <w:tcW w:w="4360" w:type="dxa"/>
           </w:tcPr>
           <w:p>
             <w:pPr>
@@ -4363,7 +921,7 @@
         </w:trPr>
         <w:tc>
           <w:tcPr>
-            <w:tcW w:w="5262" w:type="dxa"/>
+            <w:tcW w:w="5271" w:type="dxa"/>
           </w:tcPr>
           <w:p>
             <w:pPr>
@@ -4386,7 +944,7 @@
         </w:tc>
         <w:tc>
           <w:tcPr>
-            <w:tcW w:w="4369" w:type="dxa"/>
+            <w:tcW w:w="4360" w:type="dxa"/>
           </w:tcPr>
           <w:p>
             <w:pPr>
@@ -4414,7 +972,58 @@
         </w:trPr>
         <w:tc>
           <w:tcPr>
-            <w:tcW w:w="5262" w:type="dxa"/>
+            <w:tcW w:w="5271" w:type="dxa"/>
+          </w:tcPr>
+          <w:p>
+            <w:pPr>
+              <w:widowControl/>
+              <w:spacing w:after="0" w:line="276" w:lineRule="auto"/>
+              <w:jc w:val="left"/>
+              <w:rPr>
+                <w:sz w:val="18"/>
+                <w:szCs w:val="18"/>
+              </w:rPr>
+            </w:pPr>
+            <w:r>
+              <w:rPr>
+                <w:sz w:val="18"/>
+                <w:szCs w:val="20"/>
+              </w:rPr>
+              <w:t xml:space="preserve">O atendimento à produção não ordena os lotes por validade e aceita o que vence depois; no inventário, a mesma pessoa conta e apura, e cancelar não pede justificativa</w:t>
+            </w:r>
+          </w:p>
+        </w:tc>
+        <w:tc>
+          <w:tcPr>
+            <w:tcW w:w="4360" w:type="dxa"/>
+          </w:tcPr>
+          <w:p>
+            <w:pPr>
+              <w:widowControl/>
+              <w:spacing w:after="0" w:line="276" w:lineRule="auto"/>
+              <w:jc w:val="left"/>
+              <w:rPr>
+                <w:sz w:val="18"/>
+                <w:szCs w:val="18"/>
+              </w:rPr>
+            </w:pPr>
+            <w:r>
+              <w:rPr>
+                <w:sz w:val="18"/>
+                <w:szCs w:val="20"/>
+              </w:rPr>
+              <w:t xml:space="preserve">Lote de validade curta passado adiante; ajuste de saldo sem separação de funções nem rastro (arts. 124 e 189)</w:t>
+            </w:r>
+          </w:p>
+        </w:tc>
+      </w:tr>
+      <w:tr>
+        <w:trPr>
+          <w:cantSplit/>
+        </w:trPr>
+        <w:tc>
+          <w:tcPr>
+            <w:tcW w:w="5271" w:type="dxa"/>
           </w:tcPr>
           <w:p>
             <w:pPr>
@@ -4437,7 +1046,7 @@
         </w:tc>
         <w:tc>
           <w:tcPr>
-            <w:tcW w:w="4369" w:type="dxa"/>
+            <w:tcW w:w="4360" w:type="dxa"/>
           </w:tcPr>
           <w:p>
             <w:pPr>
@@ -4462,13 +1071,13 @@
     </w:tbl>
     <w:p>
       <w:pPr>
-        <w:spacing w:after="0" w:line="360" w:lineRule="auto"/>
+        <w:spacing w:after="0" w:line="252" w:lineRule="auto"/>
       </w:pPr>
     </w:p>
     <w:p>
       <w:pPr>
         <w:keepNext/>
-        <w:spacing w:before="120" w:after="0" w:line="360" w:lineRule="auto"/>
+        <w:spacing w:before="120" w:after="0" w:line="252" w:lineRule="auto"/>
         <w:rPr>
           <w:b/>
           <w:bCs/>
@@ -4488,7 +1097,7 @@
     </w:p>
     <w:p>
       <w:pPr>
-        <w:spacing w:after="0" w:line="360" w:lineRule="auto"/>
+        <w:spacing w:after="0" w:line="252" w:lineRule="auto"/>
         <w:rPr>
           <w:szCs w:val="20"/>
         </w:rPr>
@@ -4497,7 +1106,7 @@
         <w:rPr>
           <w:szCs w:val="20"/>
         </w:rPr>
-        <w:t xml:space="preserve">Quem cadastra o recebimento não o autoriza; as entradas de material criam a quarentena e abrem a análise no CQ; o lote reprovado só vai para o refugo; o lote em quarentena só vai a local de quarentena; quarentena e reprovado ficam fora do atendimento e da remessa; a movimentação recusa saldo insuficiente, destino com outro item e peso acima da capacidade; o saldo já é separado por situação, base para a situação única do lote.</w:t>
+        <w:t xml:space="preserve">Quem cadastra o recebimento não o autoriza; as entradas criam a quarentena e abrem a análise no CQ; reprovado e quarentena ficam fora do atendimento e da remessa; a movimentação recusa saldo insuficiente; o inventário rotativo ajusta o saldo.</w:t>
       </w:r>
     </w:p>
     <w:p>
@@ -4515,7 +1124,7 @@
           <w:right w:val="single" w:sz="4" w:space="4" w:color="000000"/>
         </w:pBdr>
         <w:shd w:val="clear" w:color="auto" w:fill="F2F2F2"/>
-        <w:spacing w:before="0" w:after="0"/>
+        <w:spacing w:before="200" w:after="0"/>
         <w:ind w:left="0" w:right="170" w:firstLine="0"/>
         <w:outlineLvl w:val="0"/>
         <w:rPr>
@@ -4534,12 +1143,12 @@
     <w:p>
       <w:pPr>
         <w:keepNext/>
-        <w:spacing w:after="0" w:line="360" w:lineRule="auto"/>
+        <w:spacing w:after="0" w:line="252" w:lineRule="auto"/>
       </w:pPr>
     </w:p>
     <w:p>
       <w:pPr>
-        <w:spacing w:after="0" w:line="360" w:lineRule="auto"/>
+        <w:spacing w:after="0" w:line="252" w:lineRule="auto"/>
         <w:rPr>
           <w:szCs w:val="20"/>
         </w:rPr>
@@ -4548,7 +1157,7 @@
         <w:rPr>
           <w:szCs w:val="20"/>
         </w:rPr>
-        <w:t xml:space="preserve">1. Gravar tudo ou nada: nenhuma tela mostra "sucesso" sem ter gravado; corrigir o Endereçamento. 2. Recebimento só de fornecedor qualificado, com decisão registrada da Garantia da Qualidade para a exceção. 3. Recusar validade anterior a hoje em toda entrada. 4. Entrada de produto acabado só a partir de uma ordem de produção liberada. 5. Situação única do lote, aplicada em toda tela e mudada só pelo CQ, pela Pessoa Delegada ou pela Garantia da Qualidade. 6. Liberação do lote pela Pessoa Delegada, com assinatura eletrônica; o laudo muda a situação na hora e reprovar exige motivo. 7. Histórico completo do lote: usuário, hora, análise, laudo, aprovador e cada movimentação. 8. Conferir a permissão em toda tela e toda gravação, no servidor. 9. Remessa que finaliza, baixa o saldo e informa a Rastreabilidade; Movimentação de Quarentena que exige endereço completo e grava saída e entrada juntas. 10. Amostras de retenção de ponta a ponta: consulta e saída encontram o que a entrada gravou, com prazo de guarda e trava de saída.</w:t>
+        <w:t xml:space="preserve">1. Gravar tudo ou nada: nenhuma tela mostra "sucesso" sem ter gravado; corrigir o Endereçamento. 2. Recebimento só de fornecedor qualificado, com decisão registrada da Garantia da Qualidade para a exceção. 3. Recusar validade anterior a hoje em toda entrada e atender pelo lote que vence primeiro. 4. Entrada de produto acabado só a partir de uma ordem de produção liberada. 5. Situação única do lote, aplicada em toda tela e mudada só pelo CQ, pela Pessoa Delegada ou pela Garantia da Qualidade. 6. Liberação do lote pela Pessoa Delegada, com assinatura eletrônica; o laudo muda a situação na hora e reprovar exige motivo. 7. Histórico completo do lote: usuário, hora, análise, laudo, aprovador e cada movimentação, ajuste e cancelamento. 8. Conferir a permissão em toda tela e toda gravação, no servidor. 9. Remessa (inclusive a de kit) que finaliza, baixa o saldo e informa a Rastreabilidade; Movimentação de Quarentena que exige endereço completo e grava saída e entrada juntas. 10. Amostras de retenção de ponta a ponta: consulta e saída encontram o que a entrada gravou, com prazo de guarda e trava de saída.</w:t>
       </w:r>
     </w:p>
     <w:p>
@@ -4566,7 +1175,7 @@
           <w:right w:val="single" w:sz="4" w:space="4" w:color="000000"/>
         </w:pBdr>
         <w:shd w:val="clear" w:color="auto" w:fill="F2F2F2"/>
-        <w:spacing w:before="0" w:after="0"/>
+        <w:spacing w:before="200" w:after="0"/>
         <w:ind w:left="0" w:right="170" w:firstLine="0"/>
         <w:outlineLvl w:val="0"/>
         <w:rPr>
@@ -4585,7 +1194,7 @@
     <w:p>
       <w:pPr>
         <w:keepNext/>
-        <w:spacing w:after="0" w:line="360" w:lineRule="auto"/>
+        <w:spacing w:after="0" w:line="252" w:lineRule="auto"/>
       </w:pPr>
     </w:p>
     <w:tbl>
@@ -4596,9 +1205,9 @@
         <w:tblLook w:val="04A0" w:firstRow="1" w:lastRow="0" w:firstColumn="1" w:lastColumn="0" w:noHBand="0" w:noVBand="1"/>
       </w:tblPr>
       <w:tblGrid>
-        <w:gridCol w:w="473"/>
-        <w:gridCol w:w="5924"/>
-        <w:gridCol w:w="3234"/>
+        <w:gridCol w:w="469"/>
+        <w:gridCol w:w="5443"/>
+        <w:gridCol w:w="3719"/>
       </w:tblGrid>
       <w:tr>
         <w:trPr>
@@ -4607,7 +1216,7 @@
         </w:trPr>
         <w:tc>
           <w:tcPr>
-            <w:tcW w:w="473" w:type="dxa"/>
+            <w:tcW w:w="469" w:type="dxa"/>
             <w:shd w:val="clear" w:color="auto" w:fill="D9D9D9" w:themeFill="background1" w:themeFillShade="D9"/>
           </w:tcPr>
           <w:p>
@@ -4635,7 +1244,7 @@
         </w:tc>
         <w:tc>
           <w:tcPr>
-            <w:tcW w:w="5924" w:type="dxa"/>
+            <w:tcW w:w="5443" w:type="dxa"/>
             <w:shd w:val="clear" w:color="auto" w:fill="D9D9D9" w:themeFill="background1" w:themeFillShade="D9"/>
           </w:tcPr>
           <w:p>
@@ -4663,7 +1272,7 @@
         </w:tc>
         <w:tc>
           <w:tcPr>
-            <w:tcW w:w="3234" w:type="dxa"/>
+            <w:tcW w:w="3719" w:type="dxa"/>
             <w:shd w:val="clear" w:color="auto" w:fill="D9D9D9" w:themeFill="background1" w:themeFillShade="D9"/>
           </w:tcPr>
           <w:p>
@@ -4696,7 +1305,7 @@
         </w:trPr>
         <w:tc>
           <w:tcPr>
-            <w:tcW w:w="473" w:type="dxa"/>
+            <w:tcW w:w="469" w:type="dxa"/>
           </w:tcPr>
           <w:p>
             <w:pPr>
@@ -4719,7 +1328,7 @@
         </w:tc>
         <w:tc>
           <w:tcPr>
-            <w:tcW w:w="5924" w:type="dxa"/>
+            <w:tcW w:w="5443" w:type="dxa"/>
           </w:tcPr>
           <w:p>
             <w:pPr>
@@ -4742,7 +1351,7 @@
         </w:tc>
         <w:tc>
           <w:tcPr>
-            <w:tcW w:w="3234" w:type="dxa"/>
+            <w:tcW w:w="3719" w:type="dxa"/>
           </w:tcPr>
           <w:p>
             <w:pPr>
@@ -4770,7 +1379,7 @@
         </w:trPr>
         <w:tc>
           <w:tcPr>
-            <w:tcW w:w="473" w:type="dxa"/>
+            <w:tcW w:w="469" w:type="dxa"/>
           </w:tcPr>
           <w:p>
             <w:pPr>
@@ -4793,7 +1402,7 @@
         </w:tc>
         <w:tc>
           <w:tcPr>
-            <w:tcW w:w="5924" w:type="dxa"/>
+            <w:tcW w:w="5443" w:type="dxa"/>
           </w:tcPr>
           <w:p>
             <w:pPr>
@@ -4810,13 +1419,13 @@
                 <w:sz w:val="18"/>
                 <w:szCs w:val="20"/>
               </w:rPr>
-              <w:t xml:space="preserve">Cobrar do DBA quatro verificações no banco: Endereçamento, erro da remessa, reserva da amostra de retenção e a movimentação que perdeu saldo</w:t>
+              <w:t xml:space="preserve">Cobrar do DBA a verificação do Endereçamento (qual instrução da rotina falha); as outras causas foram explicadas pela leitura do código</w:t>
             </w:r>
           </w:p>
         </w:tc>
         <w:tc>
           <w:tcPr>
-            <w:tcW w:w="3234" w:type="dxa"/>
+            <w:tcW w:w="3719" w:type="dxa"/>
           </w:tcPr>
           <w:p>
             <w:pPr>
@@ -4833,7 +1442,7 @@
                 <w:sz w:val="18"/>
                 <w:szCs w:val="20"/>
               </w:rPr>
-              <w:t xml:space="preserve">O teste pela tela não alcança essas causas</w:t>
+              <w:t xml:space="preserve">O teste pela tela não alcança essa causa</w:t>
             </w:r>
           </w:p>
         </w:tc>
@@ -4844,7 +1453,7 @@
         </w:trPr>
         <w:tc>
           <w:tcPr>
-            <w:tcW w:w="473" w:type="dxa"/>
+            <w:tcW w:w="469" w:type="dxa"/>
           </w:tcPr>
           <w:p>
             <w:pPr>
@@ -4867,7 +1476,7 @@
         </w:tc>
         <w:tc>
           <w:tcPr>
-            <w:tcW w:w="5924" w:type="dxa"/>
+            <w:tcW w:w="5443" w:type="dxa"/>
           </w:tcPr>
           <w:p>
             <w:pPr>
@@ -4890,7 +1499,7 @@
         </w:tc>
         <w:tc>
           <w:tcPr>
-            <w:tcW w:w="3234" w:type="dxa"/>
+            <w:tcW w:w="3719" w:type="dxa"/>
           </w:tcPr>
           <w:p>
             <w:pPr>
@@ -4918,7 +1527,7 @@
         </w:trPr>
         <w:tc>
           <w:tcPr>
-            <w:tcW w:w="473" w:type="dxa"/>
+            <w:tcW w:w="469" w:type="dxa"/>
           </w:tcPr>
           <w:p>
             <w:pPr>
@@ -4941,7 +1550,7 @@
         </w:tc>
         <w:tc>
           <w:tcPr>
-            <w:tcW w:w="5924" w:type="dxa"/>
+            <w:tcW w:w="5443" w:type="dxa"/>
           </w:tcPr>
           <w:p>
             <w:pPr>
@@ -4964,7 +1573,7 @@
         </w:tc>
         <w:tc>
           <w:tcPr>
-            <w:tcW w:w="3234" w:type="dxa"/>
+            <w:tcW w:w="3719" w:type="dxa"/>
           </w:tcPr>
           <w:p>
             <w:pPr>
@@ -4992,7 +1601,7 @@
         </w:trPr>
         <w:tc>
           <w:tcPr>
-            <w:tcW w:w="473" w:type="dxa"/>
+            <w:tcW w:w="469" w:type="dxa"/>
           </w:tcPr>
           <w:p>
             <w:pPr>
@@ -5015,7 +1624,7 @@
         </w:tc>
         <w:tc>
           <w:tcPr>
-            <w:tcW w:w="5924" w:type="dxa"/>
+            <w:tcW w:w="5443" w:type="dxa"/>
           </w:tcPr>
           <w:p>
             <w:pPr>
@@ -5032,13 +1641,13 @@
                 <w:sz w:val="18"/>
                 <w:szCs w:val="20"/>
               </w:rPr>
-              <w:t xml:space="preserve">Autorizar o encerramento dos recebimentos de teste pendentes e decidir se devolução e inventário são testados depois do módulo Produção</w:t>
+              <w:t xml:space="preserve">Decidir se a devolução e a pesagem esperam o módulo Produção e como criar a Ordem de Produção de teste</w:t>
             </w:r>
           </w:p>
         </w:tc>
         <w:tc>
           <w:tcPr>
-            <w:tcW w:w="3234" w:type="dxa"/>
+            <w:tcW w:w="3719" w:type="dxa"/>
           </w:tcPr>
           <w:p>
             <w:pPr>
@@ -5055,7 +1664,7 @@
                 <w:sz w:val="18"/>
                 <w:szCs w:val="20"/>
               </w:rPr>
-              <w:t xml:space="preserve">Sem isso o Inventário não abre e a devolução depende de uma Ordem de Produção</w:t>
+              <w:t xml:space="preserve">Sem ela a devolução fica sem Ordem de Produção; o Inventário do almoxarifado de teste segue travado por solicitações pendentes</w:t>
             </w:r>
           </w:p>
         </w:tc>
@@ -5063,7 +1672,7 @@
     </w:tbl>
     <w:p>
       <w:pPr>
-        <w:spacing w:after="0" w:line="360" w:lineRule="auto"/>
+        <w:spacing w:after="0" w:line="252" w:lineRule="auto"/>
       </w:pPr>
     </w:p>
     <w:sectPr>
@@ -5403,7 +2012,7 @@
             <w:t>LabMedSys</w:t>
           </w:r>
           <w:r>
-            <w:t xml:space="preserve"> – Módulo Estoque – Resumo executivo</w:t>
+            <w:t xml:space="preserve"> – Estoque – Resumo Executivo do módulo Estoque</w:t>
           </w:r>
         </w:p>
       </w:tc>

</xml_diff>

<commit_message>
Portal Estoque: rodada 10 (149 de 162 casos conclusivos), 5 defeitos novos, Words, resumo e painel
Co-Authored-By: Claude Sonnet 5.5 <noreply@anthropic.com>
Claude-Session: https://claude.ai/code/session_016ZyaVQ3Fat8knNf78iQG9U
</commit_message>
<xml_diff>
--- a/documentacao/arquivos/estoque/LabMedSys - Modulo Estoque - Resumo Executivo.docx
+++ b/documentacao/arquivos/estoque/LabMedSys - Modulo Estoque - Resumo Executivo.docx
@@ -28,7 +28,7 @@
           <w:color w:val="595959"/>
           <w:szCs w:val="20"/>
         </w:rPr>
-        <w:t xml:space="preserve">LabMedSys · Estoque · 22/10/2026 · André Nardacci · documento versão 1.2</w:t>
+        <w:t xml:space="preserve">LabMedSys · Módulo Estoque · 23/10/2026 · André Nardacci · documento versão 1.3</w:t>
       </w:r>
     </w:p>
     <w:p>
@@ -50,7 +50,7 @@
         <w:rPr>
           <w:szCs w:val="20"/>
         </w:rPr>
-        <w:t xml:space="preserve"> Resumo para a diretoria, atualizado em 22/10/2026 (nove rodadas de testes, 07 a 22/10). O detalhe está no Relatório de Testes, na Conformidade Regulatória e nos Defeitos para Correção.</w:t>
+        <w:t xml:space="preserve"> Resumo para a diretoria, atualizado em 23/10/2026 (dez rodadas de testes, 07 a 22/10). O detalhe está no Relatório de Testes, na Conformidade Regulatória e nos Defeitos para Correção.</w:t>
       </w:r>
     </w:p>
     <w:p>
@@ -115,7 +115,7 @@
         <w:rPr>
           <w:szCs w:val="20"/>
         </w:rPr>
-        <w:t xml:space="preserve">. O lote passa pela quarentena e pelo laudo do Controle da Qualidade, e isso funciona. Mas o recebimento aceita fornecedor reprovado e lote vencido, a entrada de produto acabado aceita lote inventado, e a liberação do lote é feita por qualquer usuário, sem a Pessoa Delegada. Os testes acrescentaram falhas graves que o código não previa: a remessa (também a de kit) não pode ser finalizada, a amostra de retenção não é encontrada, a Movimentação de Quarentena perde o saldo do lote, a Central de Pesagem dá erro ao abrir o volume e o atendimento não usa primeiro o lote que vence primeiro.</w:t>
+        <w:t xml:space="preserve">. O lote passa pela quarentena e pelo laudo do Controle da Qualidade, e isso funciona. Mas o recebimento aceita fornecedor reprovado e lote vencido, a entrada de produto acabado aceita lote inventado, e a liberação do lote é feita por qualquer usuário, sem a Pessoa Delegada. Os testes acrescentaram falhas graves que o código não previa: a remessa da tela comum (também a de kit) não finaliza, a amostra de retenção sai antes do vencimento do lote sem aviso, a Movimentação de Quarentena perde o saldo do lote, a Central de Pesagem dá erro ao abrir o volume e o atendimento não usa primeiro o lote que vence primeiro.</w:t>
       </w:r>
     </w:p>
     <w:p>
@@ -199,8 +199,8 @@
         <w:tblLook w:val="04A0" w:firstRow="1" w:lastRow="0" w:firstColumn="1" w:lastColumn="0" w:noHBand="0" w:noVBand="1"/>
       </w:tblPr>
       <w:tblGrid>
-        <w:gridCol w:w="2064"/>
-        <w:gridCol w:w="7567"/>
+        <w:gridCol w:w="2095"/>
+        <w:gridCol w:w="7536"/>
       </w:tblGrid>
       <w:tr>
         <w:trPr>
@@ -209,7 +209,7 @@
         </w:trPr>
         <w:tc>
           <w:tcPr>
-            <w:tcW w:w="2064" w:type="dxa"/>
+            <w:tcW w:w="2095" w:type="dxa"/>
             <w:shd w:val="clear" w:color="auto" w:fill="D9D9D9" w:themeFill="background1" w:themeFillShade="D9"/>
           </w:tcPr>
           <w:p>
@@ -237,7 +237,7 @@
         </w:tc>
         <w:tc>
           <w:tcPr>
-            <w:tcW w:w="7567" w:type="dxa"/>
+            <w:tcW w:w="7536" w:type="dxa"/>
             <w:shd w:val="clear" w:color="auto" w:fill="D9D9D9" w:themeFill="background1" w:themeFillShade="D9"/>
           </w:tcPr>
           <w:p>
@@ -270,7 +270,7 @@
         </w:trPr>
         <w:tc>
           <w:tcPr>
-            <w:tcW w:w="2064" w:type="dxa"/>
+            <w:tcW w:w="2095" w:type="dxa"/>
           </w:tcPr>
           <w:p>
             <w:pPr>
@@ -293,7 +293,7 @@
         </w:tc>
         <w:tc>
           <w:tcPr>
-            <w:tcW w:w="7567" w:type="dxa"/>
+            <w:tcW w:w="7536" w:type="dxa"/>
           </w:tcPr>
           <w:p>
             <w:pPr>
@@ -321,7 +321,7 @@
         </w:trPr>
         <w:tc>
           <w:tcPr>
-            <w:tcW w:w="2064" w:type="dxa"/>
+            <w:tcW w:w="2095" w:type="dxa"/>
           </w:tcPr>
           <w:p>
             <w:pPr>
@@ -344,7 +344,7 @@
         </w:tc>
         <w:tc>
           <w:tcPr>
-            <w:tcW w:w="7567" w:type="dxa"/>
+            <w:tcW w:w="7536" w:type="dxa"/>
           </w:tcPr>
           <w:p>
             <w:pPr>
@@ -370,14 +370,14 @@
                 <w:bCs/>
                 <w:szCs w:val="20"/>
               </w:rPr>
-              <w:t xml:space="preserve">134 com resultado</w:t>
+              <w:t xml:space="preserve">149 com resultado</w:t>
             </w:r>
             <w:r>
               <w:rPr>
                 <w:sz w:val="18"/>
                 <w:szCs w:val="20"/>
               </w:rPr>
-              <w:t xml:space="preserve"> em nove rodadas, cobrindo 42 dos 46 de prioridade alta. Os 4 de prioridade alta restantes estão bloqueados por causas fora do teste (Ordem de Produção, reanálise, remessa e amostra de retenção). Os 24 de média e baixa sem resultado ficam para a nova versão</w:t>
+              <w:t xml:space="preserve"> em dez rodadas, cobrindo 44 dos 46 de prioridade alta. Os 2 de prioridade alta restantes estão bloqueados por causas fora do teste (Ordem de Produção e reanálise). Os 11 de média e baixa sem resultado ficam para a nova versão</w:t>
             </w:r>
           </w:p>
         </w:tc>
@@ -388,7 +388,7 @@
         </w:trPr>
         <w:tc>
           <w:tcPr>
-            <w:tcW w:w="2064" w:type="dxa"/>
+            <w:tcW w:w="2095" w:type="dxa"/>
           </w:tcPr>
           <w:p>
             <w:pPr>
@@ -411,7 +411,7 @@
         </w:tc>
         <w:tc>
           <w:tcPr>
-            <w:tcW w:w="7567" w:type="dxa"/>
+            <w:tcW w:w="7536" w:type="dxa"/>
           </w:tcPr>
           <w:p>
             <w:pPr>
@@ -430,14 +430,14 @@
                 <w:bCs/>
                 <w:szCs w:val="20"/>
               </w:rPr>
-              <w:t xml:space="preserve">67</w:t>
+              <w:t xml:space="preserve">73</w:t>
             </w:r>
             <w:r>
               <w:rPr>
                 <w:sz w:val="18"/>
                 <w:szCs w:val="20"/>
               </w:rPr>
-              <w:t xml:space="preserve">: 59 no documento de defeitos (14 de gravidade alta, 31 média, 14 baixa) e 8 de acesso, no documento confidencial</w:t>
+              <w:t xml:space="preserve">: 64 no documento de defeitos (15 de gravidade alta, 34 média, 15 baixa) e 9 de acesso, no documento confidencial</w:t>
             </w:r>
           </w:p>
         </w:tc>
@@ -493,8 +493,8 @@
         <w:tblLook w:val="04A0" w:firstRow="1" w:lastRow="0" w:firstColumn="1" w:lastColumn="0" w:noHBand="0" w:noVBand="1"/>
       </w:tblPr>
       <w:tblGrid>
-        <w:gridCol w:w="5271"/>
-        <w:gridCol w:w="4360"/>
+        <w:gridCol w:w="5342"/>
+        <w:gridCol w:w="4289"/>
       </w:tblGrid>
       <w:tr>
         <w:trPr>
@@ -503,7 +503,7 @@
         </w:trPr>
         <w:tc>
           <w:tcPr>
-            <w:tcW w:w="5271" w:type="dxa"/>
+            <w:tcW w:w="5342" w:type="dxa"/>
             <w:shd w:val="clear" w:color="auto" w:fill="D9D9D9" w:themeFill="background1" w:themeFillShade="D9"/>
           </w:tcPr>
           <w:p>
@@ -531,7 +531,7 @@
         </w:tc>
         <w:tc>
           <w:tcPr>
-            <w:tcW w:w="4360" w:type="dxa"/>
+            <w:tcW w:w="4289" w:type="dxa"/>
             <w:shd w:val="clear" w:color="auto" w:fill="D9D9D9" w:themeFill="background1" w:themeFillShade="D9"/>
           </w:tcPr>
           <w:p>
@@ -564,7 +564,7 @@
         </w:trPr>
         <w:tc>
           <w:tcPr>
-            <w:tcW w:w="5271" w:type="dxa"/>
+            <w:tcW w:w="5342" w:type="dxa"/>
           </w:tcPr>
           <w:p>
             <w:pPr>
@@ -587,7 +587,7 @@
         </w:tc>
         <w:tc>
           <w:tcPr>
-            <w:tcW w:w="4360" w:type="dxa"/>
+            <w:tcW w:w="4289" w:type="dxa"/>
           </w:tcPr>
           <w:p>
             <w:pPr>
@@ -615,7 +615,7 @@
         </w:trPr>
         <w:tc>
           <w:tcPr>
-            <w:tcW w:w="5271" w:type="dxa"/>
+            <w:tcW w:w="5342" w:type="dxa"/>
           </w:tcPr>
           <w:p>
             <w:pPr>
@@ -638,7 +638,7 @@
         </w:tc>
         <w:tc>
           <w:tcPr>
-            <w:tcW w:w="4360" w:type="dxa"/>
+            <w:tcW w:w="4289" w:type="dxa"/>
           </w:tcPr>
           <w:p>
             <w:pPr>
@@ -666,7 +666,7 @@
         </w:trPr>
         <w:tc>
           <w:tcPr>
-            <w:tcW w:w="5271" w:type="dxa"/>
+            <w:tcW w:w="5342" w:type="dxa"/>
           </w:tcPr>
           <w:p>
             <w:pPr>
@@ -689,7 +689,7 @@
         </w:tc>
         <w:tc>
           <w:tcPr>
-            <w:tcW w:w="4360" w:type="dxa"/>
+            <w:tcW w:w="4289" w:type="dxa"/>
           </w:tcPr>
           <w:p>
             <w:pPr>
@@ -717,7 +717,7 @@
         </w:trPr>
         <w:tc>
           <w:tcPr>
-            <w:tcW w:w="5271" w:type="dxa"/>
+            <w:tcW w:w="5342" w:type="dxa"/>
           </w:tcPr>
           <w:p>
             <w:pPr>
@@ -740,7 +740,7 @@
         </w:tc>
         <w:tc>
           <w:tcPr>
-            <w:tcW w:w="4360" w:type="dxa"/>
+            <w:tcW w:w="4289" w:type="dxa"/>
           </w:tcPr>
           <w:p>
             <w:pPr>
@@ -768,7 +768,7 @@
         </w:trPr>
         <w:tc>
           <w:tcPr>
-            <w:tcW w:w="5271" w:type="dxa"/>
+            <w:tcW w:w="5342" w:type="dxa"/>
           </w:tcPr>
           <w:p>
             <w:pPr>
@@ -791,7 +791,7 @@
         </w:tc>
         <w:tc>
           <w:tcPr>
-            <w:tcW w:w="4360" w:type="dxa"/>
+            <w:tcW w:w="4289" w:type="dxa"/>
           </w:tcPr>
           <w:p>
             <w:pPr>
@@ -819,7 +819,7 @@
         </w:trPr>
         <w:tc>
           <w:tcPr>
-            <w:tcW w:w="5271" w:type="dxa"/>
+            <w:tcW w:w="5342" w:type="dxa"/>
           </w:tcPr>
           <w:p>
             <w:pPr>
@@ -836,13 +836,13 @@
                 <w:sz w:val="18"/>
                 <w:szCs w:val="20"/>
               </w:rPr>
-              <w:t xml:space="preserve">A remessa não pode ser finalizada: a expedição pela tela está travada</w:t>
+              <w:t xml:space="preserve">A remessa da tela comum não finaliza (só finaliza com o modo GMM): a expedição fica travada</w:t>
             </w:r>
           </w:p>
         </w:tc>
         <w:tc>
           <w:tcPr>
-            <w:tcW w:w="4360" w:type="dxa"/>
+            <w:tcW w:w="4289" w:type="dxa"/>
           </w:tcPr>
           <w:p>
             <w:pPr>
@@ -870,7 +870,7 @@
         </w:trPr>
         <w:tc>
           <w:tcPr>
-            <w:tcW w:w="5271" w:type="dxa"/>
+            <w:tcW w:w="5342" w:type="dxa"/>
           </w:tcPr>
           <w:p>
             <w:pPr>
@@ -887,13 +887,13 @@
                 <w:sz w:val="18"/>
                 <w:szCs w:val="20"/>
               </w:rPr>
-              <w:t xml:space="preserve">A amostra de retenção gravada não aparece na consulta nem na saída</w:t>
+              <w:t xml:space="preserve">A amostra de retenção pode sair antes do vencimento do lote, sem aviso nem justificativa</w:t>
             </w:r>
           </w:p>
         </w:tc>
         <w:tc>
           <w:tcPr>
-            <w:tcW w:w="4360" w:type="dxa"/>
+            <w:tcW w:w="4289" w:type="dxa"/>
           </w:tcPr>
           <w:p>
             <w:pPr>
@@ -921,7 +921,7 @@
         </w:trPr>
         <w:tc>
           <w:tcPr>
-            <w:tcW w:w="5271" w:type="dxa"/>
+            <w:tcW w:w="5342" w:type="dxa"/>
           </w:tcPr>
           <w:p>
             <w:pPr>
@@ -944,7 +944,7 @@
         </w:tc>
         <w:tc>
           <w:tcPr>
-            <w:tcW w:w="4360" w:type="dxa"/>
+            <w:tcW w:w="4289" w:type="dxa"/>
           </w:tcPr>
           <w:p>
             <w:pPr>
@@ -972,7 +972,7 @@
         </w:trPr>
         <w:tc>
           <w:tcPr>
-            <w:tcW w:w="5271" w:type="dxa"/>
+            <w:tcW w:w="5342" w:type="dxa"/>
           </w:tcPr>
           <w:p>
             <w:pPr>
@@ -995,7 +995,7 @@
         </w:tc>
         <w:tc>
           <w:tcPr>
-            <w:tcW w:w="4360" w:type="dxa"/>
+            <w:tcW w:w="4289" w:type="dxa"/>
           </w:tcPr>
           <w:p>
             <w:pPr>
@@ -1023,7 +1023,7 @@
         </w:trPr>
         <w:tc>
           <w:tcPr>
-            <w:tcW w:w="5271" w:type="dxa"/>
+            <w:tcW w:w="5342" w:type="dxa"/>
           </w:tcPr>
           <w:p>
             <w:pPr>
@@ -1046,7 +1046,7 @@
         </w:tc>
         <w:tc>
           <w:tcPr>
-            <w:tcW w:w="4360" w:type="dxa"/>
+            <w:tcW w:w="4289" w:type="dxa"/>
           </w:tcPr>
           <w:p>
             <w:pPr>
@@ -1157,7 +1157,7 @@
         <w:rPr>
           <w:szCs w:val="20"/>
         </w:rPr>
-        <w:t xml:space="preserve">1. Gravar tudo ou nada: nenhuma tela mostra "sucesso" sem ter gravado; corrigir o Endereçamento. 2. Recebimento só de fornecedor qualificado, com decisão registrada da Garantia da Qualidade para a exceção. 3. Recusar validade anterior a hoje em toda entrada e atender pelo lote que vence primeiro. 4. Entrada de produto acabado só a partir de uma ordem de produção liberada. 5. Situação única do lote, aplicada em toda tela e mudada só pelo CQ, pela Pessoa Delegada ou pela Garantia da Qualidade. 6. Liberação do lote pela Pessoa Delegada, com assinatura eletrônica; o laudo muda a situação na hora e reprovar exige motivo. 7. Histórico completo do lote: usuário, hora, análise, laudo, aprovador e cada movimentação, ajuste e cancelamento. 8. Conferir a permissão em toda tela e toda gravação, no servidor. 9. Remessa (inclusive a de kit) que finaliza, baixa o saldo e informa a Rastreabilidade; Movimentação de Quarentena que exige endereço completo e grava saída e entrada juntas. 10. Amostras de retenção de ponta a ponta: consulta e saída encontram o que a entrada gravou, com prazo de guarda e trava de saída.</w:t>
+        <w:t xml:space="preserve">1. Gravar tudo ou nada: nenhuma tela mostra "sucesso" sem ter gravado; corrigir o Endereçamento. 2. Recebimento só de fornecedor qualificado, com decisão registrada da Garantia da Qualidade para a exceção. 3. Recusar validade anterior a hoje em toda entrada e atender pelo lote que vence primeiro. 4. Entrada de produto acabado só a partir de uma ordem de produção liberada. 5. Situação única do lote, aplicada em toda tela e mudada só pelo CQ, pela Pessoa Delegada ou pela Garantia da Qualidade. 6. Liberação do lote pela Pessoa Delegada, com assinatura eletrônica; o laudo muda a situação na hora e reprovar exige motivo. 7. Histórico completo do lote: usuário, hora, análise, laudo, aprovador e cada movimentação, ajuste e cancelamento. 8. Conferir a permissão em toda tela e toda gravação, no servidor. 9. Remessa (inclusive a de kit) que finaliza em qualquer modo, baixa o saldo e informa a Rastreabilidade; Movimentação de Quarentena que exige endereço completo e grava saída e entrada juntas. 10. Amostras de retenção de ponta a ponta: consulta e saída encontram o que a entrada gravou, com prazo de guarda e trava de saída antes do vencimento.</w:t>
       </w:r>
     </w:p>
     <w:p>
@@ -2012,7 +2012,7 @@
             <w:t>LabMedSys</w:t>
           </w:r>
           <w:r>
-            <w:t xml:space="preserve"> – Estoque – Resumo Executivo do módulo Estoque</w:t>
+            <w:t xml:space="preserve"> – Módulo Estoque – Resumo Executivo do módulo Estoque</w:t>
           </w:r>
         </w:p>
       </w:tc>

</xml_diff>

<commit_message>
Portal Estoque: rodada 11 (DV-EST-074 a 077, 76 defeitos), Words, resumo e painel
Co-Authored-By: Claude Sonnet 5.5 <noreply@anthropic.com>
Claude-Session: https://claude.ai/code/session_016ZyaVQ3Fat8knNf78iQG9U
</commit_message>
<xml_diff>
--- a/documentacao/arquivos/estoque/LabMedSys - Modulo Estoque - Resumo Executivo.docx
+++ b/documentacao/arquivos/estoque/LabMedSys - Modulo Estoque - Resumo Executivo.docx
@@ -28,7 +28,7 @@
           <w:color w:val="595959"/>
           <w:szCs w:val="20"/>
         </w:rPr>
-        <w:t xml:space="preserve">LabMedSys · Módulo Estoque · 23/10/2026 · André Nardacci · documento versão 1.3</w:t>
+        <w:t xml:space="preserve">LabMedSys · Módulo Estoque · 23/10/2026 · André Nardacci · documento versão 1.4</w:t>
       </w:r>
     </w:p>
     <w:p>
@@ -50,7 +50,7 @@
         <w:rPr>
           <w:szCs w:val="20"/>
         </w:rPr>
-        <w:t xml:space="preserve"> Resumo para a diretoria, atualizado em 23/10/2026 (dez rodadas de testes, 07 a 22/10). O detalhe está no Relatório de Testes, na Conformidade Regulatória e nos Defeitos para Correção.</w:t>
+        <w:t xml:space="preserve"> Resumo para a diretoria, atualizado em 23/10/2026 (onze rodadas de testes, 07 a 22/10). O detalhe está no Relatório de Testes, na Conformidade Regulatória e nos Defeitos para Correção.</w:t>
       </w:r>
     </w:p>
     <w:p>
@@ -115,7 +115,21 @@
         <w:rPr>
           <w:szCs w:val="20"/>
         </w:rPr>
-        <w:t xml:space="preserve">. O lote passa pela quarentena e pelo laudo do Controle da Qualidade, e isso funciona. Mas o recebimento aceita fornecedor reprovado e lote vencido, a entrada de produto acabado aceita lote inventado, e a liberação do lote é feita por qualquer usuário, sem a Pessoa Delegada. Os testes acrescentaram falhas graves que o código não previa: a remessa da tela comum (também a de kit) não finaliza, a amostra de retenção sai antes do vencimento do lote sem aviso, a Movimentação de Quarentena perde o saldo do lote, a Central de Pesagem dá erro ao abrir o volume e o atendimento não usa primeiro o lote que vence primeiro.</w:t>
+        <w:t xml:space="preserve">. O lote passa pela quarentena e pelo laudo do Controle da Qualidade, e isso funciona. Mas o recebimento aceita fornecedor reprovado e lote vencido, a entrada de produto acabado aceita lote inventado, e a liberação do lote é feita por qualquer usuário, sem a Pessoa Delegada. Os testes acrescentaram falhas graves que o código não previa: a remessa da tela comum (também a de kit) não finaliza, a amostra de retenção sai antes do vencimento do lote sem aviso, a Movimentação de Quarentena perde o saldo do lote, a Central de Pesagem dá erro ao abrir o volume o atendimento não usa primeiro o lote que vence primeiro e </w:t>
+      </w:r>
+      <w:r>
+        <w:rPr>
+          <w:b/>
+          <w:bCs/>
+          <w:szCs w:val="20"/>
+        </w:rPr>
+        <w:t xml:space="preserve">ninguém consegue aprovar o lote padrão</w:t>
+      </w:r>
+      <w:r>
+        <w:rPr>
+          <w:szCs w:val="20"/>
+        </w:rPr>
+        <w:t xml:space="preserve">, o que impede a Produção de pedir a primeira ordem de produção.</w:t>
       </w:r>
     </w:p>
     <w:p>
@@ -199,8 +213,8 @@
         <w:tblLook w:val="04A0" w:firstRow="1" w:lastRow="0" w:firstColumn="1" w:lastColumn="0" w:noHBand="0" w:noVBand="1"/>
       </w:tblPr>
       <w:tblGrid>
-        <w:gridCol w:w="2095"/>
-        <w:gridCol w:w="7536"/>
+        <w:gridCol w:w="2194"/>
+        <w:gridCol w:w="7437"/>
       </w:tblGrid>
       <w:tr>
         <w:trPr>
@@ -209,7 +223,7 @@
         </w:trPr>
         <w:tc>
           <w:tcPr>
-            <w:tcW w:w="2095" w:type="dxa"/>
+            <w:tcW w:w="2194" w:type="dxa"/>
             <w:shd w:val="clear" w:color="auto" w:fill="D9D9D9" w:themeFill="background1" w:themeFillShade="D9"/>
           </w:tcPr>
           <w:p>
@@ -237,7 +251,7 @@
         </w:tc>
         <w:tc>
           <w:tcPr>
-            <w:tcW w:w="7536" w:type="dxa"/>
+            <w:tcW w:w="7437" w:type="dxa"/>
             <w:shd w:val="clear" w:color="auto" w:fill="D9D9D9" w:themeFill="background1" w:themeFillShade="D9"/>
           </w:tcPr>
           <w:p>
@@ -270,7 +284,7 @@
         </w:trPr>
         <w:tc>
           <w:tcPr>
-            <w:tcW w:w="2095" w:type="dxa"/>
+            <w:tcW w:w="2194" w:type="dxa"/>
           </w:tcPr>
           <w:p>
             <w:pPr>
@@ -293,7 +307,7 @@
         </w:tc>
         <w:tc>
           <w:tcPr>
-            <w:tcW w:w="7536" w:type="dxa"/>
+            <w:tcW w:w="7437" w:type="dxa"/>
           </w:tcPr>
           <w:p>
             <w:pPr>
@@ -310,7 +324,7 @@
                 <w:sz w:val="18"/>
                 <w:szCs w:val="20"/>
               </w:rPr>
-              <w:t xml:space="preserve">Dez fluxos, 283 regras de negócio, inventário de 98 telas, modelo de dados, 24 riscos (18 de prioridade alta), 12 achados restritos à TI (documento confidencial) e "O ideal" (o Estoque como dono da situação única do lote)</w:t>
+              <w:t xml:space="preserve">Dez fluxos, 283 regras de negócio, inventário de 98 telas, modelo de dados, 24 riscos (18 de prioridade alta), 12 achados de segurança e acesso e "O ideal" (o Estoque como dono da situação única do lote)</w:t>
             </w:r>
           </w:p>
         </w:tc>
@@ -321,7 +335,7 @@
         </w:trPr>
         <w:tc>
           <w:tcPr>
-            <w:tcW w:w="2095" w:type="dxa"/>
+            <w:tcW w:w="2194" w:type="dxa"/>
           </w:tcPr>
           <w:p>
             <w:pPr>
@@ -344,7 +358,7 @@
         </w:tc>
         <w:tc>
           <w:tcPr>
-            <w:tcW w:w="7536" w:type="dxa"/>
+            <w:tcW w:w="7437" w:type="dxa"/>
           </w:tcPr>
           <w:p>
             <w:pPr>
@@ -377,7 +391,7 @@
                 <w:sz w:val="18"/>
                 <w:szCs w:val="20"/>
               </w:rPr>
-              <w:t xml:space="preserve"> em dez rodadas, cobrindo 44 dos 46 de prioridade alta. Os 2 de prioridade alta restantes estão bloqueados por causas fora do teste (Ordem de Produção e reanálise). Os 11 de média e baixa sem resultado ficam para a nova versão</w:t>
+              <w:t xml:space="preserve"> em onze rodadas, cobrindo 44 dos 46 de prioridade alta. Os 2 de prioridade alta restantes estão bloqueados (reanálise no Item e lote padrão sem aprovação). Os 11 de média e baixa sem resultado ficam para a nova versão</w:t>
             </w:r>
           </w:p>
         </w:tc>
@@ -388,7 +402,7 @@
         </w:trPr>
         <w:tc>
           <w:tcPr>
-            <w:tcW w:w="2095" w:type="dxa"/>
+            <w:tcW w:w="2194" w:type="dxa"/>
           </w:tcPr>
           <w:p>
             <w:pPr>
@@ -411,7 +425,7 @@
         </w:tc>
         <w:tc>
           <w:tcPr>
-            <w:tcW w:w="7536" w:type="dxa"/>
+            <w:tcW w:w="7437" w:type="dxa"/>
           </w:tcPr>
           <w:p>
             <w:pPr>
@@ -430,14 +444,14 @@
                 <w:bCs/>
                 <w:szCs w:val="20"/>
               </w:rPr>
-              <w:t xml:space="preserve">73</w:t>
+              <w:t xml:space="preserve">76</w:t>
             </w:r>
             <w:r>
               <w:rPr>
                 <w:sz w:val="18"/>
                 <w:szCs w:val="20"/>
               </w:rPr>
-              <w:t xml:space="preserve">: 64 no documento de defeitos (15 de gravidade alta, 34 média, 15 baixa) e 9 de acesso, no documento confidencial</w:t>
+              <w:t xml:space="preserve">: 21 de gravidade alta, 40 média e 15 baixa; 10 são de acesso e segurança</w:t>
             </w:r>
           </w:p>
         </w:tc>
@@ -493,8 +507,8 @@
         <w:tblLook w:val="04A0" w:firstRow="1" w:lastRow="0" w:firstColumn="1" w:lastColumn="0" w:noHBand="0" w:noVBand="1"/>
       </w:tblPr>
       <w:tblGrid>
-        <w:gridCol w:w="5342"/>
-        <w:gridCol w:w="4289"/>
+        <w:gridCol w:w="5365"/>
+        <w:gridCol w:w="4266"/>
       </w:tblGrid>
       <w:tr>
         <w:trPr>
@@ -503,7 +517,7 @@
         </w:trPr>
         <w:tc>
           <w:tcPr>
-            <w:tcW w:w="5342" w:type="dxa"/>
+            <w:tcW w:w="5365" w:type="dxa"/>
             <w:shd w:val="clear" w:color="auto" w:fill="D9D9D9" w:themeFill="background1" w:themeFillShade="D9"/>
           </w:tcPr>
           <w:p>
@@ -531,7 +545,7 @@
         </w:tc>
         <w:tc>
           <w:tcPr>
-            <w:tcW w:w="4289" w:type="dxa"/>
+            <w:tcW w:w="4266" w:type="dxa"/>
             <w:shd w:val="clear" w:color="auto" w:fill="D9D9D9" w:themeFill="background1" w:themeFillShade="D9"/>
           </w:tcPr>
           <w:p>
@@ -564,7 +578,7 @@
         </w:trPr>
         <w:tc>
           <w:tcPr>
-            <w:tcW w:w="5342" w:type="dxa"/>
+            <w:tcW w:w="5365" w:type="dxa"/>
           </w:tcPr>
           <w:p>
             <w:pPr>
@@ -587,7 +601,7 @@
         </w:tc>
         <w:tc>
           <w:tcPr>
-            <w:tcW w:w="4289" w:type="dxa"/>
+            <w:tcW w:w="4266" w:type="dxa"/>
           </w:tcPr>
           <w:p>
             <w:pPr>
@@ -615,7 +629,7 @@
         </w:trPr>
         <w:tc>
           <w:tcPr>
-            <w:tcW w:w="5342" w:type="dxa"/>
+            <w:tcW w:w="5365" w:type="dxa"/>
           </w:tcPr>
           <w:p>
             <w:pPr>
@@ -638,7 +652,7 @@
         </w:tc>
         <w:tc>
           <w:tcPr>
-            <w:tcW w:w="4289" w:type="dxa"/>
+            <w:tcW w:w="4266" w:type="dxa"/>
           </w:tcPr>
           <w:p>
             <w:pPr>
@@ -666,7 +680,7 @@
         </w:trPr>
         <w:tc>
           <w:tcPr>
-            <w:tcW w:w="5342" w:type="dxa"/>
+            <w:tcW w:w="5365" w:type="dxa"/>
           </w:tcPr>
           <w:p>
             <w:pPr>
@@ -689,7 +703,7 @@
         </w:tc>
         <w:tc>
           <w:tcPr>
-            <w:tcW w:w="4289" w:type="dxa"/>
+            <w:tcW w:w="4266" w:type="dxa"/>
           </w:tcPr>
           <w:p>
             <w:pPr>
@@ -717,7 +731,58 @@
         </w:trPr>
         <w:tc>
           <w:tcPr>
-            <w:tcW w:w="5342" w:type="dxa"/>
+            <w:tcW w:w="5365" w:type="dxa"/>
+          </w:tcPr>
+          <w:p>
+            <w:pPr>
+              <w:widowControl/>
+              <w:spacing w:after="0" w:line="276" w:lineRule="auto"/>
+              <w:jc w:val="left"/>
+              <w:rPr>
+                <w:sz w:val="18"/>
+                <w:szCs w:val="18"/>
+              </w:rPr>
+            </w:pPr>
+            <w:r>
+              <w:rPr>
+                <w:sz w:val="18"/>
+                <w:szCs w:val="20"/>
+              </w:rPr>
+              <w:t xml:space="preserve">Ninguém aprova o lote padrão; sem ele a Produção não pede ordem de produção</w:t>
+            </w:r>
+          </w:p>
+        </w:tc>
+        <w:tc>
+          <w:tcPr>
+            <w:tcW w:w="4266" w:type="dxa"/>
+          </w:tcPr>
+          <w:p>
+            <w:pPr>
+              <w:widowControl/>
+              <w:spacing w:after="0" w:line="276" w:lineRule="auto"/>
+              <w:jc w:val="left"/>
+              <w:rPr>
+                <w:sz w:val="18"/>
+                <w:szCs w:val="18"/>
+              </w:rPr>
+            </w:pPr>
+            <w:r>
+              <w:rPr>
+                <w:sz w:val="18"/>
+                <w:szCs w:val="20"/>
+              </w:rPr>
+              <w:t xml:space="preserve">Lote padrão sem aprovação (arts. 133 a 135)</w:t>
+            </w:r>
+          </w:p>
+        </w:tc>
+      </w:tr>
+      <w:tr>
+        <w:trPr>
+          <w:cantSplit/>
+        </w:trPr>
+        <w:tc>
+          <w:tcPr>
+            <w:tcW w:w="5365" w:type="dxa"/>
           </w:tcPr>
           <w:p>
             <w:pPr>
@@ -740,7 +805,7 @@
         </w:tc>
         <w:tc>
           <w:tcPr>
-            <w:tcW w:w="4289" w:type="dxa"/>
+            <w:tcW w:w="4266" w:type="dxa"/>
           </w:tcPr>
           <w:p>
             <w:pPr>
@@ -768,7 +833,7 @@
         </w:trPr>
         <w:tc>
           <w:tcPr>
-            <w:tcW w:w="5342" w:type="dxa"/>
+            <w:tcW w:w="5365" w:type="dxa"/>
           </w:tcPr>
           <w:p>
             <w:pPr>
@@ -791,7 +856,7 @@
         </w:tc>
         <w:tc>
           <w:tcPr>
-            <w:tcW w:w="4289" w:type="dxa"/>
+            <w:tcW w:w="4266" w:type="dxa"/>
           </w:tcPr>
           <w:p>
             <w:pPr>
@@ -819,7 +884,7 @@
         </w:trPr>
         <w:tc>
           <w:tcPr>
-            <w:tcW w:w="5342" w:type="dxa"/>
+            <w:tcW w:w="5365" w:type="dxa"/>
           </w:tcPr>
           <w:p>
             <w:pPr>
@@ -842,7 +907,7 @@
         </w:tc>
         <w:tc>
           <w:tcPr>
-            <w:tcW w:w="4289" w:type="dxa"/>
+            <w:tcW w:w="4266" w:type="dxa"/>
           </w:tcPr>
           <w:p>
             <w:pPr>
@@ -870,7 +935,7 @@
         </w:trPr>
         <w:tc>
           <w:tcPr>
-            <w:tcW w:w="5342" w:type="dxa"/>
+            <w:tcW w:w="5365" w:type="dxa"/>
           </w:tcPr>
           <w:p>
             <w:pPr>
@@ -893,7 +958,7 @@
         </w:tc>
         <w:tc>
           <w:tcPr>
-            <w:tcW w:w="4289" w:type="dxa"/>
+            <w:tcW w:w="4266" w:type="dxa"/>
           </w:tcPr>
           <w:p>
             <w:pPr>
@@ -921,7 +986,7 @@
         </w:trPr>
         <w:tc>
           <w:tcPr>
-            <w:tcW w:w="5342" w:type="dxa"/>
+            <w:tcW w:w="5365" w:type="dxa"/>
           </w:tcPr>
           <w:p>
             <w:pPr>
@@ -944,7 +1009,7 @@
         </w:tc>
         <w:tc>
           <w:tcPr>
-            <w:tcW w:w="4289" w:type="dxa"/>
+            <w:tcW w:w="4266" w:type="dxa"/>
           </w:tcPr>
           <w:p>
             <w:pPr>
@@ -972,7 +1037,7 @@
         </w:trPr>
         <w:tc>
           <w:tcPr>
-            <w:tcW w:w="5342" w:type="dxa"/>
+            <w:tcW w:w="5365" w:type="dxa"/>
           </w:tcPr>
           <w:p>
             <w:pPr>
@@ -995,7 +1060,7 @@
         </w:tc>
         <w:tc>
           <w:tcPr>
-            <w:tcW w:w="4289" w:type="dxa"/>
+            <w:tcW w:w="4266" w:type="dxa"/>
           </w:tcPr>
           <w:p>
             <w:pPr>
@@ -1023,7 +1088,7 @@
         </w:trPr>
         <w:tc>
           <w:tcPr>
-            <w:tcW w:w="5342" w:type="dxa"/>
+            <w:tcW w:w="5365" w:type="dxa"/>
           </w:tcPr>
           <w:p>
             <w:pPr>
@@ -1046,7 +1111,7 @@
         </w:tc>
         <w:tc>
           <w:tcPr>
-            <w:tcW w:w="4289" w:type="dxa"/>
+            <w:tcW w:w="4266" w:type="dxa"/>
           </w:tcPr>
           <w:p>
             <w:pPr>
@@ -1157,7 +1222,7 @@
         <w:rPr>
           <w:szCs w:val="20"/>
         </w:rPr>
-        <w:t xml:space="preserve">1. Gravar tudo ou nada: nenhuma tela mostra "sucesso" sem ter gravado; corrigir o Endereçamento. 2. Recebimento só de fornecedor qualificado, com decisão registrada da Garantia da Qualidade para a exceção. 3. Recusar validade anterior a hoje em toda entrada e atender pelo lote que vence primeiro. 4. Entrada de produto acabado só a partir de uma ordem de produção liberada. 5. Situação única do lote, aplicada em toda tela e mudada só pelo CQ, pela Pessoa Delegada ou pela Garantia da Qualidade. 6. Liberação do lote pela Pessoa Delegada, com assinatura eletrônica; o laudo muda a situação na hora e reprovar exige motivo. 7. Histórico completo do lote: usuário, hora, análise, laudo, aprovador e cada movimentação, ajuste e cancelamento. 8. Conferir a permissão em toda tela e toda gravação, no servidor. 9. Remessa (inclusive a de kit) que finaliza em qualquer modo, baixa o saldo e informa a Rastreabilidade; Movimentação de Quarentena que exige endereço completo e grava saída e entrada juntas. 10. Amostras de retenção de ponta a ponta: consulta e saída encontram o que a entrada gravou, com prazo de guarda e trava de saída antes do vencimento.</w:t>
+        <w:t xml:space="preserve">1. Gravar tudo ou nada: nenhuma tela mostra "sucesso" sem ter gravado; corrigir o Endereçamento. 2. Recebimento só de fornecedor qualificado, com decisão registrada da Garantia da Qualidade para a exceção. 3. Recusar validade anterior a hoje em toda entrada e atender pelo lote que vence primeiro. 4. Entrada de produto acabado só a partir de uma ordem de produção liberada. 5. Situação única do lote, aplicada em toda tela e mudada só pelo CQ, pela Pessoa Delegada ou pela Garantia da Qualidade. 6. Liberação do lote pela Pessoa Delegada, com assinatura eletrônica; o laudo muda a situação na hora e reprovar exige motivo. 7. Histórico completo do lote: usuário, hora, análise, laudo, aprovador e cada movimentação, ajuste e cancelamento. 8. Conferir a permissão em toda tela e toda gravação, no servidor, e dar tela à permissão de aprovar o lote padrão. 9. Remessa (inclusive a de kit) que finaliza em qualquer modo, baixa o saldo e informa a Rastreabilidade; Movimentação de Quarentena que exige endereço completo e grava saída e entrada juntas. 10. Amostras de retenção de ponta a ponta: consulta e saída encontram o que a entrada gravou, com prazo de guarda e trava de saída antes do vencimento.</w:t>
       </w:r>
     </w:p>
     <w:p>
@@ -1205,9 +1270,9 @@
         <w:tblLook w:val="04A0" w:firstRow="1" w:lastRow="0" w:firstColumn="1" w:lastColumn="0" w:noHBand="0" w:noVBand="1"/>
       </w:tblPr>
       <w:tblGrid>
-        <w:gridCol w:w="469"/>
-        <w:gridCol w:w="5443"/>
-        <w:gridCol w:w="3719"/>
+        <w:gridCol w:w="488"/>
+        <w:gridCol w:w="5926"/>
+        <w:gridCol w:w="3217"/>
       </w:tblGrid>
       <w:tr>
         <w:trPr>
@@ -1216,7 +1281,7 @@
         </w:trPr>
         <w:tc>
           <w:tcPr>
-            <w:tcW w:w="469" w:type="dxa"/>
+            <w:tcW w:w="488" w:type="dxa"/>
             <w:shd w:val="clear" w:color="auto" w:fill="D9D9D9" w:themeFill="background1" w:themeFillShade="D9"/>
           </w:tcPr>
           <w:p>
@@ -1244,7 +1309,7 @@
         </w:tc>
         <w:tc>
           <w:tcPr>
-            <w:tcW w:w="5443" w:type="dxa"/>
+            <w:tcW w:w="5926" w:type="dxa"/>
             <w:shd w:val="clear" w:color="auto" w:fill="D9D9D9" w:themeFill="background1" w:themeFillShade="D9"/>
           </w:tcPr>
           <w:p>
@@ -1272,7 +1337,7 @@
         </w:tc>
         <w:tc>
           <w:tcPr>
-            <w:tcW w:w="3719" w:type="dxa"/>
+            <w:tcW w:w="3217" w:type="dxa"/>
             <w:shd w:val="clear" w:color="auto" w:fill="D9D9D9" w:themeFill="background1" w:themeFillShade="D9"/>
           </w:tcPr>
           <w:p>
@@ -1305,7 +1370,7 @@
         </w:trPr>
         <w:tc>
           <w:tcPr>
-            <w:tcW w:w="469" w:type="dxa"/>
+            <w:tcW w:w="488" w:type="dxa"/>
           </w:tcPr>
           <w:p>
             <w:pPr>
@@ -1328,7 +1393,7 @@
         </w:tc>
         <w:tc>
           <w:tcPr>
-            <w:tcW w:w="5443" w:type="dxa"/>
+            <w:tcW w:w="5926" w:type="dxa"/>
           </w:tcPr>
           <w:p>
             <w:pPr>
@@ -1351,7 +1416,7 @@
         </w:tc>
         <w:tc>
           <w:tcPr>
-            <w:tcW w:w="3719" w:type="dxa"/>
+            <w:tcW w:w="3217" w:type="dxa"/>
           </w:tcPr>
           <w:p>
             <w:pPr>
@@ -1379,7 +1444,7 @@
         </w:trPr>
         <w:tc>
           <w:tcPr>
-            <w:tcW w:w="469" w:type="dxa"/>
+            <w:tcW w:w="488" w:type="dxa"/>
           </w:tcPr>
           <w:p>
             <w:pPr>
@@ -1402,7 +1467,7 @@
         </w:tc>
         <w:tc>
           <w:tcPr>
-            <w:tcW w:w="5443" w:type="dxa"/>
+            <w:tcW w:w="5926" w:type="dxa"/>
           </w:tcPr>
           <w:p>
             <w:pPr>
@@ -1419,13 +1484,13 @@
                 <w:sz w:val="18"/>
                 <w:szCs w:val="20"/>
               </w:rPr>
-              <w:t xml:space="preserve">Cobrar do DBA a verificação do Endereçamento (qual instrução da rotina falha); as outras causas foram explicadas pela leitura do código</w:t>
+              <w:t xml:space="preserve">Pedir ao DBA: qual instrução do Endereçamento falha, e ligar uma função profissional à configuração 19 (destrava a Produção)</w:t>
             </w:r>
           </w:p>
         </w:tc>
         <w:tc>
           <w:tcPr>
-            <w:tcW w:w="3719" w:type="dxa"/>
+            <w:tcW w:w="3217" w:type="dxa"/>
           </w:tcPr>
           <w:p>
             <w:pPr>
@@ -1442,7 +1507,7 @@
                 <w:sz w:val="18"/>
                 <w:szCs w:val="20"/>
               </w:rPr>
-              <w:t xml:space="preserve">O teste pela tela não alcança essa causa</w:t>
+              <w:t xml:space="preserve">O teste pela tela não alcança essas causas</w:t>
             </w:r>
           </w:p>
         </w:tc>
@@ -1453,7 +1518,7 @@
         </w:trPr>
         <w:tc>
           <w:tcPr>
-            <w:tcW w:w="469" w:type="dxa"/>
+            <w:tcW w:w="488" w:type="dxa"/>
           </w:tcPr>
           <w:p>
             <w:pPr>
@@ -1476,7 +1541,7 @@
         </w:tc>
         <w:tc>
           <w:tcPr>
-            <w:tcW w:w="5443" w:type="dxa"/>
+            <w:tcW w:w="5926" w:type="dxa"/>
           </w:tcPr>
           <w:p>
             <w:pPr>
@@ -1499,7 +1564,7 @@
         </w:tc>
         <w:tc>
           <w:tcPr>
-            <w:tcW w:w="3719" w:type="dxa"/>
+            <w:tcW w:w="3217" w:type="dxa"/>
           </w:tcPr>
           <w:p>
             <w:pPr>
@@ -1527,7 +1592,7 @@
         </w:trPr>
         <w:tc>
           <w:tcPr>
-            <w:tcW w:w="469" w:type="dxa"/>
+            <w:tcW w:w="488" w:type="dxa"/>
           </w:tcPr>
           <w:p>
             <w:pPr>
@@ -1550,7 +1615,7 @@
         </w:tc>
         <w:tc>
           <w:tcPr>
-            <w:tcW w:w="5443" w:type="dxa"/>
+            <w:tcW w:w="5926" w:type="dxa"/>
           </w:tcPr>
           <w:p>
             <w:pPr>
@@ -1573,7 +1638,7 @@
         </w:tc>
         <w:tc>
           <w:tcPr>
-            <w:tcW w:w="3719" w:type="dxa"/>
+            <w:tcW w:w="3217" w:type="dxa"/>
           </w:tcPr>
           <w:p>
             <w:pPr>
@@ -1601,7 +1666,7 @@
         </w:trPr>
         <w:tc>
           <w:tcPr>
-            <w:tcW w:w="469" w:type="dxa"/>
+            <w:tcW w:w="488" w:type="dxa"/>
           </w:tcPr>
           <w:p>
             <w:pPr>
@@ -1624,7 +1689,7 @@
         </w:tc>
         <w:tc>
           <w:tcPr>
-            <w:tcW w:w="5443" w:type="dxa"/>
+            <w:tcW w:w="5926" w:type="dxa"/>
           </w:tcPr>
           <w:p>
             <w:pPr>
@@ -1647,7 +1712,7 @@
         </w:tc>
         <w:tc>
           <w:tcPr>
-            <w:tcW w:w="3719" w:type="dxa"/>
+            <w:tcW w:w="3217" w:type="dxa"/>
           </w:tcPr>
           <w:p>
             <w:pPr>
@@ -1664,7 +1729,7 @@
                 <w:sz w:val="18"/>
                 <w:szCs w:val="20"/>
               </w:rPr>
-              <w:t xml:space="preserve">Sem ela a devolução fica sem Ordem de Produção; o Inventário do almoxarifado de teste segue travado por solicitações pendentes</w:t>
+              <w:t xml:space="preserve">Sem ela a devolução fica sem Ordem de Produção</w:t>
             </w:r>
           </w:p>
         </w:tc>

</xml_diff>

<commit_message>
Portal: Estoque e Garantia da Qualidade fechados como não aptos; entregáveis finais da GQ; 187 defeitos; Mudanças, Assuntos Regulatórios e Autoinspeção com as rodadas de 22/10
Co-Authored-By: Claude Sonnet 5.5 <noreply@anthropic.com>
Claude-Session: https://claude.ai/code/session_016ZyaVQ3Fat8knNf78iQG9U
</commit_message>
<xml_diff>
--- a/documentacao/arquivos/estoque/LabMedSys - Modulo Estoque - Resumo Executivo.docx
+++ b/documentacao/arquivos/estoque/LabMedSys - Modulo Estoque - Resumo Executivo.docx
@@ -28,7 +28,7 @@
           <w:color w:val="595959"/>
           <w:szCs w:val="20"/>
         </w:rPr>
-        <w:t xml:space="preserve">LabMedSys · Módulo Estoque · 23/10/2026 · André Nardacci · documento versão 1.4</w:t>
+        <w:t xml:space="preserve">LabMedSys · Módulo Estoque · 23/10/2026 · André Nardacci · documento versão 1.5</w:t>
       </w:r>
     </w:p>
     <w:p>
@@ -101,7 +101,7 @@
         <w:rPr>
           <w:szCs w:val="20"/>
         </w:rPr>
-        <w:t xml:space="preserve">O módulo Estoque do LabMedSys (versão 3.5.1), como foi entregue pelo fornecedor, </w:t>
+        <w:t xml:space="preserve">O módulo Estoque do LabMedSys (versão 3.5.1), como foi entregue pelo fornecedor, registra a entrada, a guarda e a saída dos materiais, mas </w:t>
       </w:r>
       <w:r>
         <w:rPr>
@@ -109,13 +109,13 @@
           <w:bCs/>
           <w:szCs w:val="20"/>
         </w:rPr>
-        <w:t xml:space="preserve">registra a entrada, a guarda e a saída dos materiais, mas não controla o que a ANVISA exige controlar</w:t>
+        <w:t xml:space="preserve">não controla o que a ANVISA exige controlar</w:t>
       </w:r>
       <w:r>
         <w:rPr>
           <w:szCs w:val="20"/>
         </w:rPr>
-        <w:t xml:space="preserve">. O lote passa pela quarentena e pelo laudo do Controle da Qualidade, e isso funciona. Mas o recebimento aceita fornecedor reprovado e lote vencido, a entrada de produto acabado aceita lote inventado, e a liberação do lote é feita por qualquer usuário, sem a Pessoa Delegada. Os testes acrescentaram falhas graves que o código não previa: a remessa da tela comum (também a de kit) não finaliza, a amostra de retenção sai antes do vencimento do lote sem aviso, a Movimentação de Quarentena perde o saldo do lote, a Central de Pesagem dá erro ao abrir o volume o atendimento não usa primeiro o lote que vence primeiro e </w:t>
+        <w:t xml:space="preserve">. O lote passa pela quarentena e pelo laudo do Controle da Qualidade, e isso funciona. Mas o recebimento aceita fornecedor reprovado e lote vencido, a entrada de produto acabado aceita lote inventado e a liberação do lote é feita por qualquer usuário, sem a Pessoa Delegada. Os testes acrescentaram falhas graves: a remessa da tela comum não finaliza, a amostra de retenção sai antes do vencimento sem aviso, a Movimentação de Quarentena perde o saldo, a Central de Pesagem dá erro, o atendimento aceita o lote que vence depois e </w:t>
       </w:r>
       <w:r>
         <w:rPr>
@@ -129,7 +129,7 @@
         <w:rPr>
           <w:szCs w:val="20"/>
         </w:rPr>
-        <w:t xml:space="preserve">, o que impede a Produção de pedir a primeira ordem de produção.</w:t>
+        <w:t xml:space="preserve">, o que impede a Produção de pedir a primeira ordem.</w:t>
       </w:r>
     </w:p>
     <w:p>
@@ -151,21 +151,7 @@
         <w:rPr>
           <w:szCs w:val="20"/>
         </w:rPr>
-        <w:t xml:space="preserve">: 5 em parte, 8 não atendidos e 1 não verificado. </w:t>
-      </w:r>
-      <w:r>
-        <w:rPr>
-          <w:b/>
-          <w:bCs/>
-          <w:szCs w:val="20"/>
-        </w:rPr>
-        <w:t xml:space="preserve">Parecer: o módulo não está apto para uso em ambiente regulado</w:t>
-      </w:r>
-      <w:r>
-        <w:rPr>
-          <w:szCs w:val="20"/>
-        </w:rPr>
-        <w:t xml:space="preserve"> até as dez correções obrigatórias abaixo. Os mecanismos essenciais existem (quarentena, saldo por situação, histórico), então as falhas podem ser corrigidas sem reconstruir o módulo.</w:t>
+        <w:t xml:space="preserve">: 5 em parte, 8 não atendidos e 1 não verificado. Os mecanismos essenciais existem (quarentena, saldo por situação, histórico), então as falhas podem ser corrigidas sem reconstruir o módulo.</w:t>
       </w:r>
     </w:p>
     <w:p>
@@ -213,8 +199,8 @@
         <w:tblLook w:val="04A0" w:firstRow="1" w:lastRow="0" w:firstColumn="1" w:lastColumn="0" w:noHBand="0" w:noVBand="1"/>
       </w:tblPr>
       <w:tblGrid>
-        <w:gridCol w:w="2194"/>
-        <w:gridCol w:w="7437"/>
+        <w:gridCol w:w="2511"/>
+        <w:gridCol w:w="7120"/>
       </w:tblGrid>
       <w:tr>
         <w:trPr>
@@ -223,7 +209,7 @@
         </w:trPr>
         <w:tc>
           <w:tcPr>
-            <w:tcW w:w="2194" w:type="dxa"/>
+            <w:tcW w:w="2511" w:type="dxa"/>
             <w:shd w:val="clear" w:color="auto" w:fill="D9D9D9" w:themeFill="background1" w:themeFillShade="D9"/>
           </w:tcPr>
           <w:p>
@@ -251,7 +237,7 @@
         </w:tc>
         <w:tc>
           <w:tcPr>
-            <w:tcW w:w="7437" w:type="dxa"/>
+            <w:tcW w:w="7120" w:type="dxa"/>
             <w:shd w:val="clear" w:color="auto" w:fill="D9D9D9" w:themeFill="background1" w:themeFillShade="D9"/>
           </w:tcPr>
           <w:p>
@@ -284,7 +270,7 @@
         </w:trPr>
         <w:tc>
           <w:tcPr>
-            <w:tcW w:w="2194" w:type="dxa"/>
+            <w:tcW w:w="2511" w:type="dxa"/>
           </w:tcPr>
           <w:p>
             <w:pPr>
@@ -307,7 +293,7 @@
         </w:tc>
         <w:tc>
           <w:tcPr>
-            <w:tcW w:w="7437" w:type="dxa"/>
+            <w:tcW w:w="7120" w:type="dxa"/>
           </w:tcPr>
           <w:p>
             <w:pPr>
@@ -324,7 +310,7 @@
                 <w:sz w:val="18"/>
                 <w:szCs w:val="20"/>
               </w:rPr>
-              <w:t xml:space="preserve">Dez fluxos, 283 regras de negócio, inventário de 98 telas, modelo de dados, 24 riscos (18 de prioridade alta), 12 achados de segurança e acesso e "O ideal" (o Estoque como dono da situação única do lote)</w:t>
+              <w:t xml:space="preserve">Dez fluxos, 171 regras de negócio, 98 telas, modelo de dados, 24 riscos (18 de prioridade alta), 12 achados de segurança e o modelo ideal</w:t>
             </w:r>
           </w:p>
         </w:tc>
@@ -335,7 +321,7 @@
         </w:trPr>
         <w:tc>
           <w:tcPr>
-            <w:tcW w:w="2194" w:type="dxa"/>
+            <w:tcW w:w="2511" w:type="dxa"/>
           </w:tcPr>
           <w:p>
             <w:pPr>
@@ -358,7 +344,7 @@
         </w:tc>
         <w:tc>
           <w:tcPr>
-            <w:tcW w:w="7437" w:type="dxa"/>
+            <w:tcW w:w="7120" w:type="dxa"/>
           </w:tcPr>
           <w:p>
             <w:pPr>
@@ -375,7 +361,7 @@
                 <w:sz w:val="18"/>
                 <w:szCs w:val="20"/>
               </w:rPr>
-              <w:t xml:space="preserve">162 casos planejados; </w:t>
+              <w:t xml:space="preserve">162 casos; </w:t>
             </w:r>
             <w:r>
               <w:rPr>
@@ -391,7 +377,7 @@
                 <w:sz w:val="18"/>
                 <w:szCs w:val="20"/>
               </w:rPr>
-              <w:t xml:space="preserve"> em onze rodadas, cobrindo 44 dos 46 de prioridade alta. Os 2 de prioridade alta restantes estão bloqueados (reanálise no Item e lote padrão sem aprovação). Os 11 de média e baixa sem resultado ficam para a nova versão</w:t>
+              <w:t xml:space="preserve"> em onze rodadas, 44 dos 46 de prioridade alta; os 2 restantes estão bloqueados (reanálise no Item e lote padrão sem aprovação)</w:t>
             </w:r>
           </w:p>
         </w:tc>
@@ -402,7 +388,7 @@
         </w:trPr>
         <w:tc>
           <w:tcPr>
-            <w:tcW w:w="2194" w:type="dxa"/>
+            <w:tcW w:w="2511" w:type="dxa"/>
           </w:tcPr>
           <w:p>
             <w:pPr>
@@ -425,7 +411,7 @@
         </w:tc>
         <w:tc>
           <w:tcPr>
-            <w:tcW w:w="7437" w:type="dxa"/>
+            <w:tcW w:w="7120" w:type="dxa"/>
           </w:tcPr>
           <w:p>
             <w:pPr>
@@ -507,8 +493,8 @@
         <w:tblLook w:val="04A0" w:firstRow="1" w:lastRow="0" w:firstColumn="1" w:lastColumn="0" w:noHBand="0" w:noVBand="1"/>
       </w:tblPr>
       <w:tblGrid>
-        <w:gridCol w:w="5365"/>
-        <w:gridCol w:w="4266"/>
+        <w:gridCol w:w="5206"/>
+        <w:gridCol w:w="4425"/>
       </w:tblGrid>
       <w:tr>
         <w:trPr>
@@ -517,7 +503,7 @@
         </w:trPr>
         <w:tc>
           <w:tcPr>
-            <w:tcW w:w="5365" w:type="dxa"/>
+            <w:tcW w:w="5206" w:type="dxa"/>
             <w:shd w:val="clear" w:color="auto" w:fill="D9D9D9" w:themeFill="background1" w:themeFillShade="D9"/>
           </w:tcPr>
           <w:p>
@@ -545,7 +531,7 @@
         </w:tc>
         <w:tc>
           <w:tcPr>
-            <w:tcW w:w="4266" w:type="dxa"/>
+            <w:tcW w:w="4425" w:type="dxa"/>
             <w:shd w:val="clear" w:color="auto" w:fill="D9D9D9" w:themeFill="background1" w:themeFillShade="D9"/>
           </w:tcPr>
           <w:p>
@@ -578,7 +564,7 @@
         </w:trPr>
         <w:tc>
           <w:tcPr>
-            <w:tcW w:w="5365" w:type="dxa"/>
+            <w:tcW w:w="5206" w:type="dxa"/>
           </w:tcPr>
           <w:p>
             <w:pPr>
@@ -601,7 +587,7 @@
         </w:tc>
         <w:tc>
           <w:tcPr>
-            <w:tcW w:w="4266" w:type="dxa"/>
+            <w:tcW w:w="4425" w:type="dxa"/>
           </w:tcPr>
           <w:p>
             <w:pPr>
@@ -629,7 +615,7 @@
         </w:trPr>
         <w:tc>
           <w:tcPr>
-            <w:tcW w:w="5365" w:type="dxa"/>
+            <w:tcW w:w="5206" w:type="dxa"/>
           </w:tcPr>
           <w:p>
             <w:pPr>
@@ -646,13 +632,13 @@
                 <w:sz w:val="18"/>
                 <w:szCs w:val="20"/>
               </w:rPr>
-              <w:t xml:space="preserve">A avaliação do fornecedor não aprova nem bloqueia ninguém</w:t>
+              <w:t xml:space="preserve">Fornecedor reprovado e lote vencido são aceitos; a entrada de produto acabado aceita lote inventado, sem ordem de produção</w:t>
             </w:r>
           </w:p>
         </w:tc>
         <w:tc>
           <w:tcPr>
-            <w:tcW w:w="4266" w:type="dxa"/>
+            <w:tcW w:w="4425" w:type="dxa"/>
           </w:tcPr>
           <w:p>
             <w:pPr>
@@ -669,7 +655,7 @@
                 <w:sz w:val="18"/>
                 <w:szCs w:val="20"/>
               </w:rPr>
-              <w:t xml:space="preserve">Material de fonte não qualificada entra na fábrica (art. 8º, VI)</w:t>
+              <w:t xml:space="preserve">Material de fonte não qualificada, fora da validade ou sem origem rastreável (arts. 8º VI, 124, 164 e 189)</w:t>
             </w:r>
           </w:p>
         </w:tc>
@@ -680,58 +666,7 @@
         </w:trPr>
         <w:tc>
           <w:tcPr>
-            <w:tcW w:w="5365" w:type="dxa"/>
-          </w:tcPr>
-          <w:p>
-            <w:pPr>
-              <w:widowControl/>
-              <w:spacing w:after="0" w:line="276" w:lineRule="auto"/>
-              <w:jc w:val="left"/>
-              <w:rPr>
-                <w:sz w:val="18"/>
-                <w:szCs w:val="18"/>
-              </w:rPr>
-            </w:pPr>
-            <w:r>
-              <w:rPr>
-                <w:sz w:val="18"/>
-                <w:szCs w:val="20"/>
-              </w:rPr>
-              <w:t xml:space="preserve">Lote vencido é aceito na entrada; a entrada de produto acabado aceita lote inventado, sem ordem de produção</w:t>
-            </w:r>
-          </w:p>
-        </w:tc>
-        <w:tc>
-          <w:tcPr>
-            <w:tcW w:w="4266" w:type="dxa"/>
-          </w:tcPr>
-          <w:p>
-            <w:pPr>
-              <w:widowControl/>
-              <w:spacing w:after="0" w:line="276" w:lineRule="auto"/>
-              <w:jc w:val="left"/>
-              <w:rPr>
-                <w:sz w:val="18"/>
-                <w:szCs w:val="18"/>
-              </w:rPr>
-            </w:pPr>
-            <w:r>
-              <w:rPr>
-                <w:sz w:val="18"/>
-                <w:szCs w:val="20"/>
-              </w:rPr>
-              <w:t xml:space="preserve">Material fora da validade e lote sem origem rastreável (arts. 124, 164 e 189)</w:t>
-            </w:r>
-          </w:p>
-        </w:tc>
-      </w:tr>
-      <w:tr>
-        <w:trPr>
-          <w:cantSplit/>
-        </w:trPr>
-        <w:tc>
-          <w:tcPr>
-            <w:tcW w:w="5365" w:type="dxa"/>
+            <w:tcW w:w="5206" w:type="dxa"/>
           </w:tcPr>
           <w:p>
             <w:pPr>
@@ -754,7 +689,7 @@
         </w:tc>
         <w:tc>
           <w:tcPr>
-            <w:tcW w:w="4266" w:type="dxa"/>
+            <w:tcW w:w="4425" w:type="dxa"/>
           </w:tcPr>
           <w:p>
             <w:pPr>
@@ -782,7 +717,7 @@
         </w:trPr>
         <w:tc>
           <w:tcPr>
-            <w:tcW w:w="5365" w:type="dxa"/>
+            <w:tcW w:w="5206" w:type="dxa"/>
           </w:tcPr>
           <w:p>
             <w:pPr>
@@ -805,7 +740,7 @@
         </w:tc>
         <w:tc>
           <w:tcPr>
-            <w:tcW w:w="4266" w:type="dxa"/>
+            <w:tcW w:w="4425" w:type="dxa"/>
           </w:tcPr>
           <w:p>
             <w:pPr>
@@ -833,7 +768,7 @@
         </w:trPr>
         <w:tc>
           <w:tcPr>
-            <w:tcW w:w="5365" w:type="dxa"/>
+            <w:tcW w:w="5206" w:type="dxa"/>
           </w:tcPr>
           <w:p>
             <w:pPr>
@@ -850,13 +785,13 @@
                 <w:sz w:val="18"/>
                 <w:szCs w:val="20"/>
               </w:rPr>
-              <w:t xml:space="preserve">A Movimentação de Quarentena aceita destino incompleto e o saldo do lote aprovado desaparece</w:t>
+              <w:t xml:space="preserve">A Movimentação de Quarentena aceita destino incompleto e o saldo do lote some; a remessa da tela comum não finaliza (só com o modo GMM)</w:t>
             </w:r>
           </w:p>
         </w:tc>
         <w:tc>
           <w:tcPr>
-            <w:tcW w:w="4266" w:type="dxa"/>
+            <w:tcW w:w="4425" w:type="dxa"/>
           </w:tcPr>
           <w:p>
             <w:pPr>
@@ -873,7 +808,7 @@
                 <w:sz w:val="18"/>
                 <w:szCs w:val="20"/>
               </w:rPr>
-              <w:t xml:space="preserve">Material aprovado some do controle (art. 124)</w:t>
+              <w:t xml:space="preserve">Material aprovado some do controle; sem registro de distribuição para recolhimento (arts. 124, 346 e 347)</w:t>
             </w:r>
           </w:p>
         </w:tc>
@@ -884,58 +819,7 @@
         </w:trPr>
         <w:tc>
           <w:tcPr>
-            <w:tcW w:w="5365" w:type="dxa"/>
-          </w:tcPr>
-          <w:p>
-            <w:pPr>
-              <w:widowControl/>
-              <w:spacing w:after="0" w:line="276" w:lineRule="auto"/>
-              <w:jc w:val="left"/>
-              <w:rPr>
-                <w:sz w:val="18"/>
-                <w:szCs w:val="18"/>
-              </w:rPr>
-            </w:pPr>
-            <w:r>
-              <w:rPr>
-                <w:sz w:val="18"/>
-                <w:szCs w:val="20"/>
-              </w:rPr>
-              <w:t xml:space="preserve">A remessa da tela comum não finaliza (só finaliza com o modo GMM): a expedição fica travada</w:t>
-            </w:r>
-          </w:p>
-        </w:tc>
-        <w:tc>
-          <w:tcPr>
-            <w:tcW w:w="4266" w:type="dxa"/>
-          </w:tcPr>
-          <w:p>
-            <w:pPr>
-              <w:widowControl/>
-              <w:spacing w:after="0" w:line="276" w:lineRule="auto"/>
-              <w:jc w:val="left"/>
-              <w:rPr>
-                <w:sz w:val="18"/>
-                <w:szCs w:val="18"/>
-              </w:rPr>
-            </w:pPr>
-            <w:r>
-              <w:rPr>
-                <w:sz w:val="18"/>
-                <w:szCs w:val="20"/>
-              </w:rPr>
-              <w:t xml:space="preserve">Sem registro de distribuição para um recolhimento (arts. 346 e 347)</w:t>
-            </w:r>
-          </w:p>
-        </w:tc>
-      </w:tr>
-      <w:tr>
-        <w:trPr>
-          <w:cantSplit/>
-        </w:trPr>
-        <w:tc>
-          <w:tcPr>
-            <w:tcW w:w="5365" w:type="dxa"/>
+            <w:tcW w:w="5206" w:type="dxa"/>
           </w:tcPr>
           <w:p>
             <w:pPr>
@@ -958,7 +842,7 @@
         </w:tc>
         <w:tc>
           <w:tcPr>
-            <w:tcW w:w="4266" w:type="dxa"/>
+            <w:tcW w:w="4425" w:type="dxa"/>
           </w:tcPr>
           <w:p>
             <w:pPr>
@@ -986,7 +870,7 @@
         </w:trPr>
         <w:tc>
           <w:tcPr>
-            <w:tcW w:w="5365" w:type="dxa"/>
+            <w:tcW w:w="5206" w:type="dxa"/>
           </w:tcPr>
           <w:p>
             <w:pPr>
@@ -1003,13 +887,13 @@
                 <w:sz w:val="18"/>
                 <w:szCs w:val="20"/>
               </w:rPr>
-              <w:t xml:space="preserve">O Item não mostra o campo do prazo de reanálise; a agenda não tem o que agendar</w:t>
+              <w:t xml:space="preserve">O Item não mostra o prazo de reanálise; o atendimento não ordena os lotes por validade; no inventário, a mesma pessoa conta e apura</w:t>
             </w:r>
           </w:p>
         </w:tc>
         <w:tc>
           <w:tcPr>
-            <w:tcW w:w="4266" w:type="dxa"/>
+            <w:tcW w:w="4425" w:type="dxa"/>
           </w:tcPr>
           <w:p>
             <w:pPr>
@@ -1026,7 +910,7 @@
                 <w:sz w:val="18"/>
                 <w:szCs w:val="20"/>
               </w:rPr>
-              <w:t xml:space="preserve">Matéria-prima usada depois da data de reteste (art. 189)</w:t>
+              <w:t xml:space="preserve">Matéria-prima usada depois do reteste; lote de validade curta passado adiante; ajuste sem separação de funções (arts. 124 e 189)</w:t>
             </w:r>
           </w:p>
         </w:tc>
@@ -1037,58 +921,7 @@
         </w:trPr>
         <w:tc>
           <w:tcPr>
-            <w:tcW w:w="5365" w:type="dxa"/>
-          </w:tcPr>
-          <w:p>
-            <w:pPr>
-              <w:widowControl/>
-              <w:spacing w:after="0" w:line="276" w:lineRule="auto"/>
-              <w:jc w:val="left"/>
-              <w:rPr>
-                <w:sz w:val="18"/>
-                <w:szCs w:val="18"/>
-              </w:rPr>
-            </w:pPr>
-            <w:r>
-              <w:rPr>
-                <w:sz w:val="18"/>
-                <w:szCs w:val="20"/>
-              </w:rPr>
-              <w:t xml:space="preserve">O atendimento à produção não ordena os lotes por validade e aceita o que vence depois; no inventário, a mesma pessoa conta e apura, e cancelar não pede justificativa</w:t>
-            </w:r>
-          </w:p>
-        </w:tc>
-        <w:tc>
-          <w:tcPr>
-            <w:tcW w:w="4266" w:type="dxa"/>
-          </w:tcPr>
-          <w:p>
-            <w:pPr>
-              <w:widowControl/>
-              <w:spacing w:after="0" w:line="276" w:lineRule="auto"/>
-              <w:jc w:val="left"/>
-              <w:rPr>
-                <w:sz w:val="18"/>
-                <w:szCs w:val="18"/>
-              </w:rPr>
-            </w:pPr>
-            <w:r>
-              <w:rPr>
-                <w:sz w:val="18"/>
-                <w:szCs w:val="20"/>
-              </w:rPr>
-              <w:t xml:space="preserve">Lote de validade curta passado adiante; ajuste de saldo sem separação de funções nem rastro (arts. 124 e 189)</w:t>
-            </w:r>
-          </w:p>
-        </w:tc>
-      </w:tr>
-      <w:tr>
-        <w:trPr>
-          <w:cantSplit/>
-        </w:trPr>
-        <w:tc>
-          <w:tcPr>
-            <w:tcW w:w="5365" w:type="dxa"/>
+            <w:tcW w:w="5206" w:type="dxa"/>
           </w:tcPr>
           <w:p>
             <w:pPr>
@@ -1111,7 +944,7 @@
         </w:tc>
         <w:tc>
           <w:tcPr>
-            <w:tcW w:w="4266" w:type="dxa"/>
+            <w:tcW w:w="4425" w:type="dxa"/>
           </w:tcPr>
           <w:p>
             <w:pPr>
@@ -1253,7 +1086,7 @@
           <w:b/>
           <w:color w:val="000000" w:themeColor="text1"/>
         </w:rPr>
-        <w:t xml:space="preserve">DECISÕES E APOIO PEDIDOS À DIRETORIA</w:t>
+        <w:t xml:space="preserve">ENCERRAMENTO DO MÓDULO (23/10/2026)</w:t>
       </w:r>
     </w:p>
     <w:p>
@@ -1261,6 +1094,94 @@
         <w:keepNext/>
         <w:spacing w:after="0" w:line="252" w:lineRule="auto"/>
       </w:pPr>
+    </w:p>
+    <w:p>
+      <w:pPr>
+        <w:spacing w:after="0" w:line="252" w:lineRule="auto"/>
+        <w:rPr>
+          <w:szCs w:val="20"/>
+        </w:rPr>
+      </w:pPr>
+      <w:r>
+        <w:rPr>
+          <w:b/>
+          <w:bCs/>
+          <w:szCs w:val="20"/>
+        </w:rPr>
+        <w:t xml:space="preserve">Veredito: o Estoque (legado, versão 3.5.1) não está apto para uso em ambiente regulado.</w:t>
+      </w:r>
+      <w:r>
+        <w:rPr>
+          <w:szCs w:val="20"/>
+        </w:rPr>
+        <w:t xml:space="preserve"> O critério de "apto" ainda não foi escrito com a Qualidade; o "não apto" vem só dos 21 defeitos de gravidade alta e de nenhum dos 14 temas da norma ser atendido por completo. </w:t>
+      </w:r>
+      <w:r>
+        <w:rPr>
+          <w:b/>
+          <w:bCs/>
+          <w:szCs w:val="20"/>
+        </w:rPr>
+        <w:t xml:space="preserve">149 de 162 casos</w:t>
+      </w:r>
+      <w:r>
+        <w:rPr>
+          <w:szCs w:val="20"/>
+        </w:rPr>
+        <w:t xml:space="preserve"> com resultado (44 de 46 de prioridade alta) e </w:t>
+      </w:r>
+      <w:r>
+        <w:rPr>
+          <w:b/>
+          <w:bCs/>
+          <w:szCs w:val="20"/>
+        </w:rPr>
+        <w:t xml:space="preserve">76 defeitos</w:t>
+      </w:r>
+      <w:r>
+        <w:rPr>
+          <w:szCs w:val="20"/>
+        </w:rPr>
+        <w:t xml:space="preserve">.</w:t>
+      </w:r>
+    </w:p>
+    <w:p>
+      <w:pPr>
+        <w:spacing w:after="0" w:line="252" w:lineRule="auto"/>
+        <w:rPr>
+          <w:szCs w:val="20"/>
+        </w:rPr>
+      </w:pPr>
+      <w:r>
+        <w:rPr>
+          <w:b/>
+          <w:bCs/>
+          <w:szCs w:val="20"/>
+        </w:rPr>
+        <w:t xml:space="preserve">Sem teste (13 casos):</w:t>
+      </w:r>
+      <w:r>
+        <w:rPr>
+          <w:szCs w:val="20"/>
+        </w:rPr>
+        <w:t xml:space="preserve"> CT-EST-058 e 091 (prioridade alta) e 055, 077, 082, 090, 100, 164, 172 e 192 (bloqueados); 117 e 118 (não se aplicam à tela); 023 (acesso pelo endereço, fora do escopo).</w:t>
+      </w:r>
+    </w:p>
+    <w:p>
+      <w:pPr>
+        <w:spacing w:after="0" w:line="252" w:lineRule="auto"/>
+        <w:rPr>
+          <w:szCs w:val="20"/>
+        </w:rPr>
+      </w:pPr>
+      <w:r>
+        <w:rPr>
+          <w:b/>
+          <w:bCs/>
+          <w:szCs w:val="20"/>
+        </w:rPr>
+        <w:t xml:space="preserve">Lista de reabertura</w:t>
+      </w:r>
     </w:p>
     <w:tbl>
       <w:tblPr>
@@ -1270,9 +1191,9 @@
         <w:tblLook w:val="04A0" w:firstRow="1" w:lastRow="0" w:firstColumn="1" w:lastColumn="0" w:noHBand="0" w:noVBand="1"/>
       </w:tblPr>
       <w:tblGrid>
-        <w:gridCol w:w="488"/>
-        <w:gridCol w:w="5926"/>
-        <w:gridCol w:w="3217"/>
+        <w:gridCol w:w="2106"/>
+        <w:gridCol w:w="4801"/>
+        <w:gridCol w:w="2724"/>
       </w:tblGrid>
       <w:tr>
         <w:trPr>
@@ -1281,7 +1202,7 @@
         </w:trPr>
         <w:tc>
           <w:tcPr>
-            <w:tcW w:w="488" w:type="dxa"/>
+            <w:tcW w:w="2106" w:type="dxa"/>
             <w:shd w:val="clear" w:color="auto" w:fill="D9D9D9" w:themeFill="background1" w:themeFillShade="D9"/>
           </w:tcPr>
           <w:p>
@@ -1303,13 +1224,13 @@
                 <w:sz w:val="18"/>
                 <w:szCs w:val="20"/>
               </w:rPr>
-              <w:t xml:space="preserve">#</w:t>
+              <w:t xml:space="preserve">Quem</w:t>
             </w:r>
           </w:p>
         </w:tc>
         <w:tc>
           <w:tcPr>
-            <w:tcW w:w="5926" w:type="dxa"/>
+            <w:tcW w:w="4801" w:type="dxa"/>
             <w:shd w:val="clear" w:color="auto" w:fill="D9D9D9" w:themeFill="background1" w:themeFillShade="D9"/>
           </w:tcPr>
           <w:p>
@@ -1331,13 +1252,13 @@
                 <w:sz w:val="18"/>
                 <w:szCs w:val="20"/>
               </w:rPr>
-              <w:t xml:space="preserve">Pedido</w:t>
+              <w:t xml:space="preserve">O que fazer</w:t>
             </w:r>
           </w:p>
         </w:tc>
         <w:tc>
           <w:tcPr>
-            <w:tcW w:w="3217" w:type="dxa"/>
+            <w:tcW w:w="2724" w:type="dxa"/>
             <w:shd w:val="clear" w:color="auto" w:fill="D9D9D9" w:themeFill="background1" w:themeFillShade="D9"/>
           </w:tcPr>
           <w:p>
@@ -1359,7 +1280,7 @@
                 <w:sz w:val="18"/>
                 <w:szCs w:val="20"/>
               </w:rPr>
-              <w:t xml:space="preserve">Por quê</w:t>
+              <w:t xml:space="preserve">Destrava</w:t>
             </w:r>
           </w:p>
         </w:tc>
@@ -1370,7 +1291,7 @@
         </w:trPr>
         <w:tc>
           <w:tcPr>
-            <w:tcW w:w="488" w:type="dxa"/>
+            <w:tcW w:w="2106" w:type="dxa"/>
           </w:tcPr>
           <w:p>
             <w:pPr>
@@ -1387,13 +1308,13 @@
                 <w:sz w:val="18"/>
                 <w:szCs w:val="20"/>
               </w:rPr>
-              <w:t xml:space="preserve">1</w:t>
+              <w:t xml:space="preserve">DBA</w:t>
             </w:r>
           </w:p>
         </w:tc>
         <w:tc>
           <w:tcPr>
-            <w:tcW w:w="5926" w:type="dxa"/>
+            <w:tcW w:w="4801" w:type="dxa"/>
           </w:tcPr>
           <w:p>
             <w:pPr>
@@ -1410,13 +1331,13 @@
                 <w:sz w:val="18"/>
                 <w:szCs w:val="20"/>
               </w:rPr>
-              <w:t xml:space="preserve">Aprovar as dez correções como condição para o sistema entrar em uso</w:t>
+              <w:t xml:space="preserve">Dizer qual instrução da rotina de finalização do recebimento falha (DV-EST-016) e o que há de diferente no lote TESTEPA001 (DV-EST-047)</w:t>
             </w:r>
           </w:p>
         </w:tc>
         <w:tc>
           <w:tcPr>
-            <w:tcW w:w="3217" w:type="dxa"/>
+            <w:tcW w:w="2724" w:type="dxa"/>
           </w:tcPr>
           <w:p>
             <w:pPr>
@@ -1433,7 +1354,7 @@
                 <w:sz w:val="18"/>
                 <w:szCs w:val="20"/>
               </w:rPr>
-              <w:t xml:space="preserve">Sem elas, o módulo não passa numa inspeção da ANVISA</w:t>
+              <w:t xml:space="preserve">Endereçamento do recebimento; saída da amostra desse lote</w:t>
             </w:r>
           </w:p>
         </w:tc>
@@ -1444,7 +1365,7 @@
         </w:trPr>
         <w:tc>
           <w:tcPr>
-            <w:tcW w:w="488" w:type="dxa"/>
+            <w:tcW w:w="2106" w:type="dxa"/>
           </w:tcPr>
           <w:p>
             <w:pPr>
@@ -1461,13 +1382,13 @@
                 <w:sz w:val="18"/>
                 <w:szCs w:val="20"/>
               </w:rPr>
-              <w:t xml:space="preserve">2</w:t>
+              <w:t xml:space="preserve">Produção</w:t>
             </w:r>
           </w:p>
         </w:tc>
         <w:tc>
           <w:tcPr>
-            <w:tcW w:w="5926" w:type="dxa"/>
+            <w:tcW w:w="4801" w:type="dxa"/>
           </w:tcPr>
           <w:p>
             <w:pPr>
@@ -1484,13 +1405,13 @@
                 <w:sz w:val="18"/>
                 <w:szCs w:val="20"/>
               </w:rPr>
-              <w:t xml:space="preserve">Pedir ao DBA: qual instrução do Endereçamento falha, e ligar uma função profissional à configuração 19 (destrava a Produção)</w:t>
+              <w:t xml:space="preserve">Ligar uma função profissional à configuração 19 (e 28 e 29) para aprovar o Lote Padrão (DV-EST-076)</w:t>
             </w:r>
           </w:p>
         </w:tc>
         <w:tc>
           <w:tcPr>
-            <w:tcW w:w="3217" w:type="dxa"/>
+            <w:tcW w:w="2724" w:type="dxa"/>
           </w:tcPr>
           <w:p>
             <w:pPr>
@@ -1507,7 +1428,7 @@
                 <w:sz w:val="18"/>
                 <w:szCs w:val="20"/>
               </w:rPr>
-              <w:t xml:space="preserve">O teste pela tela não alcança essas causas</w:t>
+              <w:t xml:space="preserve">CT-EST-091 (alta), 082, 090 e 100</w:t>
             </w:r>
           </w:p>
         </w:tc>
@@ -1518,7 +1439,7 @@
         </w:trPr>
         <w:tc>
           <w:tcPr>
-            <w:tcW w:w="488" w:type="dxa"/>
+            <w:tcW w:w="2106" w:type="dxa"/>
           </w:tcPr>
           <w:p>
             <w:pPr>
@@ -1535,13 +1456,13 @@
                 <w:sz w:val="18"/>
                 <w:szCs w:val="20"/>
               </w:rPr>
-              <w:t xml:space="preserve">3</w:t>
+              <w:t xml:space="preserve">Desenvolvimento</w:t>
             </w:r>
           </w:p>
         </w:tc>
         <w:tc>
           <w:tcPr>
-            <w:tcW w:w="5926" w:type="dxa"/>
+            <w:tcW w:w="4801" w:type="dxa"/>
           </w:tcPr>
           <w:p>
             <w:pPr>
@@ -1558,13 +1479,13 @@
                 <w:sz w:val="18"/>
                 <w:szCs w:val="20"/>
               </w:rPr>
-              <w:t xml:space="preserve">Definir quem é a Pessoa Delegada e se a liberação do lote é a aprovação do laudo ou uma etapa a mais</w:t>
+              <w:t xml:space="preserve">DV-EST-043 (reanálise no Item), 005 (perfil novo não abre o Estoque), 067 (Central de Pesagem), 077 (Pedido de Compra sem funções), 074 e 075 (Regra de Estabilidade)</w:t>
             </w:r>
           </w:p>
         </w:tc>
         <w:tc>
           <w:tcPr>
-            <w:tcW w:w="3217" w:type="dxa"/>
+            <w:tcW w:w="2724" w:type="dxa"/>
           </w:tcPr>
           <w:p>
             <w:pPr>
@@ -1581,7 +1502,7 @@
                 <w:sz w:val="18"/>
                 <w:szCs w:val="20"/>
               </w:rPr>
-              <w:t xml:space="preserve">Define a correção mais importante do módulo</w:t>
+              <w:t xml:space="preserve">CT-EST-055 e 058 (alta), 192, 077, 164, 172 e 173</w:t>
             </w:r>
           </w:p>
         </w:tc>
@@ -1592,7 +1513,7 @@
         </w:trPr>
         <w:tc>
           <w:tcPr>
-            <w:tcW w:w="488" w:type="dxa"/>
+            <w:tcW w:w="2106" w:type="dxa"/>
           </w:tcPr>
           <w:p>
             <w:pPr>
@@ -1609,13 +1530,13 @@
                 <w:sz w:val="18"/>
                 <w:szCs w:val="20"/>
               </w:rPr>
-              <w:t xml:space="preserve">4</w:t>
+              <w:t xml:space="preserve">Responsável</w:t>
             </w:r>
           </w:p>
         </w:tc>
         <w:tc>
           <w:tcPr>
-            <w:tcW w:w="5926" w:type="dxa"/>
+            <w:tcW w:w="4801" w:type="dxa"/>
           </w:tcPr>
           <w:p>
             <w:pPr>
@@ -1632,13 +1553,13 @@
                 <w:sz w:val="18"/>
                 <w:szCs w:val="20"/>
               </w:rPr>
-              <w:t xml:space="preserve">Decidir com a Garantia da Qualidade: o que é fornecedor aprovado; se a sobra devolvida precisa de nova análise; o prazo das amostras de retenção</w:t>
+              <w:t xml:space="preserve">Decidir se o CT-EST-023 volta ao escopo</w:t>
             </w:r>
           </w:p>
         </w:tc>
         <w:tc>
           <w:tcPr>
-            <w:tcW w:w="3217" w:type="dxa"/>
+            <w:tcW w:w="2724" w:type="dxa"/>
           </w:tcPr>
           <w:p>
             <w:pPr>
@@ -1655,81 +1576,7 @@
                 <w:sz w:val="18"/>
                 <w:szCs w:val="20"/>
               </w:rPr>
-              <w:t xml:space="preserve">Perguntas que o sistema não responde e a norma exige</w:t>
-            </w:r>
-          </w:p>
-        </w:tc>
-      </w:tr>
-      <w:tr>
-        <w:trPr>
-          <w:cantSplit/>
-        </w:trPr>
-        <w:tc>
-          <w:tcPr>
-            <w:tcW w:w="488" w:type="dxa"/>
-          </w:tcPr>
-          <w:p>
-            <w:pPr>
-              <w:widowControl/>
-              <w:spacing w:after="0" w:line="276" w:lineRule="auto"/>
-              <w:jc w:val="left"/>
-              <w:rPr>
-                <w:sz w:val="18"/>
-                <w:szCs w:val="18"/>
-              </w:rPr>
-            </w:pPr>
-            <w:r>
-              <w:rPr>
-                <w:sz w:val="18"/>
-                <w:szCs w:val="20"/>
-              </w:rPr>
-              <w:t xml:space="preserve">5</w:t>
-            </w:r>
-          </w:p>
-        </w:tc>
-        <w:tc>
-          <w:tcPr>
-            <w:tcW w:w="5926" w:type="dxa"/>
-          </w:tcPr>
-          <w:p>
-            <w:pPr>
-              <w:widowControl/>
-              <w:spacing w:after="0" w:line="276" w:lineRule="auto"/>
-              <w:jc w:val="left"/>
-              <w:rPr>
-                <w:sz w:val="18"/>
-                <w:szCs w:val="18"/>
-              </w:rPr>
-            </w:pPr>
-            <w:r>
-              <w:rPr>
-                <w:sz w:val="18"/>
-                <w:szCs w:val="20"/>
-              </w:rPr>
-              <w:t xml:space="preserve">Decidir se a devolução e a pesagem esperam o módulo Produção e como criar a Ordem de Produção de teste</w:t>
-            </w:r>
-          </w:p>
-        </w:tc>
-        <w:tc>
-          <w:tcPr>
-            <w:tcW w:w="3217" w:type="dxa"/>
-          </w:tcPr>
-          <w:p>
-            <w:pPr>
-              <w:widowControl/>
-              <w:spacing w:after="0" w:line="276" w:lineRule="auto"/>
-              <w:jc w:val="left"/>
-              <w:rPr>
-                <w:sz w:val="18"/>
-                <w:szCs w:val="18"/>
-              </w:rPr>
-            </w:pPr>
-            <w:r>
-              <w:rPr>
-                <w:sz w:val="18"/>
-                <w:szCs w:val="20"/>
-              </w:rPr>
-              <w:t xml:space="preserve">Sem ela a devolução fica sem Ordem de Produção</w:t>
+              <w:t xml:space="preserve">CT-EST-023</w:t>
             </w:r>
           </w:p>
         </w:tc>
@@ -1739,6 +1586,28 @@
       <w:pPr>
         <w:spacing w:after="0" w:line="252" w:lineRule="auto"/>
       </w:pPr>
+    </w:p>
+    <w:p>
+      <w:pPr>
+        <w:spacing w:after="0" w:line="252" w:lineRule="auto"/>
+        <w:rPr>
+          <w:szCs w:val="20"/>
+        </w:rPr>
+      </w:pPr>
+      <w:r>
+        <w:rPr>
+          <w:b/>
+          <w:bCs/>
+          <w:szCs w:val="20"/>
+        </w:rPr>
+        <w:t xml:space="preserve">Decisões pedidas à diretoria:</w:t>
+      </w:r>
+      <w:r>
+        <w:rPr>
+          <w:szCs w:val="20"/>
+        </w:rPr>
+        <w:t xml:space="preserve"> (1) aprovar as dez correções como condição para o sistema entrar em uso; (2) definir quem é a Pessoa Delegada e se a liberação do lote é a aprovação do laudo ou uma etapa a mais; (3) decidir com a Garantia da Qualidade o que é fornecedor aprovado, se a sobra devolvida precisa de nova análise e o prazo das amostras de retenção.</w:t>
+      </w:r>
     </w:p>
     <w:sectPr>
       <w:headerReference w:type="even" r:id="rId62"/>

</xml_diff>

<commit_message>
Portal: rodadas 12A, 12B e 12C do Estoque, rodadas 2 e 3 da GQ, registros de defeitos (Estoque 150, GQ 234, Controle de Documentos 28), situacoes das telas e entregaveis do Estoque 1.6
Co-Authored-By: Claude Sonnet 5.5 <noreply@anthropic.com>
Claude-Session: https://claude.ai/code/session_016ZyaVQ3Fat8knNf78iQG9U
</commit_message>
<xml_diff>
--- a/documentacao/arquivos/estoque/LabMedSys - Modulo Estoque - Resumo Executivo.docx
+++ b/documentacao/arquivos/estoque/LabMedSys - Modulo Estoque - Resumo Executivo.docx
@@ -28,7 +28,7 @@
           <w:color w:val="595959"/>
           <w:szCs w:val="20"/>
         </w:rPr>
-        <w:t xml:space="preserve">LabMedSys · Módulo Estoque · 23/10/2026 · André Nardacci · documento versão 1.5</w:t>
+        <w:t xml:space="preserve">LabMedSys · Módulo Estoque · 25/10/2026 · André Nardacci · documento versão 1.6</w:t>
       </w:r>
     </w:p>
     <w:p>
@@ -50,7 +50,7 @@
         <w:rPr>
           <w:szCs w:val="20"/>
         </w:rPr>
-        <w:t xml:space="preserve"> Resumo para a diretoria, atualizado em 23/10/2026 (onze rodadas de testes, 07 a 22/10). O detalhe está no Relatório de Testes, na Conformidade Regulatória e nos Defeitos para Correção.</w:t>
+        <w:t xml:space="preserve"> Resumo para a diretoria, atualizado em 25/10/2026 (catorze rodadas de testes, 07 a 24/10). O detalhe está no Relatório de Testes, na Conformidade Regulatória e nos Defeitos para Correção.</w:t>
       </w:r>
     </w:p>
     <w:p>
@@ -115,7 +115,7 @@
         <w:rPr>
           <w:szCs w:val="20"/>
         </w:rPr>
-        <w:t xml:space="preserve">. O lote passa pela quarentena e pelo laudo do Controle da Qualidade, e isso funciona. Mas o recebimento aceita fornecedor reprovado e lote vencido, a entrada de produto acabado aceita lote inventado e a liberação do lote é feita por qualquer usuário, sem a Pessoa Delegada. Os testes acrescentaram falhas graves: a remessa da tela comum não finaliza, a amostra de retenção sai antes do vencimento sem aviso, a Movimentação de Quarentena perde o saldo, a Central de Pesagem dá erro, o atendimento aceita o lote que vence depois e </w:t>
+        <w:t xml:space="preserve">. O lote passa pela quarentena e pelo laudo do Controle da Qualidade, e isso funciona. Mas o recebimento aceita fornecedor reprovado e lote vencido, a entrada de produto acabado aceita lote inventado, a liberação do lote é feita por qualquer usuário e </w:t>
       </w:r>
       <w:r>
         <w:rPr>
@@ -129,7 +129,21 @@
         <w:rPr>
           <w:szCs w:val="20"/>
         </w:rPr>
-        <w:t xml:space="preserve">, o que impede a Produção de pedir a primeira ordem.</w:t>
+        <w:t xml:space="preserve">, o que impede a Produção de pedir a primeira ordem. As três últimas rodadas (24/10) </w:t>
+      </w:r>
+      <w:r>
+        <w:rPr>
+          <w:b/>
+          <w:bCs/>
+          <w:szCs w:val="20"/>
+        </w:rPr>
+        <w:t xml:space="preserve">só reforçaram a conclusão</w:t>
+      </w:r>
+      <w:r>
+        <w:rPr>
+          <w:szCs w:val="20"/>
+        </w:rPr>
+        <w:t xml:space="preserve">.</w:t>
       </w:r>
     </w:p>
     <w:p>
@@ -199,8 +213,8 @@
         <w:tblLook w:val="04A0" w:firstRow="1" w:lastRow="0" w:firstColumn="1" w:lastColumn="0" w:noHBand="0" w:noVBand="1"/>
       </w:tblPr>
       <w:tblGrid>
-        <w:gridCol w:w="2511"/>
-        <w:gridCol w:w="7120"/>
+        <w:gridCol w:w="2402"/>
+        <w:gridCol w:w="7229"/>
       </w:tblGrid>
       <w:tr>
         <w:trPr>
@@ -209,7 +223,7 @@
         </w:trPr>
         <w:tc>
           <w:tcPr>
-            <w:tcW w:w="2511" w:type="dxa"/>
+            <w:tcW w:w="2402" w:type="dxa"/>
             <w:shd w:val="clear" w:color="auto" w:fill="D9D9D9" w:themeFill="background1" w:themeFillShade="D9"/>
           </w:tcPr>
           <w:p>
@@ -237,7 +251,7 @@
         </w:tc>
         <w:tc>
           <w:tcPr>
-            <w:tcW w:w="7120" w:type="dxa"/>
+            <w:tcW w:w="7229" w:type="dxa"/>
             <w:shd w:val="clear" w:color="auto" w:fill="D9D9D9" w:themeFill="background1" w:themeFillShade="D9"/>
           </w:tcPr>
           <w:p>
@@ -270,7 +284,7 @@
         </w:trPr>
         <w:tc>
           <w:tcPr>
-            <w:tcW w:w="2511" w:type="dxa"/>
+            <w:tcW w:w="2402" w:type="dxa"/>
           </w:tcPr>
           <w:p>
             <w:pPr>
@@ -293,7 +307,7 @@
         </w:tc>
         <w:tc>
           <w:tcPr>
-            <w:tcW w:w="7120" w:type="dxa"/>
+            <w:tcW w:w="7229" w:type="dxa"/>
           </w:tcPr>
           <w:p>
             <w:pPr>
@@ -310,7 +324,7 @@
                 <w:sz w:val="18"/>
                 <w:szCs w:val="20"/>
               </w:rPr>
-              <w:t xml:space="preserve">Dez fluxos, 171 regras de negócio, 98 telas, modelo de dados, 24 riscos (18 de prioridade alta), 12 achados de segurança e o modelo ideal</w:t>
+              <w:t xml:space="preserve">Dez fluxos, 99 telas documentadas uma a uma, 1.291 regras de negócio, modelo de dados, 24 riscos, 16 achados de segurança e o modelo ideal</w:t>
             </w:r>
           </w:p>
         </w:tc>
@@ -321,7 +335,7 @@
         </w:trPr>
         <w:tc>
           <w:tcPr>
-            <w:tcW w:w="2511" w:type="dxa"/>
+            <w:tcW w:w="2402" w:type="dxa"/>
           </w:tcPr>
           <w:p>
             <w:pPr>
@@ -344,74 +358,7 @@
         </w:tc>
         <w:tc>
           <w:tcPr>
-            <w:tcW w:w="7120" w:type="dxa"/>
-          </w:tcPr>
-          <w:p>
-            <w:pPr>
-              <w:widowControl/>
-              <w:spacing w:after="0" w:line="276" w:lineRule="auto"/>
-              <w:jc w:val="left"/>
-              <w:rPr>
-                <w:sz w:val="18"/>
-                <w:szCs w:val="18"/>
-              </w:rPr>
-            </w:pPr>
-            <w:r>
-              <w:rPr>
-                <w:sz w:val="18"/>
-                <w:szCs w:val="20"/>
-              </w:rPr>
-              <w:t xml:space="preserve">162 casos; </w:t>
-            </w:r>
-            <w:r>
-              <w:rPr>
-                <w:sz w:val="18"/>
-                <w:b/>
-                <w:bCs/>
-                <w:szCs w:val="20"/>
-              </w:rPr>
-              <w:t xml:space="preserve">149 com resultado</w:t>
-            </w:r>
-            <w:r>
-              <w:rPr>
-                <w:sz w:val="18"/>
-                <w:szCs w:val="20"/>
-              </w:rPr>
-              <w:t xml:space="preserve"> em onze rodadas, 44 dos 46 de prioridade alta; os 2 restantes estão bloqueados (reanálise no Item e lote padrão sem aprovação)</w:t>
-            </w:r>
-          </w:p>
-        </w:tc>
-      </w:tr>
-      <w:tr>
-        <w:trPr>
-          <w:cantSplit/>
-        </w:trPr>
-        <w:tc>
-          <w:tcPr>
-            <w:tcW w:w="2511" w:type="dxa"/>
-          </w:tcPr>
-          <w:p>
-            <w:pPr>
-              <w:widowControl/>
-              <w:spacing w:after="0" w:line="276" w:lineRule="auto"/>
-              <w:jc w:val="left"/>
-              <w:rPr>
-                <w:sz w:val="18"/>
-                <w:szCs w:val="18"/>
-              </w:rPr>
-            </w:pPr>
-            <w:r>
-              <w:rPr>
-                <w:sz w:val="18"/>
-                <w:szCs w:val="20"/>
-              </w:rPr>
-              <w:t xml:space="preserve">Desvios encontrados</w:t>
-            </w:r>
-          </w:p>
-        </w:tc>
-        <w:tc>
-          <w:tcPr>
-            <w:tcW w:w="7120" w:type="dxa"/>
+            <w:tcW w:w="7229" w:type="dxa"/>
           </w:tcPr>
           <w:p>
             <w:pPr>
@@ -430,14 +377,141 @@
                 <w:bCs/>
                 <w:szCs w:val="20"/>
               </w:rPr>
-              <w:t xml:space="preserve">76</w:t>
+              <w:t xml:space="preserve">14 rodadas</w:t>
             </w:r>
             <w:r>
               <w:rPr>
                 <w:sz w:val="18"/>
                 <w:szCs w:val="20"/>
               </w:rPr>
-              <w:t xml:space="preserve">: 21 de gravidade alta, 40 média e 15 baixa; 10 são de acesso e segurança</w:t>
+              <w:t xml:space="preserve">; </w:t>
+            </w:r>
+            <w:r>
+              <w:rPr>
+                <w:sz w:val="18"/>
+                <w:b/>
+                <w:bCs/>
+                <w:szCs w:val="20"/>
+              </w:rPr>
+              <w:t xml:space="preserve">552 de 601 linhas de resultado</w:t>
+            </w:r>
+            <w:r>
+              <w:rPr>
+                <w:sz w:val="18"/>
+                <w:szCs w:val="20"/>
+              </w:rPr>
+              <w:t xml:space="preserve"> conclusivas (passos e casos); 44 dos 46 casos de prioridade alta do plano (os 2 restantes estão bloqueados)</w:t>
+            </w:r>
+          </w:p>
+        </w:tc>
+      </w:tr>
+      <w:tr>
+        <w:trPr>
+          <w:cantSplit/>
+        </w:trPr>
+        <w:tc>
+          <w:tcPr>
+            <w:tcW w:w="2402" w:type="dxa"/>
+          </w:tcPr>
+          <w:p>
+            <w:pPr>
+              <w:widowControl/>
+              <w:spacing w:after="0" w:line="276" w:lineRule="auto"/>
+              <w:jc w:val="left"/>
+              <w:rPr>
+                <w:sz w:val="18"/>
+                <w:szCs w:val="18"/>
+              </w:rPr>
+            </w:pPr>
+            <w:r>
+              <w:rPr>
+                <w:sz w:val="18"/>
+                <w:szCs w:val="20"/>
+              </w:rPr>
+              <w:t xml:space="preserve">Defeitos encontrados</w:t>
+            </w:r>
+          </w:p>
+        </w:tc>
+        <w:tc>
+          <w:tcPr>
+            <w:tcW w:w="7229" w:type="dxa"/>
+          </w:tcPr>
+          <w:p>
+            <w:pPr>
+              <w:widowControl/>
+              <w:spacing w:after="0" w:line="276" w:lineRule="auto"/>
+              <w:jc w:val="left"/>
+              <w:rPr>
+                <w:sz w:val="18"/>
+                <w:szCs w:val="18"/>
+              </w:rPr>
+            </w:pPr>
+            <w:r>
+              <w:rPr>
+                <w:sz w:val="18"/>
+                <w:b/>
+                <w:bCs/>
+                <w:szCs w:val="20"/>
+              </w:rPr>
+              <w:t xml:space="preserve">150, todos abertos</w:t>
+            </w:r>
+            <w:r>
+              <w:rPr>
+                <w:sz w:val="18"/>
+                <w:szCs w:val="20"/>
+              </w:rPr>
+              <w:t xml:space="preserve">: 55 de gravidade alta, 75 média e 20 baixa; 14 de acesso e segurança. As 3 últimas rodadas acrescentaram 74</w:t>
+            </w:r>
+          </w:p>
+        </w:tc>
+      </w:tr>
+      <w:tr>
+        <w:trPr>
+          <w:cantSplit/>
+        </w:trPr>
+        <w:tc>
+          <w:tcPr>
+            <w:tcW w:w="2402" w:type="dxa"/>
+          </w:tcPr>
+          <w:p>
+            <w:pPr>
+              <w:widowControl/>
+              <w:spacing w:after="0" w:line="276" w:lineRule="auto"/>
+              <w:jc w:val="left"/>
+              <w:rPr>
+                <w:sz w:val="18"/>
+                <w:szCs w:val="18"/>
+              </w:rPr>
+            </w:pPr>
+            <w:r>
+              <w:rPr>
+                <w:sz w:val="18"/>
+                <w:szCs w:val="20"/>
+              </w:rPr>
+              <w:t xml:space="preserve">Telas do menu (99)</w:t>
+            </w:r>
+          </w:p>
+        </w:tc>
+        <w:tc>
+          <w:tcPr>
+            <w:tcW w:w="7229" w:type="dxa"/>
+          </w:tcPr>
+          <w:p>
+            <w:pPr>
+              <w:widowControl/>
+              <w:spacing w:after="0" w:line="276" w:lineRule="auto"/>
+              <w:jc w:val="left"/>
+              <w:rPr>
+                <w:sz w:val="18"/>
+                <w:szCs w:val="18"/>
+              </w:rPr>
+            </w:pPr>
+            <w:r>
+              <w:rPr>
+                <w:sz w:val="18"/>
+                <w:szCs w:val="20"/>
+              </w:rPr>
+              <w:t xml:space="preserve">4 funcionam; 33 com falhas; 53 com falha grave; 3 bloqueadas no teste; 6 não testadas</w:t>
             </w:r>
           </w:p>
         </w:tc>
@@ -493,8 +567,8 @@
         <w:tblLook w:val="04A0" w:firstRow="1" w:lastRow="0" w:firstColumn="1" w:lastColumn="0" w:noHBand="0" w:noVBand="1"/>
       </w:tblPr>
       <w:tblGrid>
-        <w:gridCol w:w="5206"/>
-        <w:gridCol w:w="4425"/>
+        <w:gridCol w:w="5764"/>
+        <w:gridCol w:w="3867"/>
       </w:tblGrid>
       <w:tr>
         <w:trPr>
@@ -503,7 +577,7 @@
         </w:trPr>
         <w:tc>
           <w:tcPr>
-            <w:tcW w:w="5206" w:type="dxa"/>
+            <w:tcW w:w="5764" w:type="dxa"/>
             <w:shd w:val="clear" w:color="auto" w:fill="D9D9D9" w:themeFill="background1" w:themeFillShade="D9"/>
           </w:tcPr>
           <w:p>
@@ -531,7 +605,7 @@
         </w:tc>
         <w:tc>
           <w:tcPr>
-            <w:tcW w:w="4425" w:type="dxa"/>
+            <w:tcW w:w="3867" w:type="dxa"/>
             <w:shd w:val="clear" w:color="auto" w:fill="D9D9D9" w:themeFill="background1" w:themeFillShade="D9"/>
           </w:tcPr>
           <w:p>
@@ -564,7 +638,7 @@
         </w:trPr>
         <w:tc>
           <w:tcPr>
-            <w:tcW w:w="5206" w:type="dxa"/>
+            <w:tcW w:w="5764" w:type="dxa"/>
           </w:tcPr>
           <w:p>
             <w:pPr>
@@ -581,13 +655,13 @@
                 <w:sz w:val="18"/>
                 <w:szCs w:val="20"/>
               </w:rPr>
-              <w:t xml:space="preserve">O Endereçamento diz "sucesso" e não grava: pelo recebimento, o lote não chega à quarentena nem ao CQ</w:t>
+              <w:t xml:space="preserve">O Endereçamento diz "sucesso" e não grava, e a conferência dá erro: pelo recebimento, o lote não chega à quarentena nem ao CQ</w:t>
             </w:r>
           </w:p>
         </w:tc>
         <w:tc>
           <w:tcPr>
-            <w:tcW w:w="4425" w:type="dxa"/>
+            <w:tcW w:w="3867" w:type="dxa"/>
           </w:tcPr>
           <w:p>
             <w:pPr>
@@ -604,7 +678,7 @@
                 <w:sz w:val="18"/>
                 <w:szCs w:val="20"/>
               </w:rPr>
-              <w:t xml:space="preserve">O sistema afirma o que não aconteceu (art. 124); causa no banco, depende do DBA</w:t>
+              <w:t xml:space="preserve">O sistema afirma o que não aconteceu (art. 124); depende do DBA</w:t>
             </w:r>
           </w:p>
         </w:tc>
@@ -615,7 +689,7 @@
         </w:trPr>
         <w:tc>
           <w:tcPr>
-            <w:tcW w:w="5206" w:type="dxa"/>
+            <w:tcW w:w="5764" w:type="dxa"/>
           </w:tcPr>
           <w:p>
             <w:pPr>
@@ -632,13 +706,13 @@
                 <w:sz w:val="18"/>
                 <w:szCs w:val="20"/>
               </w:rPr>
-              <w:t xml:space="preserve">Fornecedor reprovado e lote vencido são aceitos; a entrada de produto acabado aceita lote inventado, sem ordem de produção</w:t>
+              <w:t xml:space="preserve">Fornecedor reprovado e lote vencido são aceitos; a entrada de produto acabado aceita lote inventado; o CQ aprova o laudo de um lote vencido e ele é movimentado</w:t>
             </w:r>
           </w:p>
         </w:tc>
         <w:tc>
           <w:tcPr>
-            <w:tcW w:w="4425" w:type="dxa"/>
+            <w:tcW w:w="3867" w:type="dxa"/>
           </w:tcPr>
           <w:p>
             <w:pPr>
@@ -655,7 +729,7 @@
                 <w:sz w:val="18"/>
                 <w:szCs w:val="20"/>
               </w:rPr>
-              <w:t xml:space="preserve">Material de fonte não qualificada, fora da validade ou sem origem rastreável (arts. 8º VI, 124, 164 e 189)</w:t>
+              <w:t xml:space="preserve">Material de fonte não qualificada, fora da validade ou sem origem (arts. 8º VI, 121, 124, 164 e 189)</w:t>
             </w:r>
           </w:p>
         </w:tc>
@@ -666,7 +740,7 @@
         </w:trPr>
         <w:tc>
           <w:tcPr>
-            <w:tcW w:w="5206" w:type="dxa"/>
+            <w:tcW w:w="5764" w:type="dxa"/>
           </w:tcPr>
           <w:p>
             <w:pPr>
@@ -683,13 +757,13 @@
                 <w:sz w:val="18"/>
                 <w:szCs w:val="20"/>
               </w:rPr>
-              <w:t xml:space="preserve">Ninguém aprova o lote padrão; sem ele a Produção não pede ordem de produção</w:t>
+              <w:t xml:space="preserve">Ninguém aprova o lote padrão; a liberação do lote é a aprovação do laudo, por qualquer usuário, e reprovar não exige motivo</w:t>
             </w:r>
           </w:p>
         </w:tc>
         <w:tc>
           <w:tcPr>
-            <w:tcW w:w="4425" w:type="dxa"/>
+            <w:tcW w:w="3867" w:type="dxa"/>
           </w:tcPr>
           <w:p>
             <w:pPr>
@@ -706,7 +780,7 @@
                 <w:sz w:val="18"/>
                 <w:szCs w:val="20"/>
               </w:rPr>
-              <w:t xml:space="preserve">Lote padrão sem aprovação (arts. 133 a 135)</w:t>
+              <w:t xml:space="preserve">Produção sem lote padrão aprovado; decisão crítica sem a pessoa designada (arts. 8º XV e 133 a 135)</w:t>
             </w:r>
           </w:p>
         </w:tc>
@@ -717,7 +791,7 @@
         </w:trPr>
         <w:tc>
           <w:tcPr>
-            <w:tcW w:w="5206" w:type="dxa"/>
+            <w:tcW w:w="5764" w:type="dxa"/>
           </w:tcPr>
           <w:p>
             <w:pPr>
@@ -734,13 +808,13 @@
                 <w:sz w:val="18"/>
                 <w:szCs w:val="20"/>
               </w:rPr>
-              <w:t xml:space="preserve">A liberação do lote é a aprovação do laudo, por qualquer usuário; reprovar não exige motivo</w:t>
+              <w:t xml:space="preserve">A Movimentação de Quarentena e o Endereçamento aceitam destino incompleto; a remessa da tela comum não finaliza</w:t>
             </w:r>
           </w:p>
         </w:tc>
         <w:tc>
           <w:tcPr>
-            <w:tcW w:w="4425" w:type="dxa"/>
+            <w:tcW w:w="3867" w:type="dxa"/>
           </w:tcPr>
           <w:p>
             <w:pPr>
@@ -757,7 +831,7 @@
                 <w:sz w:val="18"/>
                 <w:szCs w:val="20"/>
               </w:rPr>
-              <w:t xml:space="preserve">Decisão crítica sem a pessoa designada e sem prova (art. 8º, XV)</w:t>
+              <w:t xml:space="preserve">Material aprovado some do controle; sem registro para recolhimento (arts. 124, 346 e 347)</w:t>
             </w:r>
           </w:p>
         </w:tc>
@@ -768,7 +842,7 @@
         </w:trPr>
         <w:tc>
           <w:tcPr>
-            <w:tcW w:w="5206" w:type="dxa"/>
+            <w:tcW w:w="5764" w:type="dxa"/>
           </w:tcPr>
           <w:p>
             <w:pPr>
@@ -785,13 +859,13 @@
                 <w:sz w:val="18"/>
                 <w:szCs w:val="20"/>
               </w:rPr>
-              <w:t xml:space="preserve">A Movimentação de Quarentena aceita destino incompleto e o saldo do lote some; a remessa da tela comum não finaliza (só com o modo GMM)</w:t>
+              <w:t xml:space="preserve">A amostra de retenção sai antes do vencimento; o atendimento não ordena os lotes por validade; no inventário a mesma pessoa conta, justifica e executa o ajuste, sem motivo nem registro</w:t>
             </w:r>
           </w:p>
         </w:tc>
         <w:tc>
           <w:tcPr>
-            <w:tcW w:w="4425" w:type="dxa"/>
+            <w:tcW w:w="3867" w:type="dxa"/>
           </w:tcPr>
           <w:p>
             <w:pPr>
@@ -808,7 +882,7 @@
                 <w:sz w:val="18"/>
                 <w:szCs w:val="20"/>
               </w:rPr>
-              <w:t xml:space="preserve">Material aprovado some do controle; sem registro de distribuição para recolhimento (arts. 124, 346 e 347)</w:t>
+              <w:t xml:space="preserve">Amostras sem prazo; lote de validade curta passado adiante; ajuste sem separação de funções (arts. 14 VIII, 124 e 189)</w:t>
             </w:r>
           </w:p>
         </w:tc>
@@ -819,7 +893,7 @@
         </w:trPr>
         <w:tc>
           <w:tcPr>
-            <w:tcW w:w="5206" w:type="dxa"/>
+            <w:tcW w:w="5764" w:type="dxa"/>
           </w:tcPr>
           <w:p>
             <w:pPr>
@@ -836,13 +910,13 @@
                 <w:sz w:val="18"/>
                 <w:szCs w:val="20"/>
               </w:rPr>
-              <w:t xml:space="preserve">A amostra de retenção pode sair antes do vencimento do lote, sem aviso nem justificativa</w:t>
+              <w:t xml:space="preserve">Mudança de cadastro sem rastro (grupo, item, centro de custo, parâmetros); cadastro em uso pode ser excluído; histórico do lote sem usuário nem laudo</w:t>
             </w:r>
           </w:p>
         </w:tc>
         <w:tc>
           <w:tcPr>
-            <w:tcW w:w="4425" w:type="dxa"/>
+            <w:tcW w:w="3867" w:type="dxa"/>
           </w:tcPr>
           <w:p>
             <w:pPr>
@@ -859,7 +933,7 @@
                 <w:sz w:val="18"/>
                 <w:szCs w:val="20"/>
               </w:rPr>
-              <w:t xml:space="preserve">Amostras sem controle pelo prazo (art. 14, VIII)</w:t>
+              <w:t xml:space="preserve">Trilha de auditoria incompleta (arts. 124 e 125)</w:t>
             </w:r>
           </w:p>
         </w:tc>
@@ -870,7 +944,7 @@
         </w:trPr>
         <w:tc>
           <w:tcPr>
-            <w:tcW w:w="5206" w:type="dxa"/>
+            <w:tcW w:w="5764" w:type="dxa"/>
           </w:tcPr>
           <w:p>
             <w:pPr>
@@ -887,13 +961,13 @@
                 <w:sz w:val="18"/>
                 <w:szCs w:val="20"/>
               </w:rPr>
-              <w:t xml:space="preserve">O Item não mostra o prazo de reanálise; o atendimento não ordena os lotes por validade; no inventário, a mesma pessoa conta e apura</w:t>
+              <w:t xml:space="preserve">Relatórios com números que não fecham (movimentação, mapa, inventário do mês, material reservado) e três com assinaturas de outra organização</w:t>
             </w:r>
           </w:p>
         </w:tc>
         <w:tc>
           <w:tcPr>
-            <w:tcW w:w="4425" w:type="dxa"/>
+            <w:tcW w:w="3867" w:type="dxa"/>
           </w:tcPr>
           <w:p>
             <w:pPr>
@@ -910,7 +984,7 @@
                 <w:sz w:val="18"/>
                 <w:szCs w:val="20"/>
               </w:rPr>
-              <w:t xml:space="preserve">Matéria-prima usada depois do reteste; lote de validade curta passado adiante; ajuste sem separação de funções (arts. 124 e 189)</w:t>
+              <w:t xml:space="preserve">O que a diretoria e o inspetor leem não se sustenta (arts. 124, 160 e 189)</w:t>
             </w:r>
           </w:p>
         </w:tc>
@@ -921,7 +995,7 @@
         </w:trPr>
         <w:tc>
           <w:tcPr>
-            <w:tcW w:w="5206" w:type="dxa"/>
+            <w:tcW w:w="5764" w:type="dxa"/>
           </w:tcPr>
           <w:p>
             <w:pPr>
@@ -938,13 +1012,13 @@
                 <w:sz w:val="18"/>
                 <w:szCs w:val="20"/>
               </w:rPr>
-              <w:t xml:space="preserve">O laudo só chega ao Estoque por um clique manual; o histórico do lote não mostra usuário, análise nem laudo</w:t>
+              <w:t xml:space="preserve">O Item novo perde a marca de substância controlada (Portaria 344); a Natureza da Operação grava o IPI com o valor de Venda</w:t>
             </w:r>
           </w:p>
         </w:tc>
         <w:tc>
           <w:tcPr>
-            <w:tcW w:w="4425" w:type="dxa"/>
+            <w:tcW w:w="3867" w:type="dxa"/>
           </w:tcPr>
           <w:p>
             <w:pPr>
@@ -961,7 +1035,58 @@
                 <w:sz w:val="18"/>
                 <w:szCs w:val="20"/>
               </w:rPr>
-              <w:t xml:space="preserve">Lote preso ou liberado sem rastro; trilha incompleta (art. 125)</w:t>
+              <w:t xml:space="preserve">Controlado fora dos relatórios especiais; imposto errado</w:t>
+            </w:r>
+          </w:p>
+        </w:tc>
+      </w:tr>
+      <w:tr>
+        <w:trPr>
+          <w:cantSplit/>
+        </w:trPr>
+        <w:tc>
+          <w:tcPr>
+            <w:tcW w:w="5764" w:type="dxa"/>
+          </w:tcPr>
+          <w:p>
+            <w:pPr>
+              <w:widowControl/>
+              <w:spacing w:after="0" w:line="276" w:lineRule="auto"/>
+              <w:jc w:val="left"/>
+              <w:rPr>
+                <w:sz w:val="18"/>
+                <w:szCs w:val="18"/>
+              </w:rPr>
+            </w:pPr>
+            <w:r>
+              <w:rPr>
+                <w:sz w:val="18"/>
+                <w:szCs w:val="20"/>
+              </w:rPr>
+              <w:t xml:space="preserve">Quem não tem permissão abre pelo endereço as 27 telas de cadastro e 14 telas operacionais, com o botão de gravar visível</w:t>
+            </w:r>
+          </w:p>
+        </w:tc>
+        <w:tc>
+          <w:tcPr>
+            <w:tcW w:w="3867" w:type="dxa"/>
+          </w:tcPr>
+          <w:p>
+            <w:pPr>
+              <w:widowControl/>
+              <w:spacing w:after="0" w:line="276" w:lineRule="auto"/>
+              <w:jc w:val="left"/>
+              <w:rPr>
+                <w:sz w:val="18"/>
+                <w:szCs w:val="18"/>
+              </w:rPr>
+            </w:pPr>
+            <w:r>
+              <w:rPr>
+                <w:sz w:val="18"/>
+                <w:szCs w:val="20"/>
+              </w:rPr>
+              <w:t xml:space="preserve">Uso do sistema sem permissão (Guia 33/2020)</w:t>
             </w:r>
           </w:p>
         </w:tc>
@@ -1004,7 +1129,7 @@
         <w:rPr>
           <w:szCs w:val="20"/>
         </w:rPr>
-        <w:t xml:space="preserve">Quem cadastra o recebimento não o autoriza; as entradas criam a quarentena e abrem a análise no CQ; reprovado e quarentena ficam fora do atendimento e da remessa; a movimentação recusa saldo insuficiente; o inventário rotativo ajusta o saldo.</w:t>
+        <w:t xml:space="preserve">Quem cadastra o recebimento não o autoriza; as entradas criam a quarentena e abrem a análise no CQ; reprovado e quarentena ficam fora do atendimento e da remessa; a movimentação recusa saldo insuficiente; o inventário ajusta o saldo.</w:t>
       </w:r>
     </w:p>
     <w:p>
@@ -1035,7 +1160,7 @@
           <w:b/>
           <w:color w:val="000000" w:themeColor="text1"/>
         </w:rPr>
-        <w:t xml:space="preserve">DEZ CORREÇÕES OBRIGATÓRIAS</w:t>
+        <w:t xml:space="preserve">QUINZE CORREÇÕES OBRIGATÓRIAS</w:t>
       </w:r>
     </w:p>
     <w:p>
@@ -1055,7 +1180,21 @@
         <w:rPr>
           <w:szCs w:val="20"/>
         </w:rPr>
-        <w:t xml:space="preserve">1. Gravar tudo ou nada: nenhuma tela mostra "sucesso" sem ter gravado; corrigir o Endereçamento. 2. Recebimento só de fornecedor qualificado, com decisão registrada da Garantia da Qualidade para a exceção. 3. Recusar validade anterior a hoje em toda entrada e atender pelo lote que vence primeiro. 4. Entrada de produto acabado só a partir de uma ordem de produção liberada. 5. Situação única do lote, aplicada em toda tela e mudada só pelo CQ, pela Pessoa Delegada ou pela Garantia da Qualidade. 6. Liberação do lote pela Pessoa Delegada, com assinatura eletrônica; o laudo muda a situação na hora e reprovar exige motivo. 7. Histórico completo do lote: usuário, hora, análise, laudo, aprovador e cada movimentação, ajuste e cancelamento. 8. Conferir a permissão em toda tela e toda gravação, no servidor, e dar tela à permissão de aprovar o lote padrão. 9. Remessa (inclusive a de kit) que finaliza em qualquer modo, baixa o saldo e informa a Rastreabilidade; Movimentação de Quarentena que exige endereço completo e grava saída e entrada juntas. 10. Amostras de retenção de ponta a ponta: consulta e saída encontram o que a entrada gravou, com prazo de guarda e trava de saída antes do vencimento.</w:t>
+        <w:t xml:space="preserve">(1) Gravar tudo ou nada: nenhuma tela mostra "sucesso" sem ter gravado; corrigir o Endereçamento. (2) Recebimento só de fornecedor qualificado, com decisão registrada da Qualidade para a exceção. (3) Recusar validade anterior a hoje em toda entrada e atender pelo lote que vence primeiro. (4) Entrada de produto acabado só com ordem de produção liberada. (5) Situação única do lote, mudada só pelo CQ, pela Pessoa Delegada ou pela Qualidade. (6) Liberação pela Pessoa Delegada, com assinatura eletrônica; reprovar exige motivo. (7) Histórico completo do lote. (8) Permissão conferida no servidor, em toda tela, e tela para aprovar o lote padrão. (9) Remessa (inclusive a de kit) que finaliza; quarentena com endereço completo. (10) Amostras de retenção com prazo de guarda e trava de saída. </w:t>
+      </w:r>
+      <w:r>
+        <w:rPr>
+          <w:b/>
+          <w:bCs/>
+          <w:szCs w:val="20"/>
+        </w:rPr>
+        <w:t xml:space="preserve">Das últimas rodadas:</w:t>
+      </w:r>
+      <w:r>
+        <w:rPr>
+          <w:szCs w:val="20"/>
+        </w:rPr>
+        <w:t xml:space="preserve"> (11) histórico de toda alteração e reversão, com valor antigo, novo e motivo; (12) cadastro em uso não se inativa nem se exclui, e o dado mestre grava certo; (13) relatórios que fecham com as telas e trazem a empresa certa; (14) inventário com separação de funções; (15) lote vencido não se aprova nem se movimenta sem decisão registrada da Qualidade.</w:t>
       </w:r>
     </w:p>
     <w:p>
@@ -1086,7 +1225,7 @@
           <w:b/>
           <w:color w:val="000000" w:themeColor="text1"/>
         </w:rPr>
-        <w:t xml:space="preserve">ENCERRAMENTO DO MÓDULO (23/10/2026)</w:t>
+        <w:t xml:space="preserve">FECHAMENTO DO MÓDULO (25/10/2026)</w:t>
       </w:r>
     </w:p>
     <w:p>
@@ -1114,73 +1253,7 @@
         <w:rPr>
           <w:szCs w:val="20"/>
         </w:rPr>
-        <w:t xml:space="preserve"> O critério de "apto" ainda não foi escrito com a Qualidade; o "não apto" vem só dos 21 defeitos de gravidade alta e de nenhum dos 14 temas da norma ser atendido por completo. </w:t>
-      </w:r>
-      <w:r>
-        <w:rPr>
-          <w:b/>
-          <w:bCs/>
-          <w:szCs w:val="20"/>
-        </w:rPr>
-        <w:t xml:space="preserve">149 de 162 casos</w:t>
-      </w:r>
-      <w:r>
-        <w:rPr>
-          <w:szCs w:val="20"/>
-        </w:rPr>
-        <w:t xml:space="preserve"> com resultado (44 de 46 de prioridade alta) e </w:t>
-      </w:r>
-      <w:r>
-        <w:rPr>
-          <w:b/>
-          <w:bCs/>
-          <w:szCs w:val="20"/>
-        </w:rPr>
-        <w:t xml:space="preserve">76 defeitos</w:t>
-      </w:r>
-      <w:r>
-        <w:rPr>
-          <w:szCs w:val="20"/>
-        </w:rPr>
-        <w:t xml:space="preserve">.</w:t>
-      </w:r>
-    </w:p>
-    <w:p>
-      <w:pPr>
-        <w:spacing w:after="0" w:line="252" w:lineRule="auto"/>
-        <w:rPr>
-          <w:szCs w:val="20"/>
-        </w:rPr>
-      </w:pPr>
-      <w:r>
-        <w:rPr>
-          <w:b/>
-          <w:bCs/>
-          <w:szCs w:val="20"/>
-        </w:rPr>
-        <w:t xml:space="preserve">Sem teste (13 casos):</w:t>
-      </w:r>
-      <w:r>
-        <w:rPr>
-          <w:szCs w:val="20"/>
-        </w:rPr>
-        <w:t xml:space="preserve"> CT-EST-058 e 091 (prioridade alta) e 055, 077, 082, 090, 100, 164, 172 e 192 (bloqueados); 117 e 118 (não se aplicam à tela); 023 (acesso pelo endereço, fora do escopo).</w:t>
-      </w:r>
-    </w:p>
-    <w:p>
-      <w:pPr>
-        <w:spacing w:after="0" w:line="252" w:lineRule="auto"/>
-        <w:rPr>
-          <w:szCs w:val="20"/>
-        </w:rPr>
-      </w:pPr>
-      <w:r>
-        <w:rPr>
-          <w:b/>
-          <w:bCs/>
-          <w:szCs w:val="20"/>
-        </w:rPr>
-        <w:t xml:space="preserve">Lista de reabertura</w:t>
+        <w:t xml:space="preserve"> O critério de "apto" ainda não foi escrito com a Qualidade; o "não apto" vem só dos 55 defeitos de gravidade alta abertos e de nenhum dos 14 temas da norma ser atendido por completo.</w:t>
       </w:r>
     </w:p>
     <w:tbl>
@@ -1191,9 +1264,9 @@
         <w:tblLook w:val="04A0" w:firstRow="1" w:lastRow="0" w:firstColumn="1" w:lastColumn="0" w:noHBand="0" w:noVBand="1"/>
       </w:tblPr>
       <w:tblGrid>
-        <w:gridCol w:w="2106"/>
-        <w:gridCol w:w="4801"/>
-        <w:gridCol w:w="2724"/>
+        <w:gridCol w:w="2095"/>
+        <w:gridCol w:w="4656"/>
+        <w:gridCol w:w="2880"/>
       </w:tblGrid>
       <w:tr>
         <w:trPr>
@@ -1202,7 +1275,7 @@
         </w:trPr>
         <w:tc>
           <w:tcPr>
-            <w:tcW w:w="2106" w:type="dxa"/>
+            <w:tcW w:w="2095" w:type="dxa"/>
             <w:shd w:val="clear" w:color="auto" w:fill="D9D9D9" w:themeFill="background1" w:themeFillShade="D9"/>
           </w:tcPr>
           <w:p>
@@ -1230,7 +1303,7 @@
         </w:tc>
         <w:tc>
           <w:tcPr>
-            <w:tcW w:w="4801" w:type="dxa"/>
+            <w:tcW w:w="4656" w:type="dxa"/>
             <w:shd w:val="clear" w:color="auto" w:fill="D9D9D9" w:themeFill="background1" w:themeFillShade="D9"/>
           </w:tcPr>
           <w:p>
@@ -1258,7 +1331,7 @@
         </w:tc>
         <w:tc>
           <w:tcPr>
-            <w:tcW w:w="2724" w:type="dxa"/>
+            <w:tcW w:w="2880" w:type="dxa"/>
             <w:shd w:val="clear" w:color="auto" w:fill="D9D9D9" w:themeFill="background1" w:themeFillShade="D9"/>
           </w:tcPr>
           <w:p>
@@ -1291,7 +1364,7 @@
         </w:trPr>
         <w:tc>
           <w:tcPr>
-            <w:tcW w:w="2106" w:type="dxa"/>
+            <w:tcW w:w="2095" w:type="dxa"/>
           </w:tcPr>
           <w:p>
             <w:pPr>
@@ -1314,7 +1387,7 @@
         </w:tc>
         <w:tc>
           <w:tcPr>
-            <w:tcW w:w="4801" w:type="dxa"/>
+            <w:tcW w:w="4656" w:type="dxa"/>
           </w:tcPr>
           <w:p>
             <w:pPr>
@@ -1337,7 +1410,7 @@
         </w:tc>
         <w:tc>
           <w:tcPr>
-            <w:tcW w:w="2724" w:type="dxa"/>
+            <w:tcW w:w="2880" w:type="dxa"/>
           </w:tcPr>
           <w:p>
             <w:pPr>
@@ -1354,7 +1427,7 @@
                 <w:sz w:val="18"/>
                 <w:szCs w:val="20"/>
               </w:rPr>
-              <w:t xml:space="preserve">Endereçamento do recebimento; saída da amostra desse lote</w:t>
+              <w:t xml:space="preserve">Endereçamento do recebimento; saída da amostra</w:t>
             </w:r>
           </w:p>
         </w:tc>
@@ -1365,7 +1438,7 @@
         </w:trPr>
         <w:tc>
           <w:tcPr>
-            <w:tcW w:w="2106" w:type="dxa"/>
+            <w:tcW w:w="2095" w:type="dxa"/>
           </w:tcPr>
           <w:p>
             <w:pPr>
@@ -1388,7 +1461,7 @@
         </w:tc>
         <w:tc>
           <w:tcPr>
-            <w:tcW w:w="4801" w:type="dxa"/>
+            <w:tcW w:w="4656" w:type="dxa"/>
           </w:tcPr>
           <w:p>
             <w:pPr>
@@ -1405,13 +1478,13 @@
                 <w:sz w:val="18"/>
                 <w:szCs w:val="20"/>
               </w:rPr>
-              <w:t xml:space="preserve">Ligar uma função profissional à configuração 19 (e 28 e 29) para aprovar o Lote Padrão (DV-EST-076)</w:t>
+              <w:t xml:space="preserve">Ligar uma função à configuração 19 (e 28 e 29) para aprovar o Lote Padrão (DV-EST-076)</w:t>
             </w:r>
           </w:p>
         </w:tc>
         <w:tc>
           <w:tcPr>
-            <w:tcW w:w="2724" w:type="dxa"/>
+            <w:tcW w:w="2880" w:type="dxa"/>
           </w:tcPr>
           <w:p>
             <w:pPr>
@@ -1439,7 +1512,7 @@
         </w:trPr>
         <w:tc>
           <w:tcPr>
-            <w:tcW w:w="2106" w:type="dxa"/>
+            <w:tcW w:w="2095" w:type="dxa"/>
           </w:tcPr>
           <w:p>
             <w:pPr>
@@ -1462,7 +1535,7 @@
         </w:tc>
         <w:tc>
           <w:tcPr>
-            <w:tcW w:w="4801" w:type="dxa"/>
+            <w:tcW w:w="4656" w:type="dxa"/>
           </w:tcPr>
           <w:p>
             <w:pPr>
@@ -1479,13 +1552,13 @@
                 <w:sz w:val="18"/>
                 <w:szCs w:val="20"/>
               </w:rPr>
-              <w:t xml:space="preserve">DV-EST-043 (reanálise no Item), 005 (perfil novo não abre o Estoque), 067 (Central de Pesagem), 077 (Pedido de Compra sem funções), 074 e 075 (Regra de Estabilidade)</w:t>
+              <w:t xml:space="preserve">Os 150 defeitos abertos, em especial os 55 de gravidade alta; antes, DV-EST-043, 005, 067, 077, 074 e 075</w:t>
             </w:r>
           </w:p>
         </w:tc>
         <w:tc>
           <w:tcPr>
-            <w:tcW w:w="2724" w:type="dxa"/>
+            <w:tcW w:w="2880" w:type="dxa"/>
           </w:tcPr>
           <w:p>
             <w:pPr>
@@ -1507,80 +1580,6 @@
           </w:p>
         </w:tc>
       </w:tr>
-      <w:tr>
-        <w:trPr>
-          <w:cantSplit/>
-        </w:trPr>
-        <w:tc>
-          <w:tcPr>
-            <w:tcW w:w="2106" w:type="dxa"/>
-          </w:tcPr>
-          <w:p>
-            <w:pPr>
-              <w:widowControl/>
-              <w:spacing w:after="0" w:line="276" w:lineRule="auto"/>
-              <w:jc w:val="left"/>
-              <w:rPr>
-                <w:sz w:val="18"/>
-                <w:szCs w:val="18"/>
-              </w:rPr>
-            </w:pPr>
-            <w:r>
-              <w:rPr>
-                <w:sz w:val="18"/>
-                <w:szCs w:val="20"/>
-              </w:rPr>
-              <w:t xml:space="preserve">Responsável</w:t>
-            </w:r>
-          </w:p>
-        </w:tc>
-        <w:tc>
-          <w:tcPr>
-            <w:tcW w:w="4801" w:type="dxa"/>
-          </w:tcPr>
-          <w:p>
-            <w:pPr>
-              <w:widowControl/>
-              <w:spacing w:after="0" w:line="276" w:lineRule="auto"/>
-              <w:jc w:val="left"/>
-              <w:rPr>
-                <w:sz w:val="18"/>
-                <w:szCs w:val="18"/>
-              </w:rPr>
-            </w:pPr>
-            <w:r>
-              <w:rPr>
-                <w:sz w:val="18"/>
-                <w:szCs w:val="20"/>
-              </w:rPr>
-              <w:t xml:space="preserve">Decidir se o CT-EST-023 volta ao escopo</w:t>
-            </w:r>
-          </w:p>
-        </w:tc>
-        <w:tc>
-          <w:tcPr>
-            <w:tcW w:w="2724" w:type="dxa"/>
-          </w:tcPr>
-          <w:p>
-            <w:pPr>
-              <w:widowControl/>
-              <w:spacing w:after="0" w:line="276" w:lineRule="auto"/>
-              <w:jc w:val="left"/>
-              <w:rPr>
-                <w:sz w:val="18"/>
-                <w:szCs w:val="18"/>
-              </w:rPr>
-            </w:pPr>
-            <w:r>
-              <w:rPr>
-                <w:sz w:val="18"/>
-                <w:szCs w:val="20"/>
-              </w:rPr>
-              <w:t xml:space="preserve">CT-EST-023</w:t>
-            </w:r>
-          </w:p>
-        </w:tc>
-      </w:tr>
     </w:tbl>
     <w:p>
       <w:pPr>
@@ -1594,6 +1593,20 @@
           <w:szCs w:val="20"/>
         </w:rPr>
       </w:pPr>
+      <w:r>
+        <w:rPr>
+          <w:b/>
+          <w:bCs/>
+          <w:szCs w:val="20"/>
+        </w:rPr>
+        <w:t xml:space="preserve">Decisão do responsável pelo projeto:</w:t>
+      </w:r>
+      <w:r>
+        <w:rPr>
+          <w:szCs w:val="20"/>
+        </w:rPr>
+        <w:t xml:space="preserve"> se o CT-EST-023 (acesso pelo endereço) volta ao escopo. </w:t>
+      </w:r>
       <w:r>
         <w:rPr>
           <w:b/>
@@ -1606,7 +1619,7 @@
         <w:rPr>
           <w:szCs w:val="20"/>
         </w:rPr>
-        <w:t xml:space="preserve"> (1) aprovar as dez correções como condição para o sistema entrar em uso; (2) definir quem é a Pessoa Delegada e se a liberação do lote é a aprovação do laudo ou uma etapa a mais; (3) decidir com a Garantia da Qualidade o que é fornecedor aprovado, se a sobra devolvida precisa de nova análise e o prazo das amostras de retenção.</w:t>
+        <w:t xml:space="preserve"> (1) aprovar as quinze correções como condição para o sistema entrar em uso; (2) definir quem é a Pessoa Delegada e se a liberação do lote é a aprovação do laudo ou uma etapa a mais; (3) decidir com a Qualidade o que é fornecedor aprovado, se a sobra devolvida precisa de nova análise e o prazo das amostras de retenção.</w:t>
       </w:r>
     </w:p>
     <w:sectPr>

</xml_diff>

<commit_message>
Portal: Principal, Estoque e GQ fechados (rodadas 3, 12A-C, 2-3 e Treinamento), 32 telas do Principal, logins de teste visíveis, vídeo da apresentação na página inicial
Co-Authored-By: Claude Fable 5.1 <noreply@anthropic.com>
Claude-Session: https://claude.ai/code/session_016ZyaVQ3Fat8knNf78iQG9U
</commit_message>
<xml_diff>
--- a/documentacao/arquivos/estoque/LabMedSys - Modulo Estoque - Resumo Executivo.docx
+++ b/documentacao/arquivos/estoque/LabMedSys - Modulo Estoque - Resumo Executivo.docx
@@ -28,7 +28,7 @@
           <w:color w:val="595959"/>
           <w:szCs w:val="20"/>
         </w:rPr>
-        <w:t xml:space="preserve">LabMedSys · Módulo Estoque · 25/10/2026 · André Nardacci · documento versão 1.6</w:t>
+        <w:t xml:space="preserve">LabMedSys · Módulo Estoque · 26/10/2026 · André Nardacci · documento versão 1.7</w:t>
       </w:r>
     </w:p>
     <w:p>
@@ -50,7 +50,7 @@
         <w:rPr>
           <w:szCs w:val="20"/>
         </w:rPr>
-        <w:t xml:space="preserve"> Resumo para a diretoria, atualizado em 25/10/2026 (catorze rodadas de testes, 07 a 24/10). O detalhe está no Relatório de Testes, na Conformidade Regulatória e nos Defeitos para Correção.</w:t>
+        <w:t xml:space="preserve"> Resumo para a diretoria, atualizado em 26/10/2026 (catorze rodadas de testes, 07 a 24/10). O detalhe está no Relatório de Testes, na Conformidade Regulatória e nos Defeitos para Correção.</w:t>
       </w:r>
     </w:p>
     <w:p>
@@ -213,8 +213,8 @@
         <w:tblLook w:val="04A0" w:firstRow="1" w:lastRow="0" w:firstColumn="1" w:lastColumn="0" w:noHBand="0" w:noVBand="1"/>
       </w:tblPr>
       <w:tblGrid>
-        <w:gridCol w:w="2402"/>
-        <w:gridCol w:w="7229"/>
+        <w:gridCol w:w="2385"/>
+        <w:gridCol w:w="7246"/>
       </w:tblGrid>
       <w:tr>
         <w:trPr>
@@ -223,7 +223,7 @@
         </w:trPr>
         <w:tc>
           <w:tcPr>
-            <w:tcW w:w="2402" w:type="dxa"/>
+            <w:tcW w:w="2385" w:type="dxa"/>
             <w:shd w:val="clear" w:color="auto" w:fill="D9D9D9" w:themeFill="background1" w:themeFillShade="D9"/>
           </w:tcPr>
           <w:p>
@@ -251,7 +251,7 @@
         </w:tc>
         <w:tc>
           <w:tcPr>
-            <w:tcW w:w="7229" w:type="dxa"/>
+            <w:tcW w:w="7246" w:type="dxa"/>
             <w:shd w:val="clear" w:color="auto" w:fill="D9D9D9" w:themeFill="background1" w:themeFillShade="D9"/>
           </w:tcPr>
           <w:p>
@@ -284,7 +284,7 @@
         </w:trPr>
         <w:tc>
           <w:tcPr>
-            <w:tcW w:w="2402" w:type="dxa"/>
+            <w:tcW w:w="2385" w:type="dxa"/>
           </w:tcPr>
           <w:p>
             <w:pPr>
@@ -307,7 +307,7 @@
         </w:tc>
         <w:tc>
           <w:tcPr>
-            <w:tcW w:w="7229" w:type="dxa"/>
+            <w:tcW w:w="7246" w:type="dxa"/>
           </w:tcPr>
           <w:p>
             <w:pPr>
@@ -324,7 +324,7 @@
                 <w:sz w:val="18"/>
                 <w:szCs w:val="20"/>
               </w:rPr>
-              <w:t xml:space="preserve">Dez fluxos, 99 telas documentadas uma a uma, 1.291 regras de negócio, modelo de dados, 24 riscos, 16 achados de segurança e o modelo ideal</w:t>
+              <w:t xml:space="preserve">Dez fluxos, 99 telas documentadas uma a uma, 1.291 regras de negócio, modelo de dados, 24 riscos, 18 achados de segurança e o modelo ideal</w:t>
             </w:r>
           </w:p>
         </w:tc>
@@ -335,7 +335,7 @@
         </w:trPr>
         <w:tc>
           <w:tcPr>
-            <w:tcW w:w="2402" w:type="dxa"/>
+            <w:tcW w:w="2385" w:type="dxa"/>
           </w:tcPr>
           <w:p>
             <w:pPr>
@@ -358,7 +358,7 @@
         </w:tc>
         <w:tc>
           <w:tcPr>
-            <w:tcW w:w="7229" w:type="dxa"/>
+            <w:tcW w:w="7246" w:type="dxa"/>
           </w:tcPr>
           <w:p>
             <w:pPr>
@@ -411,7 +411,7 @@
         </w:trPr>
         <w:tc>
           <w:tcPr>
-            <w:tcW w:w="2402" w:type="dxa"/>
+            <w:tcW w:w="2385" w:type="dxa"/>
           </w:tcPr>
           <w:p>
             <w:pPr>
@@ -434,7 +434,7 @@
         </w:tc>
         <w:tc>
           <w:tcPr>
-            <w:tcW w:w="7229" w:type="dxa"/>
+            <w:tcW w:w="7246" w:type="dxa"/>
           </w:tcPr>
           <w:p>
             <w:pPr>
@@ -453,14 +453,14 @@
                 <w:bCs/>
                 <w:szCs w:val="20"/>
               </w:rPr>
-              <w:t xml:space="preserve">150, todos abertos</w:t>
+              <w:t xml:space="preserve">150 registrados, 149 abertos</w:t>
             </w:r>
             <w:r>
               <w:rPr>
                 <w:sz w:val="18"/>
                 <w:szCs w:val="20"/>
               </w:rPr>
-              <w:t xml:space="preserve">: 55 de gravidade alta, 75 média e 20 baixa; 14 de acesso e segurança. As 3 últimas rodadas acrescentaram 74</w:t>
+              <w:t xml:space="preserve">: 55 de gravidade alta, 74 média e 20 baixa; 14 de acesso e segurança. As 3 últimas rodadas acrescentaram 74</w:t>
             </w:r>
           </w:p>
         </w:tc>
@@ -471,7 +471,7 @@
         </w:trPr>
         <w:tc>
           <w:tcPr>
-            <w:tcW w:w="2402" w:type="dxa"/>
+            <w:tcW w:w="2385" w:type="dxa"/>
           </w:tcPr>
           <w:p>
             <w:pPr>
@@ -494,7 +494,7 @@
         </w:tc>
         <w:tc>
           <w:tcPr>
-            <w:tcW w:w="7229" w:type="dxa"/>
+            <w:tcW w:w="7246" w:type="dxa"/>
           </w:tcPr>
           <w:p>
             <w:pPr>
@@ -511,7 +511,7 @@
                 <w:sz w:val="18"/>
                 <w:szCs w:val="20"/>
               </w:rPr>
-              <w:t xml:space="preserve">4 funcionam; 33 com falhas; 53 com falha grave; 3 bloqueadas no teste; 6 não testadas</w:t>
+              <w:t xml:space="preserve">3 funcionam; 33 com falhas; 54 com falha grave; 3 bloqueadas no teste; 6 não testadas</w:t>
             </w:r>
           </w:p>
         </w:tc>
@@ -1552,7 +1552,7 @@
                 <w:sz w:val="18"/>
                 <w:szCs w:val="20"/>
               </w:rPr>
-              <w:t xml:space="preserve">Os 150 defeitos abertos, em especial os 55 de gravidade alta; antes, DV-EST-043, 005, 067, 077, 074 e 075</w:t>
+              <w:t xml:space="preserve">Os 149 defeitos abertos, em especial os 55 de gravidade alta; antes, DV-EST-043, 005, 067, 077, 074 e 075</w:t>
             </w:r>
           </w:p>
         </w:tc>

</xml_diff>

<commit_message>
Portal: Controle da Qualidade fechado (22 telas com 5 abas, 5 roteiros, 12 documentos, 45 defeitos), quatro módulos fechados, Estoque v1.7 e GQ v1.2
Co-Authored-By: Claude Sonnet 5.5 <noreply@anthropic.com>
Claude-Session: https://claude.ai/code/session_016ZyaVQ3Fat8knNf78iQG9U
</commit_message>
<xml_diff>
--- a/documentacao/arquivos/estoque/LabMedSys - Modulo Estoque - Resumo Executivo.docx
+++ b/documentacao/arquivos/estoque/LabMedSys - Modulo Estoque - Resumo Executivo.docx
@@ -460,7 +460,7 @@
                 <w:sz w:val="18"/>
                 <w:szCs w:val="20"/>
               </w:rPr>
-              <w:t xml:space="preserve">: 55 de gravidade alta, 74 média e 20 baixa; 14 de acesso e segurança. As 3 últimas rodadas acrescentaram 74</w:t>
+              <w:t xml:space="preserve">: 56 de gravidade alta, 73 média e 20 baixa; 14 de acesso e segurança. As 3 últimas rodadas acrescentaram 74</w:t>
             </w:r>
           </w:p>
         </w:tc>
@@ -1253,7 +1253,7 @@
         <w:rPr>
           <w:szCs w:val="20"/>
         </w:rPr>
-        <w:t xml:space="preserve"> O critério de "apto" ainda não foi escrito com a Qualidade; o "não apto" vem só dos 55 defeitos de gravidade alta abertos e de nenhum dos 14 temas da norma ser atendido por completo.</w:t>
+        <w:t xml:space="preserve"> O critério de "apto" ainda não foi escrito com a Qualidade; o "não apto" vem só dos 56 defeitos de gravidade alta abertos e de nenhum dos 14 temas da norma ser atendido por completo.</w:t>
       </w:r>
     </w:p>
     <w:tbl>
@@ -1264,9 +1264,9 @@
         <w:tblLook w:val="04A0" w:firstRow="1" w:lastRow="0" w:firstColumn="1" w:lastColumn="0" w:noHBand="0" w:noVBand="1"/>
       </w:tblPr>
       <w:tblGrid>
-        <w:gridCol w:w="2095"/>
-        <w:gridCol w:w="4656"/>
-        <w:gridCol w:w="2880"/>
+        <w:gridCol w:w="2093"/>
+        <w:gridCol w:w="4671"/>
+        <w:gridCol w:w="2867"/>
       </w:tblGrid>
       <w:tr>
         <w:trPr>
@@ -1275,7 +1275,7 @@
         </w:trPr>
         <w:tc>
           <w:tcPr>
-            <w:tcW w:w="2095" w:type="dxa"/>
+            <w:tcW w:w="2093" w:type="dxa"/>
             <w:shd w:val="clear" w:color="auto" w:fill="D9D9D9" w:themeFill="background1" w:themeFillShade="D9"/>
           </w:tcPr>
           <w:p>
@@ -1303,7 +1303,7 @@
         </w:tc>
         <w:tc>
           <w:tcPr>
-            <w:tcW w:w="4656" w:type="dxa"/>
+            <w:tcW w:w="4671" w:type="dxa"/>
             <w:shd w:val="clear" w:color="auto" w:fill="D9D9D9" w:themeFill="background1" w:themeFillShade="D9"/>
           </w:tcPr>
           <w:p>
@@ -1331,7 +1331,7 @@
         </w:tc>
         <w:tc>
           <w:tcPr>
-            <w:tcW w:w="2880" w:type="dxa"/>
+            <w:tcW w:w="2867" w:type="dxa"/>
             <w:shd w:val="clear" w:color="auto" w:fill="D9D9D9" w:themeFill="background1" w:themeFillShade="D9"/>
           </w:tcPr>
           <w:p>
@@ -1364,7 +1364,7 @@
         </w:trPr>
         <w:tc>
           <w:tcPr>
-            <w:tcW w:w="2095" w:type="dxa"/>
+            <w:tcW w:w="2093" w:type="dxa"/>
           </w:tcPr>
           <w:p>
             <w:pPr>
@@ -1387,7 +1387,7 @@
         </w:tc>
         <w:tc>
           <w:tcPr>
-            <w:tcW w:w="4656" w:type="dxa"/>
+            <w:tcW w:w="4671" w:type="dxa"/>
           </w:tcPr>
           <w:p>
             <w:pPr>
@@ -1410,7 +1410,7 @@
         </w:tc>
         <w:tc>
           <w:tcPr>
-            <w:tcW w:w="2880" w:type="dxa"/>
+            <w:tcW w:w="2867" w:type="dxa"/>
           </w:tcPr>
           <w:p>
             <w:pPr>
@@ -1438,7 +1438,7 @@
         </w:trPr>
         <w:tc>
           <w:tcPr>
-            <w:tcW w:w="2095" w:type="dxa"/>
+            <w:tcW w:w="2093" w:type="dxa"/>
           </w:tcPr>
           <w:p>
             <w:pPr>
@@ -1461,7 +1461,7 @@
         </w:tc>
         <w:tc>
           <w:tcPr>
-            <w:tcW w:w="4656" w:type="dxa"/>
+            <w:tcW w:w="4671" w:type="dxa"/>
           </w:tcPr>
           <w:p>
             <w:pPr>
@@ -1484,7 +1484,7 @@
         </w:tc>
         <w:tc>
           <w:tcPr>
-            <w:tcW w:w="2880" w:type="dxa"/>
+            <w:tcW w:w="2867" w:type="dxa"/>
           </w:tcPr>
           <w:p>
             <w:pPr>
@@ -1512,7 +1512,7 @@
         </w:trPr>
         <w:tc>
           <w:tcPr>
-            <w:tcW w:w="2095" w:type="dxa"/>
+            <w:tcW w:w="2093" w:type="dxa"/>
           </w:tcPr>
           <w:p>
             <w:pPr>
@@ -1535,7 +1535,7 @@
         </w:tc>
         <w:tc>
           <w:tcPr>
-            <w:tcW w:w="4656" w:type="dxa"/>
+            <w:tcW w:w="4671" w:type="dxa"/>
           </w:tcPr>
           <w:p>
             <w:pPr>
@@ -1552,13 +1552,13 @@
                 <w:sz w:val="18"/>
                 <w:szCs w:val="20"/>
               </w:rPr>
-              <w:t xml:space="preserve">Os 149 defeitos abertos, em especial os 55 de gravidade alta; antes, DV-EST-043, 005, 067, 077, 074 e 075</w:t>
+              <w:t xml:space="preserve">Os 149 defeitos abertos, em especial os 56 de gravidade alta; antes, DV-EST-171, 043, 005, 067, 077, 074 e 075</w:t>
             </w:r>
           </w:p>
         </w:tc>
         <w:tc>
           <w:tcPr>
-            <w:tcW w:w="2880" w:type="dxa"/>
+            <w:tcW w:w="2867" w:type="dxa"/>
           </w:tcPr>
           <w:p>
             <w:pPr>

</xml_diff>